<commit_message>
nmv 12 10 2026
</commit_message>
<xml_diff>
--- a/Ghana Sandhi/GS-TS 7.1-7.5 Sanskrit.docx
+++ b/Ghana Sandhi/GS-TS 7.1-7.5 Sanskrit.docx
@@ -1,6 +1,6 @@
 
 <file path=word/document.xml><?xml version="1.0" encoding="utf-8"?>
-<w:document xmlns:wpc="http://schemas.microsoft.com/office/word/2010/wordprocessingCanvas" xmlns:cx="http://schemas.microsoft.com/office/drawing/2014/chartex" xmlns:cx1="http://schemas.microsoft.com/office/drawing/2015/9/8/chartex" xmlns:cx2="http://schemas.microsoft.com/office/drawing/2015/10/21/chartex" xmlns:cx3="http://schemas.microsoft.com/office/drawing/2016/5/9/chartex" xmlns:cx4="http://schemas.microsoft.com/office/drawing/2016/5/10/chartex" xmlns:cx5="http://schemas.microsoft.com/office/drawing/2016/5/11/chartex" xmlns:cx6="http://schemas.microsoft.com/office/drawing/2016/5/12/chartex" xmlns:cx7="http://schemas.microsoft.com/office/drawing/2016/5/13/chartex" xmlns:cx8="http://schemas.microsoft.com/office/drawing/2016/5/14/chartex" xmlns:mc="http://schemas.openxmlformats.org/markup-compatibility/2006" xmlns:aink="http://schemas.microsoft.com/office/drawing/2016/ink" xmlns:am3d="http://schemas.microsoft.com/office/drawing/2017/model3d" xmlns:o="urn:schemas-microsoft-com:office:office" xmlns:oel="http://schemas.microsoft.com/office/2019/extlst" xmlns:r="http://schemas.openxmlformats.org/officeDocument/2006/relationships" xmlns:m="http://schemas.openxmlformats.org/officeDocument/2006/math" xmlns:v="urn:schemas-microsoft-com:vml" xmlns:wp14="http://schemas.microsoft.com/office/word/2010/wordprocessingDrawing" xmlns:wp="http://schemas.openxmlformats.org/drawingml/2006/wordprocessingDrawing" xmlns:w10="urn:schemas-microsoft-com:office:word" xmlns:w="http://schemas.openxmlformats.org/wordprocessingml/2006/main" xmlns:w14="http://schemas.microsoft.com/office/word/2010/wordml" xmlns:w15="http://schemas.microsoft.com/office/word/2012/wordml" xmlns:w16cei="http://schemas.microsoft.com/office/word/2026/wordml/cei" xmlns:w16cex="http://schemas.microsoft.com/office/word/2018/wordml/cex" xmlns:w16cid="http://schemas.microsoft.com/office/word/2016/wordml/cid" xmlns:w16="http://schemas.microsoft.com/office/word/2018/wordml" xmlns:w16du="http://schemas.microsoft.com/office/word/2023/wordml/word16du" xmlns:w16sdtdh="http://schemas.microsoft.com/office/word/2020/wordml/sdtdatahash" xmlns:w16sdtfl="http://schemas.microsoft.com/office/word/2024/wordml/sdtformatlock" xmlns:w16se="http://schemas.microsoft.com/office/word/2015/wordml/symex" xmlns:wpg="http://schemas.microsoft.com/office/word/2010/wordprocessingGroup" xmlns:wpi="http://schemas.microsoft.com/office/word/2010/wordprocessingInk" xmlns:wne="http://schemas.microsoft.com/office/word/2006/wordml" xmlns:wps="http://schemas.microsoft.com/office/word/2010/wordprocessingShape" mc:Ignorable="w14 w15 w16se w16cid w16 w16cex w16sdtdh w16sdtfl w16du wp14">
+<w:document xmlns:wpc="http://schemas.microsoft.com/office/word/2010/wordprocessingCanvas" xmlns:cx="http://schemas.microsoft.com/office/drawing/2014/chartex" xmlns:cx1="http://schemas.microsoft.com/office/drawing/2015/9/8/chartex" xmlns:cx2="http://schemas.microsoft.com/office/drawing/2015/10/21/chartex" xmlns:cx3="http://schemas.microsoft.com/office/drawing/2016/5/9/chartex" xmlns:cx4="http://schemas.microsoft.com/office/drawing/2016/5/10/chartex" xmlns:cx5="http://schemas.microsoft.com/office/drawing/2016/5/11/chartex" xmlns:cx6="http://schemas.microsoft.com/office/drawing/2016/5/12/chartex" xmlns:cx7="http://schemas.microsoft.com/office/drawing/2016/5/13/chartex" xmlns:cx8="http://schemas.microsoft.com/office/drawing/2016/5/14/chartex" xmlns:mc="http://schemas.openxmlformats.org/markup-compatibility/2006" xmlns:aink="http://schemas.microsoft.com/office/drawing/2016/ink" xmlns:am3d="http://schemas.microsoft.com/office/drawing/2017/model3d" xmlns:o="urn:schemas-microsoft-com:office:office" xmlns:oel="http://schemas.microsoft.com/office/2019/extlst" xmlns:r="http://schemas.openxmlformats.org/officeDocument/2006/relationships" xmlns:m="http://schemas.openxmlformats.org/officeDocument/2006/math" xmlns:v="urn:schemas-microsoft-com:vml" xmlns:wp14="http://schemas.microsoft.com/office/word/2010/wordprocessingDrawing" xmlns:wp="http://schemas.openxmlformats.org/drawingml/2006/wordprocessingDrawing" xmlns:w10="urn:schemas-microsoft-com:office:word" xmlns:w="http://schemas.openxmlformats.org/wordprocessingml/2006/main" xmlns:w14="http://schemas.microsoft.com/office/word/2010/wordml" xmlns:w15="http://schemas.microsoft.com/office/word/2012/wordml" xmlns:w16cex="http://schemas.microsoft.com/office/word/2018/wordml/cex" xmlns:w16cid="http://schemas.microsoft.com/office/word/2016/wordml/cid" xmlns:w16="http://schemas.microsoft.com/office/word/2018/wordml" xmlns:w16du="http://schemas.microsoft.com/office/word/2023/wordml/word16du" xmlns:w16sdtdh="http://schemas.microsoft.com/office/word/2020/wordml/sdtdatahash" xmlns:w16sdtfl="http://schemas.microsoft.com/office/word/2024/wordml/sdtformatlock" xmlns:w16se="http://schemas.microsoft.com/office/word/2015/wordml/symex" xmlns:wpg="http://schemas.microsoft.com/office/word/2010/wordprocessingGroup" xmlns:wpi="http://schemas.microsoft.com/office/word/2010/wordprocessingInk" xmlns:wne="http://schemas.microsoft.com/office/word/2006/wordml" xmlns:wps="http://schemas.microsoft.com/office/word/2010/wordprocessingShape" mc:Ignorable="w14 w15 w16se w16cid w16 w16cex w16sdtdh w16sdtfl w16du wp14">
   <w:body>
     <w:p>
       <w:pPr>
@@ -1799,25 +1799,7 @@
           <w:sz w:val="28"/>
           <w:szCs w:val="28"/>
         </w:rPr>
-        <w:t xml:space="preserve">We have tried to give sample of Padams, Padams in a Gana vAkyam (Gana purva padam in format of 1,2 / 2,1 / 1,2,3 / 3,2,1 / </w:t>
-      </w:r>
-      <w:proofErr w:type="gramStart"/>
-      <w:r>
-        <w:rPr>
-          <w:rFonts w:ascii="Arial" w:hAnsi="Arial" w:cs="Arial"/>
-          <w:sz w:val="28"/>
-          <w:szCs w:val="28"/>
-        </w:rPr>
-        <w:t>1.2.3 )</w:t>
-      </w:r>
-      <w:proofErr w:type="gramEnd"/>
-      <w:r>
-        <w:rPr>
-          <w:rFonts w:ascii="Arial" w:hAnsi="Arial" w:cs="Arial"/>
-          <w:sz w:val="28"/>
-          <w:szCs w:val="28"/>
-        </w:rPr>
-        <w:t xml:space="preserve"> and Gana vAkyam on a sample basis only.</w:t>
+        <w:t>We have tried to give sample of Padams, Padams in a Gana vAkyam (Gana purva padam in format of 1,2 / 2,1 / 1,2,3 / 3,2,1 / 1.2.3 ) and Gana vAkyam on a sample basis only.</w:t>
       </w:r>
     </w:p>
     <w:p>
@@ -2011,18 +1993,8 @@
           <w:sz w:val="28"/>
           <w:szCs w:val="28"/>
         </w:rPr>
-        <w:t xml:space="preserve">PS </w:t>
-      </w:r>
-      <w:proofErr w:type="gramStart"/>
-      <w:r>
-        <w:rPr>
-          <w:rFonts w:ascii="Arial" w:hAnsi="Arial" w:cs="Arial"/>
-          <w:sz w:val="28"/>
-          <w:szCs w:val="28"/>
-        </w:rPr>
-        <w:t>-  prAtiSAkyam</w:t>
-      </w:r>
-      <w:proofErr w:type="gramEnd"/>
+        <w:t>PS -  prAtiSAkyam</w:t>
+      </w:r>
     </w:p>
     <w:p>
       <w:pPr>
@@ -2335,25 +2307,7 @@
           <w:sz w:val="28"/>
           <w:szCs w:val="28"/>
         </w:rPr>
-        <w:t xml:space="preserve">The source book has given an earlier panchaati sometimes in the later </w:t>
-      </w:r>
-      <w:proofErr w:type="gramStart"/>
-      <w:r>
-        <w:rPr>
-          <w:rFonts w:ascii="Arial" w:hAnsi="Arial" w:cs="Arial"/>
-          <w:sz w:val="28"/>
-          <w:szCs w:val="28"/>
-        </w:rPr>
-        <w:t>chapter .</w:t>
-      </w:r>
-      <w:proofErr w:type="gramEnd"/>
-      <w:r>
-        <w:rPr>
-          <w:rFonts w:ascii="Arial" w:hAnsi="Arial" w:cs="Arial"/>
-          <w:sz w:val="28"/>
-          <w:szCs w:val="28"/>
-        </w:rPr>
-        <w:t xml:space="preserve"> For example, a vakyam of TS 1.5.6.3 may be serial numbered by us as 23 based on the order in the Book, </w:t>
+        <w:t xml:space="preserve">The source book has given an earlier panchaati sometimes in the later chapter . For example, a vakyam of TS 1.5.6.3 may be serial numbered by us as 23 based on the order in the Book, </w:t>
       </w:r>
       <w:r>
         <w:rPr>
@@ -5136,19 +5090,7 @@
           <w:szCs w:val="28"/>
           <w:lang w:val="en-US"/>
         </w:rPr>
-        <w:t>7.1.1.2(4)</w:t>
-      </w:r>
-      <w:proofErr w:type="gramStart"/>
-      <w:r>
-        <w:rPr>
-          <w:rFonts w:ascii="Arial" w:hAnsi="Arial" w:cs="Arial"/>
-          <w:bCs/>
-          <w:color w:val="FF0000"/>
-          <w:sz w:val="28"/>
-          <w:szCs w:val="28"/>
-          <w:lang w:val="en-US"/>
-        </w:rPr>
-        <w:t>-</w:t>
+        <w:t>7.1.1.2(4)-</w:t>
       </w:r>
       <w:r>
         <w:rPr>
@@ -5168,18 +5110,7 @@
           <w:szCs w:val="40"/>
           <w:lang w:eastAsia="en-US" w:bidi="hi-IN"/>
         </w:rPr>
-        <w:t>iÉqÉç</w:t>
-      </w:r>
-      <w:proofErr w:type="gramEnd"/>
-      <w:r>
-        <w:rPr>
-          <w:rFonts w:ascii="BRH Devanagari Extra" w:eastAsiaTheme="minorHAnsi" w:hAnsi="BRH Devanagari Extra" w:cs="BRH Devanagari Extra"/>
-          <w:color w:val="FF0000"/>
-          <w:sz w:val="40"/>
-          <w:szCs w:val="40"/>
-          <w:lang w:eastAsia="en-US" w:bidi="hi-IN"/>
-        </w:rPr>
-        <w:t xml:space="preserve"> | LýiÉålÉþ | AýÍpÉ | </w:t>
+        <w:t xml:space="preserve">iÉqÉç | LýiÉålÉþ | AýÍpÉ | </w:t>
       </w:r>
     </w:p>
     <w:p>
@@ -5206,29 +5137,7 @@
           <w:szCs w:val="40"/>
           <w:lang w:eastAsia="en-US" w:bidi="hi-IN"/>
         </w:rPr>
-        <w:t>iÉ qÉåýiÉå lÉæýiÉålÉý iÉqÉç iÉ qÉåýiÉå lÉÉýprÉÉÿ(1</w:t>
-      </w:r>
-      <w:proofErr w:type="gramStart"/>
-      <w:r>
-        <w:rPr>
-          <w:rFonts w:ascii="BRH Devanagari Extra" w:eastAsiaTheme="minorHAnsi" w:hAnsi="BRH Devanagari Extra" w:cs="BRH Devanagari Extra"/>
-          <w:color w:val="FF0000"/>
-          <w:sz w:val="40"/>
-          <w:szCs w:val="40"/>
-          <w:lang w:eastAsia="en-US" w:bidi="hi-IN"/>
-        </w:rPr>
-        <w:t>ý)prÉåþiÉålÉý</w:t>
-      </w:r>
-      <w:proofErr w:type="gramEnd"/>
-      <w:r>
-        <w:rPr>
-          <w:rFonts w:ascii="BRH Devanagari Extra" w:eastAsiaTheme="minorHAnsi" w:hAnsi="BRH Devanagari Extra" w:cs="BRH Devanagari Extra"/>
-          <w:color w:val="FF0000"/>
-          <w:sz w:val="40"/>
-          <w:szCs w:val="40"/>
-          <w:lang w:eastAsia="en-US" w:bidi="hi-IN"/>
-        </w:rPr>
-        <w:t xml:space="preserve"> iÉqÉç iÉ qÉåýiÉålÉÉýÍpÉ | </w:t>
+        <w:t xml:space="preserve">iÉ qÉåýiÉå lÉæýiÉålÉý iÉqÉç iÉ qÉåýiÉå lÉÉýprÉÉÿ(1ý)prÉåþiÉålÉý iÉqÉç iÉ qÉåýiÉålÉÉýÍpÉ | </w:t>
       </w:r>
     </w:p>
     <w:p>
@@ -7339,49 +7248,27 @@
           <w:szCs w:val="32"/>
           <w:lang w:eastAsia="en-US" w:bidi="hi-IN"/>
         </w:rPr>
-        <w:t>7.1.5.1(15)</w:t>
-      </w:r>
-      <w:proofErr w:type="gramStart"/>
-      <w:r>
-        <w:rPr>
-          <w:rFonts w:ascii="Arial" w:eastAsiaTheme="minorHAnsi" w:hAnsi="Arial" w:cs="Arial"/>
+        <w:t>7.1.5.1(15)-</w:t>
+      </w:r>
+      <w:r>
+        <w:rPr>
+          <w:rFonts w:ascii="BRH Devanagari Extra" w:eastAsiaTheme="minorHAnsi" w:hAnsi="BRH Devanagari Extra" w:cs="BRH Devanagari Extra"/>
           <w:color w:val="FF0000"/>
           <w:sz w:val="32"/>
           <w:szCs w:val="32"/>
           <w:lang w:eastAsia="en-US" w:bidi="hi-IN"/>
         </w:rPr>
-        <w:t>-</w:t>
+        <w:t xml:space="preserve">  </w:t>
       </w:r>
       <w:r>
         <w:rPr>
           <w:rFonts w:ascii="BRH Devanagari Extra" w:eastAsiaTheme="minorHAnsi" w:hAnsi="BRH Devanagari Extra" w:cs="BRH Devanagari Extra"/>
           <w:color w:val="FF0000"/>
-          <w:sz w:val="32"/>
-          <w:szCs w:val="32"/>
+          <w:sz w:val="40"/>
+          <w:szCs w:val="40"/>
           <w:lang w:eastAsia="en-US" w:bidi="hi-IN"/>
         </w:rPr>
-        <w:t xml:space="preserve">  </w:t>
-      </w:r>
-      <w:r>
-        <w:rPr>
-          <w:rFonts w:ascii="BRH Devanagari Extra" w:eastAsiaTheme="minorHAnsi" w:hAnsi="BRH Devanagari Extra" w:cs="BRH Devanagari Extra"/>
-          <w:color w:val="FF0000"/>
-          <w:sz w:val="40"/>
-          <w:szCs w:val="40"/>
-          <w:lang w:eastAsia="en-US" w:bidi="hi-IN"/>
-        </w:rPr>
-        <w:t>iÉÉqÉç</w:t>
-      </w:r>
-      <w:proofErr w:type="gramEnd"/>
-      <w:r>
-        <w:rPr>
-          <w:rFonts w:ascii="BRH Devanagari Extra" w:eastAsiaTheme="minorHAnsi" w:hAnsi="BRH Devanagari Extra" w:cs="BRH Devanagari Extra"/>
-          <w:color w:val="FF0000"/>
-          <w:sz w:val="40"/>
-          <w:szCs w:val="40"/>
-          <w:lang w:eastAsia="en-US" w:bidi="hi-IN"/>
-        </w:rPr>
-        <w:t xml:space="preserve"> | uÉýUÉýWûÈ | pÉÔýiuÉÉ |</w:t>
+        <w:t>iÉÉqÉç | uÉýUÉýWûÈ | pÉÔýiuÉÉ |</w:t>
       </w:r>
     </w:p>
     <w:p>
@@ -7439,39 +7326,17 @@
           <w:szCs w:val="32"/>
           <w:lang w:eastAsia="en-US" w:bidi="hi-IN"/>
         </w:rPr>
-        <w:t>7.1.5.1(16)</w:t>
-      </w:r>
-      <w:proofErr w:type="gramStart"/>
-      <w:r>
-        <w:rPr>
-          <w:rFonts w:ascii="Arial" w:eastAsiaTheme="minorHAnsi" w:hAnsi="Arial" w:cs="Arial"/>
-          <w:color w:val="FF0000"/>
-          <w:sz w:val="32"/>
-          <w:szCs w:val="32"/>
+        <w:t>7.1.5.1(16)-</w:t>
+      </w:r>
+      <w:r>
+        <w:rPr>
+          <w:rFonts w:ascii="BRH Devanagari Extra" w:eastAsiaTheme="minorHAnsi" w:hAnsi="BRH Devanagari Extra" w:cs="BRH Devanagari Extra"/>
+          <w:color w:val="FF0000"/>
+          <w:sz w:val="40"/>
+          <w:szCs w:val="40"/>
           <w:lang w:eastAsia="en-US" w:bidi="hi-IN"/>
         </w:rPr>
-        <w:t>-</w:t>
-      </w:r>
-      <w:r>
-        <w:rPr>
-          <w:rFonts w:ascii="BRH Devanagari Extra" w:eastAsiaTheme="minorHAnsi" w:hAnsi="BRH Devanagari Extra" w:cs="BRH Devanagari Extra"/>
-          <w:color w:val="FF0000"/>
-          <w:sz w:val="40"/>
-          <w:szCs w:val="40"/>
-          <w:lang w:eastAsia="en-US" w:bidi="hi-IN"/>
-        </w:rPr>
-        <w:t xml:space="preserve">  uÉýUÉýWûÈ</w:t>
-      </w:r>
-      <w:proofErr w:type="gramEnd"/>
-      <w:r>
-        <w:rPr>
-          <w:rFonts w:ascii="BRH Devanagari Extra" w:eastAsiaTheme="minorHAnsi" w:hAnsi="BRH Devanagari Extra" w:cs="BRH Devanagari Extra"/>
-          <w:color w:val="FF0000"/>
-          <w:sz w:val="40"/>
-          <w:szCs w:val="40"/>
-          <w:lang w:eastAsia="en-US" w:bidi="hi-IN"/>
-        </w:rPr>
-        <w:t xml:space="preserve"> | pÉÔýiuÉÉ | AÉ | AýWûýUýiÉç | </w:t>
+        <w:t xml:space="preserve">  uÉýUÉýWûÈ | pÉÔýiuÉÉ | AÉ | AýWûýUýiÉç | </w:t>
       </w:r>
     </w:p>
     <w:p>
@@ -7558,39 +7423,17 @@
           <w:lang w:eastAsia="en-US" w:bidi="hi-IN"/>
         </w:rPr>
         <w:lastRenderedPageBreak/>
-        <w:t>7.1.5.1(17)</w:t>
-      </w:r>
-      <w:proofErr w:type="gramStart"/>
-      <w:r>
-        <w:rPr>
-          <w:rFonts w:ascii="Arial" w:eastAsiaTheme="minorHAnsi" w:hAnsi="Arial" w:cs="Arial"/>
-          <w:color w:val="FF0000"/>
-          <w:sz w:val="32"/>
-          <w:szCs w:val="32"/>
+        <w:t>7.1.5.1(17)-</w:t>
+      </w:r>
+      <w:r>
+        <w:rPr>
+          <w:rFonts w:ascii="BRH Devanagari Extra" w:eastAsiaTheme="minorHAnsi" w:hAnsi="BRH Devanagari Extra" w:cs="BRH Devanagari Extra"/>
+          <w:color w:val="FF0000"/>
+          <w:sz w:val="40"/>
+          <w:szCs w:val="40"/>
           <w:lang w:eastAsia="en-US" w:bidi="hi-IN"/>
         </w:rPr>
-        <w:t>-</w:t>
-      </w:r>
-      <w:r>
-        <w:rPr>
-          <w:rFonts w:ascii="BRH Devanagari Extra" w:eastAsiaTheme="minorHAnsi" w:hAnsi="BRH Devanagari Extra" w:cs="BRH Devanagari Extra"/>
-          <w:color w:val="FF0000"/>
-          <w:sz w:val="40"/>
-          <w:szCs w:val="40"/>
-          <w:lang w:eastAsia="en-US" w:bidi="hi-IN"/>
-        </w:rPr>
-        <w:t xml:space="preserve">  pÉÔýiuÉÉ</w:t>
-      </w:r>
-      <w:proofErr w:type="gramEnd"/>
-      <w:r>
-        <w:rPr>
-          <w:rFonts w:ascii="BRH Devanagari Extra" w:eastAsiaTheme="minorHAnsi" w:hAnsi="BRH Devanagari Extra" w:cs="BRH Devanagari Extra"/>
-          <w:color w:val="FF0000"/>
-          <w:sz w:val="40"/>
-          <w:szCs w:val="40"/>
-          <w:lang w:eastAsia="en-US" w:bidi="hi-IN"/>
-        </w:rPr>
-        <w:t xml:space="preserve"> | AÉ | AýWûýUýiÉç | iÉÉqÉç |</w:t>
+        <w:t xml:space="preserve">  pÉÔýiuÉÉ | AÉ | AýWûýUýiÉç | iÉÉqÉç |</w:t>
       </w:r>
     </w:p>
     <w:p>
@@ -7648,39 +7491,17 @@
           <w:szCs w:val="32"/>
           <w:lang w:eastAsia="en-US" w:bidi="hi-IN"/>
         </w:rPr>
-        <w:t>7.1.5.1(18)</w:t>
-      </w:r>
-      <w:proofErr w:type="gramStart"/>
-      <w:r>
-        <w:rPr>
-          <w:rFonts w:ascii="Arial" w:eastAsiaTheme="minorHAnsi" w:hAnsi="Arial" w:cs="Arial"/>
-          <w:color w:val="FF0000"/>
-          <w:sz w:val="32"/>
-          <w:szCs w:val="32"/>
+        <w:t>7.1.5.1(18)-</w:t>
+      </w:r>
+      <w:r>
+        <w:rPr>
+          <w:rFonts w:ascii="BRH Devanagari Extra" w:eastAsiaTheme="minorHAnsi" w:hAnsi="BRH Devanagari Extra" w:cs="BRH Devanagari Extra"/>
+          <w:color w:val="FF0000"/>
+          <w:sz w:val="40"/>
+          <w:szCs w:val="40"/>
           <w:lang w:eastAsia="en-US" w:bidi="hi-IN"/>
         </w:rPr>
-        <w:t>-</w:t>
-      </w:r>
-      <w:r>
-        <w:rPr>
-          <w:rFonts w:ascii="BRH Devanagari Extra" w:eastAsiaTheme="minorHAnsi" w:hAnsi="BRH Devanagari Extra" w:cs="BRH Devanagari Extra"/>
-          <w:color w:val="FF0000"/>
-          <w:sz w:val="40"/>
-          <w:szCs w:val="40"/>
-          <w:lang w:eastAsia="en-US" w:bidi="hi-IN"/>
-        </w:rPr>
-        <w:t xml:space="preserve">  AÉ</w:t>
-      </w:r>
-      <w:proofErr w:type="gramEnd"/>
-      <w:r>
-        <w:rPr>
-          <w:rFonts w:ascii="BRH Devanagari Extra" w:eastAsiaTheme="minorHAnsi" w:hAnsi="BRH Devanagari Extra" w:cs="BRH Devanagari Extra"/>
-          <w:color w:val="FF0000"/>
-          <w:sz w:val="40"/>
-          <w:szCs w:val="40"/>
-          <w:lang w:eastAsia="en-US" w:bidi="hi-IN"/>
-        </w:rPr>
-        <w:t xml:space="preserve"> | AýWûýUýiÉç | iÉÉqÉç | </w:t>
+        <w:t xml:space="preserve">  AÉ | AýWûýUýiÉç | iÉÉqÉç | </w:t>
       </w:r>
     </w:p>
     <w:p>
@@ -8421,9 +8242,56 @@
           <w:szCs w:val="28"/>
           <w:lang w:val="en-US"/>
         </w:rPr>
-        <w:t>7.1.5.4(38)</w:t>
-      </w:r>
-      <w:proofErr w:type="gramStart"/>
+        <w:t>7.1.5.4(38)-</w:t>
+      </w:r>
+      <w:r>
+        <w:rPr>
+          <w:rFonts w:ascii="BRH Devanagari Extra" w:eastAsiaTheme="minorHAnsi" w:hAnsi="BRH Devanagari Extra" w:cs="BRH Devanagari Extra"/>
+          <w:color w:val="FF0000"/>
+          <w:sz w:val="36"/>
+          <w:szCs w:val="36"/>
+          <w:lang w:eastAsia="en-US" w:bidi="hi-IN"/>
+        </w:rPr>
+        <w:t xml:space="preserve">  xrÉÉýiÉç | AjÉþ | EýYjrÉþÈ | </w:t>
+      </w:r>
+    </w:p>
+    <w:p>
+      <w:pPr>
+        <w:autoSpaceDE w:val="0"/>
+        <w:autoSpaceDN w:val="0"/>
+        <w:adjustRightInd w:val="0"/>
+        <w:rPr>
+          <w:rFonts w:ascii="BRH Devanagari Extra" w:eastAsiaTheme="minorHAnsi" w:hAnsi="BRH Devanagari Extra" w:cs="BRH Devanagari Extra"/>
+          <w:color w:val="FF0000"/>
+          <w:sz w:val="36"/>
+          <w:szCs w:val="36"/>
+          <w:lang w:eastAsia="en-US" w:bidi="hi-IN"/>
+        </w:rPr>
+      </w:pPr>
+      <w:r>
+        <w:rPr>
+          <w:rFonts w:ascii="BRH Devanagari Extra" w:eastAsiaTheme="minorHAnsi" w:hAnsi="BRH Devanagari Extra" w:cs="BRH Devanagari Extra"/>
+          <w:color w:val="FF0000"/>
+          <w:sz w:val="36"/>
+          <w:szCs w:val="36"/>
+          <w:lang w:eastAsia="en-US" w:bidi="hi-IN"/>
+        </w:rPr>
+        <w:t xml:space="preserve">xrÉÉý SjÉÉjÉþ xrÉÉjÉç xrÉÉý SjÉÉåýYjrÉþ EýYjrÉÉå ÅjÉþ xrÉÉjÉç xrÉÉý SjÉÉåýYjrÉþÈ | </w:t>
+      </w:r>
+    </w:p>
+    <w:p>
+      <w:pPr>
+        <w:autoSpaceDE w:val="0"/>
+        <w:autoSpaceDN w:val="0"/>
+        <w:adjustRightInd w:val="0"/>
+        <w:rPr>
+          <w:rFonts w:ascii="BRH Devanagari Extra" w:eastAsiaTheme="minorHAnsi" w:hAnsi="BRH Devanagari Extra" w:cs="BRH Devanagari Extra"/>
+          <w:color w:val="FF0000"/>
+          <w:sz w:val="36"/>
+          <w:szCs w:val="36"/>
+          <w:lang w:eastAsia="en-US" w:bidi="hi-IN"/>
+        </w:rPr>
+      </w:pPr>
       <w:r>
         <w:rPr>
           <w:rFonts w:ascii="Arial" w:hAnsi="Arial" w:cs="Arial"/>
@@ -8433,7 +8301,7 @@
           <w:szCs w:val="28"/>
           <w:lang w:val="en-US"/>
         </w:rPr>
-        <w:t>-</w:t>
+        <w:t>7.1.5.4(39)-</w:t>
       </w:r>
       <w:r>
         <w:rPr>
@@ -8443,10 +8311,14 @@
           <w:szCs w:val="36"/>
           <w:lang w:eastAsia="en-US" w:bidi="hi-IN"/>
         </w:rPr>
-        <w:t xml:space="preserve">  xrÉÉýiÉç</w:t>
-      </w:r>
-      <w:proofErr w:type="gramEnd"/>
-      <w:r>
+        <w:t xml:space="preserve">  AjÉþ | EýYjrÉþÈ | AjÉþ | </w:t>
+      </w:r>
+    </w:p>
+    <w:p>
+      <w:pPr>
+        <w:autoSpaceDE w:val="0"/>
+        <w:autoSpaceDN w:val="0"/>
+        <w:adjustRightInd w:val="0"/>
         <w:rPr>
           <w:rFonts w:ascii="BRH Devanagari Extra" w:eastAsiaTheme="minorHAnsi" w:hAnsi="BRH Devanagari Extra" w:cs="BRH Devanagari Extra"/>
           <w:color w:val="FF0000"/>
@@ -8454,7 +8326,16 @@
           <w:szCs w:val="36"/>
           <w:lang w:eastAsia="en-US" w:bidi="hi-IN"/>
         </w:rPr>
-        <w:t xml:space="preserve"> | AjÉþ | EýYjrÉþÈ | </w:t>
+      </w:pPr>
+      <w:r>
+        <w:rPr>
+          <w:rFonts w:ascii="BRH Devanagari Extra" w:eastAsiaTheme="minorHAnsi" w:hAnsi="BRH Devanagari Extra" w:cs="BRH Devanagari Extra"/>
+          <w:color w:val="FF0000"/>
+          <w:sz w:val="36"/>
+          <w:szCs w:val="36"/>
+          <w:lang w:eastAsia="en-US" w:bidi="hi-IN"/>
+        </w:rPr>
+        <w:t xml:space="preserve">AjÉÉåýYjrÉþ EýYjrÉÉå ÅjÉÉjÉÉåý YjrÉÉå ÅjÉÉjÉÉåý YjrÉÉå ÅjÉÉjÉÉåý YjrÉÉå ÅjÉþ | </w:t>
       </w:r>
     </w:p>
     <w:p>
@@ -8472,153 +8353,24 @@
       </w:pPr>
       <w:r>
         <w:rPr>
+          <w:rFonts w:ascii="Arial" w:hAnsi="Arial" w:cs="Arial"/>
+          <w:bCs/>
+          <w:color w:val="FF0000"/>
+          <w:sz w:val="28"/>
+          <w:szCs w:val="28"/>
+          <w:lang w:val="en-US"/>
+        </w:rPr>
+        <w:t>7.1.5.4(40)-</w:t>
+      </w:r>
+      <w:r>
+        <w:rPr>
           <w:rFonts w:ascii="BRH Devanagari Extra" w:eastAsiaTheme="minorHAnsi" w:hAnsi="BRH Devanagari Extra" w:cs="BRH Devanagari Extra"/>
           <w:color w:val="FF0000"/>
           <w:sz w:val="36"/>
           <w:szCs w:val="36"/>
           <w:lang w:eastAsia="en-US" w:bidi="hi-IN"/>
         </w:rPr>
-        <w:t xml:space="preserve">xrÉÉý SjÉÉjÉþ xrÉÉjÉç xrÉÉý SjÉÉåýYjrÉþ EýYjrÉÉå ÅjÉþ xrÉÉjÉç xrÉÉý SjÉÉåýYjrÉþÈ | </w:t>
-      </w:r>
-    </w:p>
-    <w:p>
-      <w:pPr>
-        <w:autoSpaceDE w:val="0"/>
-        <w:autoSpaceDN w:val="0"/>
-        <w:adjustRightInd w:val="0"/>
-        <w:rPr>
-          <w:rFonts w:ascii="BRH Devanagari Extra" w:eastAsiaTheme="minorHAnsi" w:hAnsi="BRH Devanagari Extra" w:cs="BRH Devanagari Extra"/>
-          <w:color w:val="FF0000"/>
-          <w:sz w:val="36"/>
-          <w:szCs w:val="36"/>
-          <w:lang w:eastAsia="en-US" w:bidi="hi-IN"/>
-        </w:rPr>
-      </w:pPr>
-      <w:r>
-        <w:rPr>
-          <w:rFonts w:ascii="Arial" w:hAnsi="Arial" w:cs="Arial"/>
-          <w:bCs/>
-          <w:color w:val="FF0000"/>
-          <w:sz w:val="28"/>
-          <w:szCs w:val="28"/>
-          <w:lang w:val="en-US"/>
-        </w:rPr>
-        <w:t>7.1.5.4(39)</w:t>
-      </w:r>
-      <w:proofErr w:type="gramStart"/>
-      <w:r>
-        <w:rPr>
-          <w:rFonts w:ascii="Arial" w:hAnsi="Arial" w:cs="Arial"/>
-          <w:bCs/>
-          <w:color w:val="FF0000"/>
-          <w:sz w:val="28"/>
-          <w:szCs w:val="28"/>
-          <w:lang w:val="en-US"/>
-        </w:rPr>
-        <w:t>-</w:t>
-      </w:r>
-      <w:r>
-        <w:rPr>
-          <w:rFonts w:ascii="BRH Devanagari Extra" w:eastAsiaTheme="minorHAnsi" w:hAnsi="BRH Devanagari Extra" w:cs="BRH Devanagari Extra"/>
-          <w:color w:val="FF0000"/>
-          <w:sz w:val="36"/>
-          <w:szCs w:val="36"/>
-          <w:lang w:eastAsia="en-US" w:bidi="hi-IN"/>
-        </w:rPr>
-        <w:t xml:space="preserve">  AjÉþ</w:t>
-      </w:r>
-      <w:proofErr w:type="gramEnd"/>
-      <w:r>
-        <w:rPr>
-          <w:rFonts w:ascii="BRH Devanagari Extra" w:eastAsiaTheme="minorHAnsi" w:hAnsi="BRH Devanagari Extra" w:cs="BRH Devanagari Extra"/>
-          <w:color w:val="FF0000"/>
-          <w:sz w:val="36"/>
-          <w:szCs w:val="36"/>
-          <w:lang w:eastAsia="en-US" w:bidi="hi-IN"/>
-        </w:rPr>
-        <w:t xml:space="preserve"> | EýYjrÉþÈ | AjÉþ | </w:t>
-      </w:r>
-    </w:p>
-    <w:p>
-      <w:pPr>
-        <w:autoSpaceDE w:val="0"/>
-        <w:autoSpaceDN w:val="0"/>
-        <w:adjustRightInd w:val="0"/>
-        <w:rPr>
-          <w:rFonts w:ascii="BRH Devanagari Extra" w:eastAsiaTheme="minorHAnsi" w:hAnsi="BRH Devanagari Extra" w:cs="BRH Devanagari Extra"/>
-          <w:color w:val="FF0000"/>
-          <w:sz w:val="36"/>
-          <w:szCs w:val="36"/>
-          <w:lang w:eastAsia="en-US" w:bidi="hi-IN"/>
-        </w:rPr>
-      </w:pPr>
-      <w:r>
-        <w:rPr>
-          <w:rFonts w:ascii="BRH Devanagari Extra" w:eastAsiaTheme="minorHAnsi" w:hAnsi="BRH Devanagari Extra" w:cs="BRH Devanagari Extra"/>
-          <w:color w:val="FF0000"/>
-          <w:sz w:val="36"/>
-          <w:szCs w:val="36"/>
-          <w:lang w:eastAsia="en-US" w:bidi="hi-IN"/>
-        </w:rPr>
-        <w:t xml:space="preserve">AjÉÉåýYjrÉþ EýYjrÉÉå ÅjÉÉjÉÉåý YjrÉÉå ÅjÉÉjÉÉåý YjrÉÉå ÅjÉÉjÉÉåý YjrÉÉå ÅjÉþ | </w:t>
-      </w:r>
-    </w:p>
-    <w:p>
-      <w:pPr>
-        <w:autoSpaceDE w:val="0"/>
-        <w:autoSpaceDN w:val="0"/>
-        <w:adjustRightInd w:val="0"/>
-        <w:rPr>
-          <w:rFonts w:ascii="BRH Devanagari Extra" w:eastAsiaTheme="minorHAnsi" w:hAnsi="BRH Devanagari Extra" w:cs="BRH Devanagari Extra"/>
-          <w:color w:val="FF0000"/>
-          <w:sz w:val="36"/>
-          <w:szCs w:val="36"/>
-          <w:lang w:eastAsia="en-US" w:bidi="hi-IN"/>
-        </w:rPr>
-      </w:pPr>
-      <w:r>
-        <w:rPr>
-          <w:rFonts w:ascii="Arial" w:hAnsi="Arial" w:cs="Arial"/>
-          <w:bCs/>
-          <w:color w:val="FF0000"/>
-          <w:sz w:val="28"/>
-          <w:szCs w:val="28"/>
-          <w:lang w:val="en-US"/>
-        </w:rPr>
-        <w:t>7.1.5.4(40)</w:t>
-      </w:r>
-      <w:proofErr w:type="gramStart"/>
-      <w:r>
-        <w:rPr>
-          <w:rFonts w:ascii="Arial" w:hAnsi="Arial" w:cs="Arial"/>
-          <w:bCs/>
-          <w:color w:val="FF0000"/>
-          <w:sz w:val="28"/>
-          <w:szCs w:val="28"/>
-          <w:lang w:val="en-US"/>
-        </w:rPr>
-        <w:t>-</w:t>
-      </w:r>
-      <w:r>
-        <w:rPr>
-          <w:rFonts w:ascii="BRH Devanagari Extra" w:eastAsiaTheme="minorHAnsi" w:hAnsi="BRH Devanagari Extra" w:cs="BRH Devanagari Extra"/>
-          <w:color w:val="FF0000"/>
-          <w:sz w:val="36"/>
-          <w:szCs w:val="36"/>
-          <w:lang w:eastAsia="en-US" w:bidi="hi-IN"/>
-        </w:rPr>
-        <w:t xml:space="preserve">  EýYjrÉþÈ</w:t>
-      </w:r>
-      <w:proofErr w:type="gramEnd"/>
-      <w:r>
-        <w:rPr>
-          <w:rFonts w:ascii="BRH Devanagari Extra" w:eastAsiaTheme="minorHAnsi" w:hAnsi="BRH Devanagari Extra" w:cs="BRH Devanagari Extra"/>
-          <w:color w:val="FF0000"/>
-          <w:sz w:val="36"/>
-          <w:szCs w:val="36"/>
-          <w:lang w:eastAsia="en-US" w:bidi="hi-IN"/>
-        </w:rPr>
-        <w:t xml:space="preserve"> | AjÉþ | AýÌiÉýUÉý§ÉÈ | </w:t>
+        <w:t xml:space="preserve">  EýYjrÉþÈ | AjÉþ | AýÌiÉýUÉý§ÉÈ | </w:t>
       </w:r>
     </w:p>
     <w:p>
@@ -8728,6 +8480,17 @@
           <w:lang w:val="en-US"/>
         </w:rPr>
         <w:t xml:space="preserve"> </w:t>
+      </w:r>
+      <w:r>
+        <w:rPr>
+          <w:rFonts w:ascii="Arial" w:hAnsi="Arial" w:cs="Arial"/>
+          <w:bCs/>
+          <w:sz w:val="32"/>
+          <w:szCs w:val="32"/>
+          <w:highlight w:val="green"/>
+          <w:lang w:val="en-US"/>
+        </w:rPr>
+        <w:t xml:space="preserve">, </w:t>
       </w:r>
       <w:r>
         <w:rPr>
@@ -9008,20 +8771,8 @@
           <w:szCs w:val="40"/>
           <w:lang w:bidi="ar-SA"/>
         </w:rPr>
-        <w:t xml:space="preserve"> </w:t>
-      </w:r>
-      <w:proofErr w:type="gramStart"/>
-      <w:r>
-        <w:rPr>
-          <w:rFonts w:ascii="BRH Devanagari Extra" w:hAnsi="BRH Devanagari Extra" w:cs="BRH Devanagari Extra"/>
-          <w:b/>
-          <w:sz w:val="40"/>
-          <w:szCs w:val="40"/>
-          <w:lang w:bidi="ar-SA"/>
-        </w:rPr>
-        <w:t>WûÏ(</w:t>
-      </w:r>
-      <w:proofErr w:type="gramEnd"/>
+        <w:t xml:space="preserve"> WûÏ(</w:t>
+      </w:r>
       <w:r>
         <w:rPr>
           <w:rFonts w:ascii="Arial" w:hAnsi="Arial" w:cs="Arial"/>
@@ -9691,29 +9442,7 @@
           <w:szCs w:val="40"/>
           <w:lang w:eastAsia="en-US" w:bidi="ar-SA"/>
         </w:rPr>
-        <w:t xml:space="preserve">CÌiÉþ | AxiÉÑþ | </w:t>
-      </w:r>
-      <w:proofErr w:type="gramStart"/>
-      <w:r>
-        <w:rPr>
-          <w:rFonts w:ascii="BRH Devanagari Extra" w:eastAsiaTheme="minorHAnsi" w:hAnsi="BRH Devanagari Extra" w:cs="BRH Devanagari Extra"/>
-          <w:color w:val="000000"/>
-          <w:sz w:val="40"/>
-          <w:szCs w:val="40"/>
-          <w:lang w:eastAsia="en-US" w:bidi="ar-SA"/>
-        </w:rPr>
-        <w:t>WûÏ(</w:t>
-      </w:r>
-      <w:proofErr w:type="gramEnd"/>
-      <w:r>
-        <w:rPr>
-          <w:rFonts w:ascii="BRH Devanagari Extra" w:eastAsiaTheme="minorHAnsi" w:hAnsi="BRH Devanagari Extra" w:cs="BRH Devanagari Extra"/>
-          <w:color w:val="000000"/>
-          <w:sz w:val="40"/>
-          <w:szCs w:val="40"/>
-          <w:lang w:eastAsia="en-US" w:bidi="ar-SA"/>
-        </w:rPr>
-        <w:t>3) |</w:t>
+        <w:t>CÌiÉþ | AxiÉÑþ | WûÏ(3) |</w:t>
       </w:r>
       <w:r>
         <w:rPr>
@@ -9779,9 +9508,8 @@
           <w:szCs w:val="36"/>
           <w:lang w:eastAsia="en-US" w:bidi="ar-SA"/>
         </w:rPr>
-        <w:t xml:space="preserve">CirÉ xiuÉ ÎxiuÉiÉÏ irÉxiÉÑý </w:t>
-      </w:r>
-      <w:proofErr w:type="gramStart"/>
+        <w:t>CirÉ xiuÉ ÎxiuÉiÉÏ irÉxiÉÑý WûÏ(3) WûÏ(3) AÎxiuÉiÉÏ</w:t>
+      </w:r>
       <w:r>
         <w:rPr>
           <w:rFonts w:ascii="BRH Devanagari Extra" w:eastAsiaTheme="minorHAnsi" w:hAnsi="BRH Devanagari Extra" w:cs="BRH Devanagari Extra"/>
@@ -9791,9 +9519,8 @@
           <w:szCs w:val="36"/>
           <w:lang w:eastAsia="en-US" w:bidi="ar-SA"/>
         </w:rPr>
-        <w:t>WûÏ(</w:t>
-      </w:r>
-      <w:proofErr w:type="gramEnd"/>
+        <w:t xml:space="preserve"> </w:t>
+      </w:r>
       <w:r>
         <w:rPr>
           <w:rFonts w:ascii="BRH Devanagari Extra" w:eastAsiaTheme="minorHAnsi" w:hAnsi="BRH Devanagari Extra" w:cs="BRH Devanagari Extra"/>
@@ -9803,77 +9530,7 @@
           <w:szCs w:val="36"/>
           <w:lang w:eastAsia="en-US" w:bidi="ar-SA"/>
         </w:rPr>
-        <w:t xml:space="preserve">3) </w:t>
-      </w:r>
-      <w:proofErr w:type="gramStart"/>
-      <w:r>
-        <w:rPr>
-          <w:rFonts w:ascii="BRH Devanagari Extra" w:eastAsiaTheme="minorHAnsi" w:hAnsi="BRH Devanagari Extra" w:cs="BRH Devanagari Extra"/>
-          <w:b/>
-          <w:color w:val="000000"/>
-          <w:sz w:val="36"/>
-          <w:szCs w:val="36"/>
-          <w:lang w:eastAsia="en-US" w:bidi="ar-SA"/>
-        </w:rPr>
-        <w:t>WûÏ(</w:t>
-      </w:r>
-      <w:proofErr w:type="gramEnd"/>
-      <w:r>
-        <w:rPr>
-          <w:rFonts w:ascii="BRH Devanagari Extra" w:eastAsiaTheme="minorHAnsi" w:hAnsi="BRH Devanagari Extra" w:cs="BRH Devanagari Extra"/>
-          <w:b/>
-          <w:color w:val="000000"/>
-          <w:sz w:val="36"/>
-          <w:szCs w:val="36"/>
-          <w:lang w:eastAsia="en-US" w:bidi="ar-SA"/>
-        </w:rPr>
-        <w:t>3) AÎxiuÉiÉÏ</w:t>
-      </w:r>
-      <w:r>
-        <w:rPr>
-          <w:rFonts w:ascii="BRH Devanagari Extra" w:eastAsiaTheme="minorHAnsi" w:hAnsi="BRH Devanagari Extra" w:cs="BRH Devanagari Extra"/>
-          <w:b/>
-          <w:color w:val="000000"/>
-          <w:sz w:val="36"/>
-          <w:szCs w:val="36"/>
-          <w:lang w:eastAsia="en-US" w:bidi="ar-SA"/>
-        </w:rPr>
-        <w:t xml:space="preserve"> </w:t>
-      </w:r>
-      <w:r>
-        <w:rPr>
-          <w:rFonts w:ascii="BRH Devanagari Extra" w:eastAsiaTheme="minorHAnsi" w:hAnsi="BRH Devanagari Extra" w:cs="BRH Devanagari Extra"/>
-          <w:b/>
-          <w:color w:val="000000"/>
-          <w:sz w:val="36"/>
-          <w:szCs w:val="36"/>
-          <w:lang w:eastAsia="en-US" w:bidi="ar-SA"/>
-        </w:rPr>
-        <w:t xml:space="preserve">irÉxiÉÑý </w:t>
-      </w:r>
-      <w:proofErr w:type="gramStart"/>
-      <w:r>
-        <w:rPr>
-          <w:rFonts w:ascii="BRH Devanagari Extra" w:eastAsiaTheme="minorHAnsi" w:hAnsi="BRH Devanagari Extra" w:cs="BRH Devanagari Extra"/>
-          <w:b/>
-          <w:color w:val="000000"/>
-          <w:sz w:val="36"/>
-          <w:szCs w:val="36"/>
-          <w:lang w:eastAsia="en-US" w:bidi="ar-SA"/>
-        </w:rPr>
-        <w:t>WûÏ(</w:t>
-      </w:r>
-      <w:proofErr w:type="gramEnd"/>
-      <w:r>
-        <w:rPr>
-          <w:rFonts w:ascii="BRH Devanagari Extra" w:eastAsiaTheme="minorHAnsi" w:hAnsi="BRH Devanagari Extra" w:cs="BRH Devanagari Extra"/>
-          <w:b/>
-          <w:color w:val="000000"/>
-          <w:sz w:val="36"/>
-          <w:szCs w:val="36"/>
-          <w:lang w:eastAsia="en-US" w:bidi="ar-SA"/>
-        </w:rPr>
-        <w:t xml:space="preserve">3) | </w:t>
+        <w:t xml:space="preserve">irÉxiÉÑý WûÏ(3) | </w:t>
       </w:r>
     </w:p>
     <w:p>
@@ -9965,29 +9622,7 @@
           <w:szCs w:val="40"/>
           <w:lang w:eastAsia="en-US" w:bidi="ar-SA"/>
         </w:rPr>
-        <w:t xml:space="preserve">AxiÉÑþ | </w:t>
-      </w:r>
-      <w:proofErr w:type="gramStart"/>
-      <w:r>
-        <w:rPr>
-          <w:rFonts w:ascii="BRH Devanagari Extra" w:eastAsiaTheme="minorHAnsi" w:hAnsi="BRH Devanagari Extra" w:cs="BRH Devanagari Extra"/>
-          <w:color w:val="000000"/>
-          <w:sz w:val="40"/>
-          <w:szCs w:val="40"/>
-          <w:lang w:eastAsia="en-US" w:bidi="ar-SA"/>
-        </w:rPr>
-        <w:t>WûÏ(</w:t>
-      </w:r>
-      <w:proofErr w:type="gramEnd"/>
-      <w:r>
-        <w:rPr>
-          <w:rFonts w:ascii="BRH Devanagari Extra" w:eastAsiaTheme="minorHAnsi" w:hAnsi="BRH Devanagari Extra" w:cs="BRH Devanagari Extra"/>
-          <w:color w:val="000000"/>
-          <w:sz w:val="40"/>
-          <w:szCs w:val="40"/>
-          <w:lang w:eastAsia="en-US" w:bidi="ar-SA"/>
-        </w:rPr>
-        <w:t>3) | CÌiÉþ |</w:t>
+        <w:t>AxiÉÑþ | WûÏ(3) | CÌiÉþ |</w:t>
       </w:r>
       <w:r>
         <w:rPr>
@@ -10056,127 +9691,7 @@
           <w:szCs w:val="40"/>
           <w:lang w:eastAsia="en-US" w:bidi="ar-SA"/>
         </w:rPr>
-        <w:t xml:space="preserve">AxiÉÑý </w:t>
-      </w:r>
-      <w:proofErr w:type="gramStart"/>
-      <w:r>
-        <w:rPr>
-          <w:rFonts w:ascii="BRH Devanagari Extra" w:eastAsiaTheme="minorHAnsi" w:hAnsi="BRH Devanagari Extra" w:cs="BRH Devanagari Extra"/>
-          <w:b/>
-          <w:color w:val="000000"/>
-          <w:sz w:val="40"/>
-          <w:szCs w:val="40"/>
-          <w:lang w:eastAsia="en-US" w:bidi="ar-SA"/>
-        </w:rPr>
-        <w:t>WûÏ(</w:t>
-      </w:r>
-      <w:proofErr w:type="gramEnd"/>
-      <w:r>
-        <w:rPr>
-          <w:rFonts w:ascii="BRH Devanagari Extra" w:eastAsiaTheme="minorHAnsi" w:hAnsi="BRH Devanagari Extra" w:cs="BRH Devanagari Extra"/>
-          <w:b/>
-          <w:color w:val="000000"/>
-          <w:sz w:val="40"/>
-          <w:szCs w:val="40"/>
-          <w:lang w:eastAsia="en-US" w:bidi="ar-SA"/>
-        </w:rPr>
-        <w:t xml:space="preserve">3) </w:t>
-      </w:r>
-      <w:proofErr w:type="gramStart"/>
-      <w:r>
-        <w:rPr>
-          <w:rFonts w:ascii="BRH Devanagari Extra" w:eastAsiaTheme="minorHAnsi" w:hAnsi="BRH Devanagari Extra" w:cs="BRH Devanagari Extra"/>
-          <w:b/>
-          <w:color w:val="000000"/>
-          <w:sz w:val="40"/>
-          <w:szCs w:val="40"/>
-          <w:lang w:eastAsia="en-US" w:bidi="ar-SA"/>
-        </w:rPr>
-        <w:t>WûÏ(</w:t>
-      </w:r>
-      <w:proofErr w:type="gramEnd"/>
-      <w:r>
-        <w:rPr>
-          <w:rFonts w:ascii="BRH Devanagari Extra" w:eastAsiaTheme="minorHAnsi" w:hAnsi="BRH Devanagari Extra" w:cs="BRH Devanagari Extra"/>
-          <w:b/>
-          <w:color w:val="000000"/>
-          <w:sz w:val="40"/>
-          <w:szCs w:val="40"/>
-          <w:lang w:eastAsia="en-US" w:bidi="ar-SA"/>
-        </w:rPr>
-        <w:t xml:space="preserve">3) AxiuÉxiÉÑý </w:t>
-      </w:r>
-      <w:proofErr w:type="gramStart"/>
-      <w:r>
-        <w:rPr>
-          <w:rFonts w:ascii="BRH Devanagari Extra" w:eastAsiaTheme="minorHAnsi" w:hAnsi="BRH Devanagari Extra" w:cs="BRH Devanagari Extra"/>
-          <w:b/>
-          <w:color w:val="000000"/>
-          <w:sz w:val="40"/>
-          <w:szCs w:val="40"/>
-          <w:lang w:eastAsia="en-US" w:bidi="ar-SA"/>
-        </w:rPr>
-        <w:t>WûÏ(</w:t>
-      </w:r>
-      <w:proofErr w:type="gramEnd"/>
-      <w:r>
-        <w:rPr>
-          <w:rFonts w:ascii="BRH Devanagari Extra" w:eastAsiaTheme="minorHAnsi" w:hAnsi="BRH Devanagari Extra" w:cs="BRH Devanagari Extra"/>
-          <w:b/>
-          <w:color w:val="000000"/>
-          <w:sz w:val="40"/>
-          <w:szCs w:val="40"/>
-          <w:lang w:eastAsia="en-US" w:bidi="ar-SA"/>
-        </w:rPr>
-        <w:t xml:space="preserve">3) CiÉÏÌiÉý </w:t>
-      </w:r>
-      <w:proofErr w:type="gramStart"/>
-      <w:r>
-        <w:rPr>
-          <w:rFonts w:ascii="BRH Devanagari Extra" w:eastAsiaTheme="minorHAnsi" w:hAnsi="BRH Devanagari Extra" w:cs="BRH Devanagari Extra"/>
-          <w:b/>
-          <w:color w:val="000000"/>
-          <w:sz w:val="40"/>
-          <w:szCs w:val="40"/>
-          <w:lang w:eastAsia="en-US" w:bidi="ar-SA"/>
-        </w:rPr>
-        <w:t>WûÏ(</w:t>
-      </w:r>
-      <w:proofErr w:type="gramEnd"/>
-      <w:r>
-        <w:rPr>
-          <w:rFonts w:ascii="BRH Devanagari Extra" w:eastAsiaTheme="minorHAnsi" w:hAnsi="BRH Devanagari Extra" w:cs="BRH Devanagari Extra"/>
-          <w:b/>
-          <w:color w:val="000000"/>
-          <w:sz w:val="40"/>
-          <w:szCs w:val="40"/>
-          <w:lang w:eastAsia="en-US" w:bidi="ar-SA"/>
-        </w:rPr>
-        <w:t xml:space="preserve">3) AxiuÉxiÉÑý </w:t>
-      </w:r>
-      <w:proofErr w:type="gramStart"/>
-      <w:r>
-        <w:rPr>
-          <w:rFonts w:ascii="BRH Devanagari Extra" w:eastAsiaTheme="minorHAnsi" w:hAnsi="BRH Devanagari Extra" w:cs="BRH Devanagari Extra"/>
-          <w:b/>
-          <w:color w:val="000000"/>
-          <w:sz w:val="40"/>
-          <w:szCs w:val="40"/>
-          <w:lang w:eastAsia="en-US" w:bidi="ar-SA"/>
-        </w:rPr>
-        <w:t>WûÏ(</w:t>
-      </w:r>
-      <w:proofErr w:type="gramEnd"/>
-      <w:r>
-        <w:rPr>
-          <w:rFonts w:ascii="BRH Devanagari Extra" w:eastAsiaTheme="minorHAnsi" w:hAnsi="BRH Devanagari Extra" w:cs="BRH Devanagari Extra"/>
-          <w:b/>
-          <w:color w:val="000000"/>
-          <w:sz w:val="40"/>
-          <w:szCs w:val="40"/>
-          <w:lang w:eastAsia="en-US" w:bidi="ar-SA"/>
-        </w:rPr>
-        <w:t>3) CÌiÉþ |</w:t>
+        <w:t>AxiÉÑý WûÏ(3) WûÏ(3) AxiuÉxiÉÑý WûÏ(3) CiÉÏÌiÉý WûÏ(3) AxiuÉxiÉÑý WûÏ(3) CÌiÉþ |</w:t>
       </w:r>
     </w:p>
     <w:p>
@@ -11377,6 +10892,18 @@
           <w:highlight w:val="green"/>
           <w:lang w:eastAsia="en-US" w:bidi="ar-SA"/>
         </w:rPr>
+        <w:t xml:space="preserve">paada bhedam : </w:t>
+      </w:r>
+      <w:r>
+        <w:rPr>
+          <w:rFonts w:ascii="Arial" w:eastAsiaTheme="minorHAnsi" w:hAnsi="Arial" w:cs="Arial"/>
+          <w:bCs/>
+          <w:color w:val="000000"/>
+          <w:sz w:val="32"/>
+          <w:szCs w:val="32"/>
+          <w:highlight w:val="green"/>
+          <w:lang w:eastAsia="en-US" w:bidi="ar-SA"/>
+        </w:rPr>
         <w:t>it is only “advidvaan taam” as per some</w:t>
       </w:r>
       <w:r>
@@ -11773,19 +11300,7 @@
           <w:szCs w:val="32"/>
           <w:lang w:val="en-US"/>
         </w:rPr>
-        <w:t>7.1.7.3(16)</w:t>
-      </w:r>
-      <w:proofErr w:type="gramStart"/>
-      <w:r>
-        <w:rPr>
-          <w:rFonts w:ascii="Arial" w:hAnsi="Arial" w:cs="Arial"/>
-          <w:bCs/>
-          <w:color w:val="FF0000"/>
-          <w:sz w:val="32"/>
-          <w:szCs w:val="32"/>
-          <w:lang w:val="en-US"/>
-        </w:rPr>
-        <w:t>-</w:t>
+        <w:t>7.1.7.3(16)-</w:t>
       </w:r>
       <w:r>
         <w:rPr>
@@ -11795,18 +11310,7 @@
           <w:szCs w:val="40"/>
           <w:lang w:eastAsia="en-US" w:bidi="hi-IN"/>
         </w:rPr>
-        <w:t xml:space="preserve">  LMüÉÿ</w:t>
-      </w:r>
-      <w:proofErr w:type="gramEnd"/>
-      <w:r>
-        <w:rPr>
-          <w:rFonts w:ascii="BRH Devanagari Extra" w:eastAsiaTheme="minorHAnsi" w:hAnsi="BRH Devanagari Extra" w:cs="BRH Devanagari Extra"/>
-          <w:color w:val="FF0000"/>
-          <w:sz w:val="40"/>
-          <w:szCs w:val="40"/>
-          <w:lang w:eastAsia="en-US" w:bidi="hi-IN"/>
-        </w:rPr>
-        <w:t xml:space="preserve"> | qÉÉý | pÉÔýiÉÉ |</w:t>
+        <w:t xml:space="preserve">  LMüÉÿ | qÉÉý | pÉÔýiÉÉ |</w:t>
       </w:r>
     </w:p>
     <w:p>
@@ -11864,19 +11368,7 @@
           <w:szCs w:val="32"/>
           <w:lang w:val="en-US"/>
         </w:rPr>
-        <w:t>7.1.7.3(17)</w:t>
-      </w:r>
-      <w:proofErr w:type="gramStart"/>
-      <w:r>
-        <w:rPr>
-          <w:rFonts w:ascii="Arial" w:hAnsi="Arial" w:cs="Arial"/>
-          <w:bCs/>
-          <w:color w:val="FF0000"/>
-          <w:sz w:val="32"/>
-          <w:szCs w:val="32"/>
-          <w:lang w:val="en-US"/>
-        </w:rPr>
-        <w:t>-</w:t>
+        <w:t>7.1.7.3(17)-</w:t>
       </w:r>
       <w:r>
         <w:rPr>
@@ -11886,18 +11378,7 @@
           <w:szCs w:val="40"/>
           <w:lang w:eastAsia="en-US" w:bidi="hi-IN"/>
         </w:rPr>
-        <w:t xml:space="preserve">  qÉÉý</w:t>
-      </w:r>
-      <w:proofErr w:type="gramEnd"/>
-      <w:r>
-        <w:rPr>
-          <w:rFonts w:ascii="BRH Devanagari Extra" w:eastAsiaTheme="minorHAnsi" w:hAnsi="BRH Devanagari Extra" w:cs="BRH Devanagari Extra"/>
-          <w:color w:val="FF0000"/>
-          <w:sz w:val="40"/>
-          <w:szCs w:val="40"/>
-          <w:lang w:eastAsia="en-US" w:bidi="hi-IN"/>
-        </w:rPr>
-        <w:t xml:space="preserve"> | pÉÔýiÉÉ | AÉ | ÌuÉýzÉý | </w:t>
+        <w:t xml:space="preserve">  qÉÉý | pÉÔýiÉÉ | AÉ | ÌuÉýzÉý | </w:t>
       </w:r>
     </w:p>
     <w:p>
@@ -11956,19 +11437,7 @@
           <w:szCs w:val="32"/>
           <w:lang w:val="en-US"/>
         </w:rPr>
-        <w:t>7.1.7.3(18)</w:t>
-      </w:r>
-      <w:proofErr w:type="gramStart"/>
-      <w:r>
-        <w:rPr>
-          <w:rFonts w:ascii="Arial" w:hAnsi="Arial" w:cs="Arial"/>
-          <w:bCs/>
-          <w:color w:val="FF0000"/>
-          <w:sz w:val="32"/>
-          <w:szCs w:val="32"/>
-          <w:lang w:val="en-US"/>
-        </w:rPr>
-        <w:t>-</w:t>
+        <w:t>7.1.7.3(18)-</w:t>
       </w:r>
       <w:r>
         <w:rPr>
@@ -11978,18 +11447,7 @@
           <w:szCs w:val="40"/>
           <w:lang w:eastAsia="en-US" w:bidi="hi-IN"/>
         </w:rPr>
-        <w:t xml:space="preserve">  pÉÔýiÉÉ</w:t>
-      </w:r>
-      <w:proofErr w:type="gramEnd"/>
-      <w:r>
-        <w:rPr>
-          <w:rFonts w:ascii="BRH Devanagari Extra" w:eastAsiaTheme="minorHAnsi" w:hAnsi="BRH Devanagari Extra" w:cs="BRH Devanagari Extra"/>
-          <w:color w:val="FF0000"/>
-          <w:sz w:val="40"/>
-          <w:szCs w:val="40"/>
-          <w:lang w:eastAsia="en-US" w:bidi="hi-IN"/>
-        </w:rPr>
-        <w:t xml:space="preserve"> | AÉ | ÌuÉýzÉý | qÉÉ |</w:t>
+        <w:t xml:space="preserve">  pÉÔýiÉÉ | AÉ | ÌuÉýzÉý | qÉÉ |</w:t>
       </w:r>
     </w:p>
     <w:p>
@@ -12047,19 +11505,7 @@
           <w:szCs w:val="32"/>
           <w:lang w:val="en-US"/>
         </w:rPr>
-        <w:t>7.1.7.3(19)</w:t>
-      </w:r>
-      <w:proofErr w:type="gramStart"/>
-      <w:r>
-        <w:rPr>
-          <w:rFonts w:ascii="Arial" w:hAnsi="Arial" w:cs="Arial"/>
-          <w:bCs/>
-          <w:color w:val="FF0000"/>
-          <w:sz w:val="32"/>
-          <w:szCs w:val="32"/>
-          <w:lang w:val="en-US"/>
-        </w:rPr>
-        <w:t>-</w:t>
+        <w:t>7.1.7.3(19)-</w:t>
       </w:r>
       <w:r>
         <w:rPr>
@@ -12069,18 +11515,7 @@
           <w:szCs w:val="40"/>
           <w:lang w:eastAsia="en-US" w:bidi="hi-IN"/>
         </w:rPr>
-        <w:t xml:space="preserve">  AÉ</w:t>
-      </w:r>
-      <w:proofErr w:type="gramEnd"/>
-      <w:r>
-        <w:rPr>
-          <w:rFonts w:ascii="BRH Devanagari Extra" w:eastAsiaTheme="minorHAnsi" w:hAnsi="BRH Devanagari Extra" w:cs="BRH Devanagari Extra"/>
-          <w:color w:val="FF0000"/>
-          <w:sz w:val="40"/>
-          <w:szCs w:val="40"/>
-          <w:lang w:eastAsia="en-US" w:bidi="hi-IN"/>
-        </w:rPr>
-        <w:t xml:space="preserve"> | ÌuÉýzÉý | qÉÉ | </w:t>
+        <w:t xml:space="preserve">  AÉ | ÌuÉýzÉý | qÉÉ | </w:t>
       </w:r>
     </w:p>
     <w:p>
@@ -12658,9 +12093,8 @@
           <w:highlight w:val="yellow"/>
           <w:lang w:val="en-US"/>
         </w:rPr>
-        <w:t xml:space="preserve">in </w:t>
-      </w:r>
-      <w:proofErr w:type="gramStart"/>
+        <w:t xml:space="preserve">in green </w:t>
+      </w:r>
       <w:r>
         <w:rPr>
           <w:rFonts w:ascii="Arial" w:hAnsi="Arial" w:cs="Arial"/>
@@ -12671,7 +12105,7 @@
           <w:highlight w:val="yellow"/>
           <w:lang w:val="en-US"/>
         </w:rPr>
-        <w:t xml:space="preserve">green </w:t>
+        <w:t xml:space="preserve">, </w:t>
       </w:r>
       <w:r>
         <w:rPr>
@@ -12683,9 +12117,8 @@
           <w:highlight w:val="yellow"/>
           <w:lang w:val="en-US"/>
         </w:rPr>
-        <w:t>,</w:t>
-      </w:r>
-      <w:proofErr w:type="gramEnd"/>
+        <w:t xml:space="preserve">non tri kramam </w:t>
+      </w:r>
       <w:r>
         <w:rPr>
           <w:rFonts w:ascii="Arial" w:hAnsi="Arial" w:cs="Arial"/>
@@ -12696,7 +12129,7 @@
           <w:highlight w:val="yellow"/>
           <w:lang w:val="en-US"/>
         </w:rPr>
-        <w:t xml:space="preserve"> </w:t>
+        <w:t xml:space="preserve"> in blue </w:t>
       </w:r>
       <w:r>
         <w:rPr>
@@ -12708,7 +12141,7 @@
           <w:highlight w:val="yellow"/>
           <w:lang w:val="en-US"/>
         </w:rPr>
-        <w:t xml:space="preserve">not </w:t>
+        <w:t>)</w:t>
       </w:r>
       <w:r>
         <w:rPr>
@@ -12720,68 +12153,6 @@
           <w:highlight w:val="yellow"/>
           <w:lang w:val="en-US"/>
         </w:rPr>
-        <w:t xml:space="preserve">the </w:t>
-      </w:r>
-      <w:r>
-        <w:rPr>
-          <w:rFonts w:ascii="Arial" w:hAnsi="Arial" w:cs="Arial"/>
-          <w:b/>
-          <w:bCs/>
-          <w:sz w:val="32"/>
-          <w:szCs w:val="32"/>
-          <w:highlight w:val="yellow"/>
-          <w:lang w:val="en-US"/>
-        </w:rPr>
-        <w:t>others</w:t>
-      </w:r>
-      <w:r>
-        <w:rPr>
-          <w:rFonts w:ascii="Arial" w:hAnsi="Arial" w:cs="Arial"/>
-          <w:b/>
-          <w:bCs/>
-          <w:sz w:val="32"/>
-          <w:szCs w:val="32"/>
-          <w:highlight w:val="yellow"/>
-          <w:lang w:val="en-US"/>
-        </w:rPr>
-        <w:t xml:space="preserve"> in </w:t>
-      </w:r>
-      <w:proofErr w:type="gramStart"/>
-      <w:r>
-        <w:rPr>
-          <w:rFonts w:ascii="Arial" w:hAnsi="Arial" w:cs="Arial"/>
-          <w:b/>
-          <w:bCs/>
-          <w:sz w:val="32"/>
-          <w:szCs w:val="32"/>
-          <w:highlight w:val="yellow"/>
-          <w:lang w:val="en-US"/>
-        </w:rPr>
-        <w:t xml:space="preserve">blue </w:t>
-      </w:r>
-      <w:r>
-        <w:rPr>
-          <w:rFonts w:ascii="Arial" w:hAnsi="Arial" w:cs="Arial"/>
-          <w:b/>
-          <w:bCs/>
-          <w:sz w:val="32"/>
-          <w:szCs w:val="32"/>
-          <w:highlight w:val="yellow"/>
-          <w:lang w:val="en-US"/>
-        </w:rPr>
-        <w:t>)</w:t>
-      </w:r>
-      <w:proofErr w:type="gramEnd"/>
-      <w:r>
-        <w:rPr>
-          <w:rFonts w:ascii="Arial" w:hAnsi="Arial" w:cs="Arial"/>
-          <w:b/>
-          <w:bCs/>
-          <w:sz w:val="32"/>
-          <w:szCs w:val="32"/>
-          <w:highlight w:val="yellow"/>
-          <w:lang w:val="en-US"/>
-        </w:rPr>
         <w:t xml:space="preserve"> </w:t>
       </w:r>
       <w:r>
@@ -12829,7 +12200,6 @@
         </w:rPr>
         <w:t xml:space="preserve"> </w:t>
       </w:r>
-      <w:proofErr w:type="gramStart"/>
       <w:r>
         <w:rPr>
           <w:rFonts w:ascii="BRH Devanagari Extra" w:eastAsiaTheme="minorHAnsi" w:hAnsi="BRH Devanagari Extra" w:cs="BRH Devanagari Extra"/>
@@ -12838,10 +12208,14 @@
           <w:szCs w:val="36"/>
           <w:lang w:eastAsia="en-US" w:bidi="hi-IN"/>
         </w:rPr>
-        <w:t>xrÉÉåýlÉÉ  |</w:t>
-      </w:r>
-      <w:proofErr w:type="gramEnd"/>
-      <w:r>
+        <w:t xml:space="preserve">xrÉÉåýlÉÉ  | qÉÉý | AÉ | </w:t>
+      </w:r>
+    </w:p>
+    <w:p>
+      <w:pPr>
+        <w:autoSpaceDE w:val="0"/>
+        <w:autoSpaceDN w:val="0"/>
+        <w:adjustRightInd w:val="0"/>
         <w:rPr>
           <w:rFonts w:ascii="BRH Devanagari Extra" w:eastAsiaTheme="minorHAnsi" w:hAnsi="BRH Devanagari Extra" w:cs="BRH Devanagari Extra"/>
           <w:color w:val="FF0000"/>
@@ -12849,7 +12223,16 @@
           <w:szCs w:val="36"/>
           <w:lang w:eastAsia="en-US" w:bidi="hi-IN"/>
         </w:rPr>
-        <w:t xml:space="preserve"> qÉÉý | AÉ | </w:t>
+      </w:pPr>
+      <w:r>
+        <w:rPr>
+          <w:rFonts w:ascii="BRH Devanagari Extra" w:eastAsiaTheme="minorHAnsi" w:hAnsi="BRH Devanagari Extra" w:cs="BRH Devanagari Extra"/>
+          <w:color w:val="FF0000"/>
+          <w:sz w:val="36"/>
+          <w:szCs w:val="36"/>
+          <w:lang w:eastAsia="en-US" w:bidi="hi-IN"/>
+        </w:rPr>
+        <w:t>xrÉÉåýlÉÉ qÉÉý qÉÉý xrÉÉåýlÉÉ xrÉÉåýlÉÉ qÉÉÅÅ qÉÉÿ xrÉÉåýlÉÉ xrÉÉåýlÉÉ qÉÉ |</w:t>
       </w:r>
     </w:p>
     <w:p>
@@ -12867,13 +12250,24 @@
       </w:pPr>
       <w:r>
         <w:rPr>
+          <w:rFonts w:ascii="Arial" w:eastAsiaTheme="minorHAnsi" w:hAnsi="Arial" w:cs="Arial"/>
+          <w:color w:val="FF0000"/>
+          <w:sz w:val="28"/>
+          <w:szCs w:val="28"/>
+          <w:lang w:eastAsia="en-US" w:bidi="hi-IN"/>
+        </w:rPr>
+        <w:lastRenderedPageBreak/>
+        <w:t>(7.1.7.3(40)-</w:t>
+      </w:r>
+      <w:r>
+        <w:rPr>
           <w:rFonts w:ascii="BRH Devanagari Extra" w:eastAsiaTheme="minorHAnsi" w:hAnsi="BRH Devanagari Extra" w:cs="BRH Devanagari Extra"/>
           <w:color w:val="FF0000"/>
           <w:sz w:val="36"/>
           <w:szCs w:val="36"/>
           <w:lang w:eastAsia="en-US" w:bidi="hi-IN"/>
         </w:rPr>
-        <w:t>xrÉÉåýlÉÉ qÉÉý qÉÉý xrÉÉåýlÉÉ xrÉÉåýlÉÉ qÉÉÅÅ qÉÉÿ xrÉÉåýlÉÉ xrÉÉåýlÉÉ qÉÉ |</w:t>
+        <w:t xml:space="preserve">  qÉÉý | AÉ | ÌuÉýzÉý | </w:t>
       </w:r>
     </w:p>
     <w:p>
@@ -12891,16 +12285,98 @@
       </w:pPr>
       <w:r>
         <w:rPr>
+          <w:rFonts w:ascii="BRH Devanagari Extra" w:eastAsiaTheme="minorHAnsi" w:hAnsi="BRH Devanagari Extra" w:cs="BRH Devanagari Extra"/>
+          <w:color w:val="FF0000"/>
+          <w:sz w:val="36"/>
+          <w:szCs w:val="36"/>
+          <w:lang w:eastAsia="en-US" w:bidi="hi-IN"/>
+        </w:rPr>
+        <w:t>qÉÉÅÅ qÉÉý qÉÉÅÅ ÌuÉþzÉ ÌuÉýzÉÉ qÉÉý qÉÉÅÅ ÌuÉþzÉ |</w:t>
+      </w:r>
+    </w:p>
+    <w:p>
+      <w:pPr>
+        <w:autoSpaceDE w:val="0"/>
+        <w:autoSpaceDN w:val="0"/>
+        <w:adjustRightInd w:val="0"/>
+        <w:rPr>
+          <w:rFonts w:ascii="BRH Devanagari Extra" w:eastAsiaTheme="minorHAnsi" w:hAnsi="BRH Devanagari Extra" w:cs="BRH Devanagari Extra"/>
+          <w:color w:val="FF0000"/>
+          <w:sz w:val="36"/>
+          <w:szCs w:val="36"/>
+          <w:lang w:eastAsia="en-US" w:bidi="hi-IN"/>
+        </w:rPr>
+      </w:pPr>
+      <w:r>
+        <w:rPr>
           <w:rFonts w:ascii="Arial" w:eastAsiaTheme="minorHAnsi" w:hAnsi="Arial" w:cs="Arial"/>
           <w:color w:val="FF0000"/>
           <w:sz w:val="28"/>
           <w:szCs w:val="28"/>
           <w:lang w:eastAsia="en-US" w:bidi="hi-IN"/>
         </w:rPr>
-        <w:lastRenderedPageBreak/>
-        <w:t>(7.1.7.3(40)</w:t>
-      </w:r>
-      <w:proofErr w:type="gramStart"/>
+        <w:t>7.1.7.3(41)-</w:t>
+      </w:r>
+      <w:r>
+        <w:rPr>
+          <w:rFonts w:ascii="BRH Devanagari Extra" w:eastAsiaTheme="minorHAnsi" w:hAnsi="BRH Devanagari Extra" w:cs="BRH Devanagari Extra"/>
+          <w:color w:val="FF0000"/>
+          <w:sz w:val="36"/>
+          <w:szCs w:val="36"/>
+          <w:lang w:eastAsia="en-US" w:bidi="hi-IN"/>
+        </w:rPr>
+        <w:t xml:space="preserve">  AÉ | ÌuÉýzÉý | xÉÑýwÉSÉÿ | </w:t>
+      </w:r>
+    </w:p>
+    <w:p>
+      <w:pPr>
+        <w:autoSpaceDE w:val="0"/>
+        <w:autoSpaceDN w:val="0"/>
+        <w:adjustRightInd w:val="0"/>
+        <w:rPr>
+          <w:rFonts w:ascii="BRH Devanagari Extra" w:eastAsiaTheme="minorHAnsi" w:hAnsi="BRH Devanagari Extra" w:cs="BRH Devanagari Extra"/>
+          <w:color w:val="FF0000"/>
+          <w:sz w:val="36"/>
+          <w:szCs w:val="36"/>
+          <w:lang w:eastAsia="en-US" w:bidi="hi-IN"/>
+        </w:rPr>
+      </w:pPr>
+      <w:r>
+        <w:rPr>
+          <w:rFonts w:ascii="BRH Devanagari Extra" w:eastAsiaTheme="minorHAnsi" w:hAnsi="BRH Devanagari Extra" w:cs="BRH Devanagari Extra"/>
+          <w:color w:val="FF0000"/>
+          <w:sz w:val="36"/>
+          <w:szCs w:val="36"/>
+          <w:lang w:eastAsia="en-US" w:bidi="hi-IN"/>
+        </w:rPr>
+        <w:t xml:space="preserve">AÉ ÌuÉþzÉ ÌuÉýzÉÉ ÌuÉþzÉ xÉÑýwÉSÉþ xÉÑýwÉSÉþ ÌuÉýzÉÉ ÌuÉþzÉ xÉÑýwÉSÉÿ | </w:t>
+      </w:r>
+    </w:p>
+    <w:p>
+      <w:pPr>
+        <w:pStyle w:val="NoSpacing"/>
+        <w:rPr>
+          <w:rFonts w:eastAsiaTheme="minorHAnsi"/>
+          <w:color w:val="FF0000"/>
+          <w:sz w:val="20"/>
+          <w:szCs w:val="20"/>
+          <w:lang w:eastAsia="en-US" w:bidi="hi-IN"/>
+        </w:rPr>
+      </w:pPr>
+    </w:p>
+    <w:p>
+      <w:pPr>
+        <w:autoSpaceDE w:val="0"/>
+        <w:autoSpaceDN w:val="0"/>
+        <w:adjustRightInd w:val="0"/>
+        <w:rPr>
+          <w:rFonts w:ascii="BRH Devanagari Extra" w:eastAsiaTheme="minorHAnsi" w:hAnsi="BRH Devanagari Extra" w:cs="BRH Devanagari Extra"/>
+          <w:color w:val="FF0000"/>
+          <w:sz w:val="36"/>
+          <w:szCs w:val="36"/>
+          <w:lang w:eastAsia="en-US" w:bidi="hi-IN"/>
+        </w:rPr>
+      </w:pPr>
       <w:r>
         <w:rPr>
           <w:rFonts w:ascii="Arial" w:eastAsiaTheme="minorHAnsi" w:hAnsi="Arial" w:cs="Arial"/>
@@ -12909,7 +12385,7 @@
           <w:szCs w:val="28"/>
           <w:lang w:eastAsia="en-US" w:bidi="hi-IN"/>
         </w:rPr>
-        <w:t>-</w:t>
+        <w:t>7.1.7.3(42)-</w:t>
       </w:r>
       <w:r>
         <w:rPr>
@@ -12919,190 +12395,7 @@
           <w:szCs w:val="36"/>
           <w:lang w:eastAsia="en-US" w:bidi="hi-IN"/>
         </w:rPr>
-        <w:t xml:space="preserve">  qÉÉý</w:t>
-      </w:r>
-      <w:proofErr w:type="gramEnd"/>
-      <w:r>
-        <w:rPr>
-          <w:rFonts w:ascii="BRH Devanagari Extra" w:eastAsiaTheme="minorHAnsi" w:hAnsi="BRH Devanagari Extra" w:cs="BRH Devanagari Extra"/>
-          <w:color w:val="FF0000"/>
-          <w:sz w:val="36"/>
-          <w:szCs w:val="36"/>
-          <w:lang w:eastAsia="en-US" w:bidi="hi-IN"/>
-        </w:rPr>
-        <w:t xml:space="preserve"> | AÉ | ÌuÉýzÉý | </w:t>
-      </w:r>
-    </w:p>
-    <w:p>
-      <w:pPr>
-        <w:autoSpaceDE w:val="0"/>
-        <w:autoSpaceDN w:val="0"/>
-        <w:adjustRightInd w:val="0"/>
-        <w:rPr>
-          <w:rFonts w:ascii="BRH Devanagari Extra" w:eastAsiaTheme="minorHAnsi" w:hAnsi="BRH Devanagari Extra" w:cs="BRH Devanagari Extra"/>
-          <w:color w:val="FF0000"/>
-          <w:sz w:val="36"/>
-          <w:szCs w:val="36"/>
-          <w:lang w:eastAsia="en-US" w:bidi="hi-IN"/>
-        </w:rPr>
-      </w:pPr>
-      <w:r>
-        <w:rPr>
-          <w:rFonts w:ascii="BRH Devanagari Extra" w:eastAsiaTheme="minorHAnsi" w:hAnsi="BRH Devanagari Extra" w:cs="BRH Devanagari Extra"/>
-          <w:color w:val="FF0000"/>
-          <w:sz w:val="36"/>
-          <w:szCs w:val="36"/>
-          <w:lang w:eastAsia="en-US" w:bidi="hi-IN"/>
-        </w:rPr>
-        <w:t>qÉÉÅÅ qÉÉý qÉÉÅÅ ÌuÉþzÉ ÌuÉýzÉÉ qÉÉý qÉÉÅÅ ÌuÉþzÉ |</w:t>
-      </w:r>
-    </w:p>
-    <w:p>
-      <w:pPr>
-        <w:autoSpaceDE w:val="0"/>
-        <w:autoSpaceDN w:val="0"/>
-        <w:adjustRightInd w:val="0"/>
-        <w:rPr>
-          <w:rFonts w:ascii="BRH Devanagari Extra" w:eastAsiaTheme="minorHAnsi" w:hAnsi="BRH Devanagari Extra" w:cs="BRH Devanagari Extra"/>
-          <w:color w:val="FF0000"/>
-          <w:sz w:val="36"/>
-          <w:szCs w:val="36"/>
-          <w:lang w:eastAsia="en-US" w:bidi="hi-IN"/>
-        </w:rPr>
-      </w:pPr>
-      <w:r>
-        <w:rPr>
-          <w:rFonts w:ascii="Arial" w:eastAsiaTheme="minorHAnsi" w:hAnsi="Arial" w:cs="Arial"/>
-          <w:color w:val="FF0000"/>
-          <w:sz w:val="28"/>
-          <w:szCs w:val="28"/>
-          <w:lang w:eastAsia="en-US" w:bidi="hi-IN"/>
-        </w:rPr>
-        <w:t>7.1.7.3(41)</w:t>
-      </w:r>
-      <w:proofErr w:type="gramStart"/>
-      <w:r>
-        <w:rPr>
-          <w:rFonts w:ascii="Arial" w:eastAsiaTheme="minorHAnsi" w:hAnsi="Arial" w:cs="Arial"/>
-          <w:color w:val="FF0000"/>
-          <w:sz w:val="28"/>
-          <w:szCs w:val="28"/>
-          <w:lang w:eastAsia="en-US" w:bidi="hi-IN"/>
-        </w:rPr>
-        <w:t>-</w:t>
-      </w:r>
-      <w:r>
-        <w:rPr>
-          <w:rFonts w:ascii="BRH Devanagari Extra" w:eastAsiaTheme="minorHAnsi" w:hAnsi="BRH Devanagari Extra" w:cs="BRH Devanagari Extra"/>
-          <w:color w:val="FF0000"/>
-          <w:sz w:val="36"/>
-          <w:szCs w:val="36"/>
-          <w:lang w:eastAsia="en-US" w:bidi="hi-IN"/>
-        </w:rPr>
-        <w:t xml:space="preserve">  AÉ</w:t>
-      </w:r>
-      <w:proofErr w:type="gramEnd"/>
-      <w:r>
-        <w:rPr>
-          <w:rFonts w:ascii="BRH Devanagari Extra" w:eastAsiaTheme="minorHAnsi" w:hAnsi="BRH Devanagari Extra" w:cs="BRH Devanagari Extra"/>
-          <w:color w:val="FF0000"/>
-          <w:sz w:val="36"/>
-          <w:szCs w:val="36"/>
-          <w:lang w:eastAsia="en-US" w:bidi="hi-IN"/>
-        </w:rPr>
-        <w:t xml:space="preserve"> | ÌuÉýzÉý | xÉÑýwÉSÉÿ | </w:t>
-      </w:r>
-    </w:p>
-    <w:p>
-      <w:pPr>
-        <w:autoSpaceDE w:val="0"/>
-        <w:autoSpaceDN w:val="0"/>
-        <w:adjustRightInd w:val="0"/>
-        <w:rPr>
-          <w:rFonts w:ascii="BRH Devanagari Extra" w:eastAsiaTheme="minorHAnsi" w:hAnsi="BRH Devanagari Extra" w:cs="BRH Devanagari Extra"/>
-          <w:color w:val="FF0000"/>
-          <w:sz w:val="36"/>
-          <w:szCs w:val="36"/>
-          <w:lang w:eastAsia="en-US" w:bidi="hi-IN"/>
-        </w:rPr>
-      </w:pPr>
-      <w:r>
-        <w:rPr>
-          <w:rFonts w:ascii="BRH Devanagari Extra" w:eastAsiaTheme="minorHAnsi" w:hAnsi="BRH Devanagari Extra" w:cs="BRH Devanagari Extra"/>
-          <w:color w:val="FF0000"/>
-          <w:sz w:val="36"/>
-          <w:szCs w:val="36"/>
-          <w:lang w:eastAsia="en-US" w:bidi="hi-IN"/>
-        </w:rPr>
-        <w:t xml:space="preserve">AÉ ÌuÉþzÉ ÌuÉýzÉÉ ÌuÉþzÉ xÉÑýwÉSÉþ xÉÑýwÉSÉþ ÌuÉýzÉÉ ÌuÉþzÉ xÉÑýwÉSÉÿ | </w:t>
-      </w:r>
-    </w:p>
-    <w:p>
-      <w:pPr>
-        <w:pStyle w:val="NoSpacing"/>
-        <w:rPr>
-          <w:rFonts w:eastAsiaTheme="minorHAnsi"/>
-          <w:color w:val="FF0000"/>
-          <w:sz w:val="20"/>
-          <w:szCs w:val="20"/>
-          <w:lang w:eastAsia="en-US" w:bidi="hi-IN"/>
-        </w:rPr>
-      </w:pPr>
-    </w:p>
-    <w:p>
-      <w:pPr>
-        <w:autoSpaceDE w:val="0"/>
-        <w:autoSpaceDN w:val="0"/>
-        <w:adjustRightInd w:val="0"/>
-        <w:rPr>
-          <w:rFonts w:ascii="BRH Devanagari Extra" w:eastAsiaTheme="minorHAnsi" w:hAnsi="BRH Devanagari Extra" w:cs="BRH Devanagari Extra"/>
-          <w:color w:val="FF0000"/>
-          <w:sz w:val="36"/>
-          <w:szCs w:val="36"/>
-          <w:lang w:eastAsia="en-US" w:bidi="hi-IN"/>
-        </w:rPr>
-      </w:pPr>
-      <w:r>
-        <w:rPr>
-          <w:rFonts w:ascii="Arial" w:eastAsiaTheme="minorHAnsi" w:hAnsi="Arial" w:cs="Arial"/>
-          <w:color w:val="FF0000"/>
-          <w:sz w:val="28"/>
-          <w:szCs w:val="28"/>
-          <w:lang w:eastAsia="en-US" w:bidi="hi-IN"/>
-        </w:rPr>
-        <w:t>7.1.7.3(42)</w:t>
-      </w:r>
-      <w:proofErr w:type="gramStart"/>
-      <w:r>
-        <w:rPr>
-          <w:rFonts w:ascii="Arial" w:eastAsiaTheme="minorHAnsi" w:hAnsi="Arial" w:cs="Arial"/>
-          <w:color w:val="FF0000"/>
-          <w:sz w:val="28"/>
-          <w:szCs w:val="28"/>
-          <w:lang w:eastAsia="en-US" w:bidi="hi-IN"/>
-        </w:rPr>
-        <w:t>-</w:t>
-      </w:r>
-      <w:r>
-        <w:rPr>
-          <w:rFonts w:ascii="BRH Devanagari Extra" w:eastAsiaTheme="minorHAnsi" w:hAnsi="BRH Devanagari Extra" w:cs="BRH Devanagari Extra"/>
-          <w:color w:val="FF0000"/>
-          <w:sz w:val="36"/>
-          <w:szCs w:val="36"/>
-          <w:lang w:eastAsia="en-US" w:bidi="hi-IN"/>
-        </w:rPr>
-        <w:t xml:space="preserve">  ÌuÉýzÉý</w:t>
-      </w:r>
-      <w:proofErr w:type="gramEnd"/>
-      <w:r>
-        <w:rPr>
-          <w:rFonts w:ascii="BRH Devanagari Extra" w:eastAsiaTheme="minorHAnsi" w:hAnsi="BRH Devanagari Extra" w:cs="BRH Devanagari Extra"/>
-          <w:color w:val="FF0000"/>
-          <w:sz w:val="36"/>
-          <w:szCs w:val="36"/>
-          <w:lang w:eastAsia="en-US" w:bidi="hi-IN"/>
-        </w:rPr>
-        <w:t xml:space="preserve"> | xÉÑýwÉSÉÿ | qÉÉý |</w:t>
+        <w:t xml:space="preserve">  ÌuÉýzÉý | xÉÑýwÉSÉÿ | qÉÉý |</w:t>
       </w:r>
     </w:p>
     <w:p>
@@ -13163,9 +12456,68 @@
           <w:szCs w:val="28"/>
           <w:lang w:eastAsia="en-US" w:bidi="hi-IN"/>
         </w:rPr>
-        <w:t>7.1.7.3(43)</w:t>
-      </w:r>
-      <w:proofErr w:type="gramStart"/>
+        <w:t>7.1.7.3(43)-</w:t>
+      </w:r>
+      <w:r>
+        <w:rPr>
+          <w:rFonts w:ascii="BRH Devanagari Extra" w:eastAsiaTheme="minorHAnsi" w:hAnsi="BRH Devanagari Extra" w:cs="BRH Devanagari Extra"/>
+          <w:color w:val="FF0000"/>
+          <w:sz w:val="36"/>
+          <w:szCs w:val="36"/>
+          <w:lang w:eastAsia="en-US" w:bidi="hi-IN"/>
+        </w:rPr>
+        <w:t xml:space="preserve">  xÉÑýwÉSÉÿ | qÉÉý | AÉ | </w:t>
+      </w:r>
+    </w:p>
+    <w:p>
+      <w:pPr>
+        <w:autoSpaceDE w:val="0"/>
+        <w:autoSpaceDN w:val="0"/>
+        <w:adjustRightInd w:val="0"/>
+        <w:rPr>
+          <w:rFonts w:ascii="BRH Devanagari Extra" w:eastAsiaTheme="minorHAnsi" w:hAnsi="BRH Devanagari Extra" w:cs="BRH Devanagari Extra"/>
+          <w:color w:val="FF0000"/>
+          <w:sz w:val="36"/>
+          <w:szCs w:val="36"/>
+          <w:lang w:eastAsia="en-US" w:bidi="hi-IN"/>
+        </w:rPr>
+      </w:pPr>
+      <w:r>
+        <w:rPr>
+          <w:rFonts w:ascii="BRH Devanagari Extra" w:eastAsiaTheme="minorHAnsi" w:hAnsi="BRH Devanagari Extra" w:cs="BRH Devanagari Extra"/>
+          <w:color w:val="FF0000"/>
+          <w:sz w:val="36"/>
+          <w:szCs w:val="36"/>
+          <w:lang w:eastAsia="en-US" w:bidi="hi-IN"/>
+        </w:rPr>
+        <w:t>xÉÑýwÉSÉþ qÉÉ qÉÉ xÉÑýwÉSÉþ xÉÑýwÉSÉý qÉÉÅÅ qÉÉþ xÉÑýwÉSÉþ xÉÑýwÉSÉý qÉÉ |</w:t>
+      </w:r>
+    </w:p>
+    <w:p>
+      <w:pPr>
+        <w:pStyle w:val="NoSpacing"/>
+        <w:rPr>
+          <w:rFonts w:eastAsiaTheme="minorHAnsi"/>
+          <w:color w:val="FF0000"/>
+          <w:sz w:val="20"/>
+          <w:szCs w:val="20"/>
+          <w:lang w:eastAsia="en-US" w:bidi="hi-IN"/>
+        </w:rPr>
+      </w:pPr>
+    </w:p>
+    <w:p>
+      <w:pPr>
+        <w:autoSpaceDE w:val="0"/>
+        <w:autoSpaceDN w:val="0"/>
+        <w:adjustRightInd w:val="0"/>
+        <w:rPr>
+          <w:rFonts w:ascii="BRH Devanagari Extra" w:eastAsiaTheme="minorHAnsi" w:hAnsi="BRH Devanagari Extra" w:cs="BRH Devanagari Extra"/>
+          <w:color w:val="FF0000"/>
+          <w:sz w:val="36"/>
+          <w:szCs w:val="36"/>
+          <w:lang w:eastAsia="en-US" w:bidi="hi-IN"/>
+        </w:rPr>
+      </w:pPr>
       <w:r>
         <w:rPr>
           <w:rFonts w:ascii="Arial" w:eastAsiaTheme="minorHAnsi" w:hAnsi="Arial" w:cs="Arial"/>
@@ -13174,7 +12526,7 @@
           <w:szCs w:val="28"/>
           <w:lang w:eastAsia="en-US" w:bidi="hi-IN"/>
         </w:rPr>
-        <w:t>-</w:t>
+        <w:t>7.1.7.3(44)-</w:t>
       </w:r>
       <w:r>
         <w:rPr>
@@ -13184,10 +12536,14 @@
           <w:szCs w:val="36"/>
           <w:lang w:eastAsia="en-US" w:bidi="hi-IN"/>
         </w:rPr>
-        <w:t xml:space="preserve">  xÉÑýwÉSÉÿ</w:t>
-      </w:r>
-      <w:proofErr w:type="gramEnd"/>
-      <w:r>
+        <w:t xml:space="preserve">  qÉÉý | AÉ | ÌuÉýzÉý |  </w:t>
+      </w:r>
+    </w:p>
+    <w:p>
+      <w:pPr>
+        <w:autoSpaceDE w:val="0"/>
+        <w:autoSpaceDN w:val="0"/>
+        <w:adjustRightInd w:val="0"/>
         <w:rPr>
           <w:rFonts w:ascii="BRH Devanagari Extra" w:eastAsiaTheme="minorHAnsi" w:hAnsi="BRH Devanagari Extra" w:cs="BRH Devanagari Extra"/>
           <w:color w:val="FF0000"/>
@@ -13195,8 +12551,29 @@
           <w:szCs w:val="36"/>
           <w:lang w:eastAsia="en-US" w:bidi="hi-IN"/>
         </w:rPr>
-        <w:t xml:space="preserve"> | qÉÉý | AÉ | </w:t>
-      </w:r>
+      </w:pPr>
+      <w:r>
+        <w:rPr>
+          <w:rFonts w:ascii="BRH Devanagari Extra" w:eastAsiaTheme="minorHAnsi" w:hAnsi="BRH Devanagari Extra" w:cs="BRH Devanagari Extra"/>
+          <w:color w:val="FF0000"/>
+          <w:sz w:val="36"/>
+          <w:szCs w:val="36"/>
+          <w:lang w:eastAsia="en-US" w:bidi="hi-IN"/>
+        </w:rPr>
+        <w:t>qÉÉÅÅ qÉÉý qÉÉÅÅ ÌuÉþzÉ ÌuÉýzÉÉ qÉÉý qÉÉÅÅ ÌuÉþzÉ |</w:t>
+      </w:r>
+    </w:p>
+    <w:p>
+      <w:pPr>
+        <w:pStyle w:val="NoSpacing"/>
+        <w:rPr>
+          <w:rFonts w:eastAsiaTheme="minorHAnsi"/>
+          <w:color w:val="FF0000"/>
+          <w:sz w:val="20"/>
+          <w:szCs w:val="20"/>
+          <w:lang w:eastAsia="en-US" w:bidi="hi-IN"/>
+        </w:rPr>
+      </w:pPr>
     </w:p>
     <w:p>
       <w:pPr>
@@ -13213,13 +12590,47 @@
       </w:pPr>
       <w:r>
         <w:rPr>
+          <w:rFonts w:ascii="Arial" w:eastAsiaTheme="minorHAnsi" w:hAnsi="Arial" w:cs="Arial"/>
+          <w:color w:val="FF0000"/>
+          <w:sz w:val="28"/>
+          <w:szCs w:val="28"/>
+          <w:lang w:eastAsia="en-US" w:bidi="hi-IN"/>
+        </w:rPr>
+        <w:t>7.1.7.3(45)-</w:t>
+      </w:r>
+      <w:r>
+        <w:rPr>
           <w:rFonts w:ascii="BRH Devanagari Extra" w:eastAsiaTheme="minorHAnsi" w:hAnsi="BRH Devanagari Extra" w:cs="BRH Devanagari Extra"/>
           <w:color w:val="FF0000"/>
           <w:sz w:val="36"/>
           <w:szCs w:val="36"/>
           <w:lang w:eastAsia="en-US" w:bidi="hi-IN"/>
         </w:rPr>
-        <w:t>xÉÑýwÉSÉþ qÉÉ qÉÉ xÉÑýwÉSÉþ xÉÑýwÉSÉý qÉÉÅÅ qÉÉþ xÉÑýwÉSÉþ xÉÑýwÉSÉý qÉÉ |</w:t>
+        <w:t xml:space="preserve">  AÉ | ÌuÉýzÉý | xÉÑýzÉåuÉÉÿ | </w:t>
+      </w:r>
+    </w:p>
+    <w:p>
+      <w:pPr>
+        <w:autoSpaceDE w:val="0"/>
+        <w:autoSpaceDN w:val="0"/>
+        <w:adjustRightInd w:val="0"/>
+        <w:rPr>
+          <w:rFonts w:ascii="BRH Devanagari Extra" w:eastAsiaTheme="minorHAnsi" w:hAnsi="BRH Devanagari Extra" w:cs="BRH Devanagari Extra"/>
+          <w:color w:val="FF0000"/>
+          <w:sz w:val="36"/>
+          <w:szCs w:val="36"/>
+          <w:lang w:eastAsia="en-US" w:bidi="hi-IN"/>
+        </w:rPr>
+      </w:pPr>
+      <w:r>
+        <w:rPr>
+          <w:rFonts w:ascii="BRH Devanagari Extra" w:eastAsiaTheme="minorHAnsi" w:hAnsi="BRH Devanagari Extra" w:cs="BRH Devanagari Extra"/>
+          <w:color w:val="FF0000"/>
+          <w:sz w:val="36"/>
+          <w:szCs w:val="36"/>
+          <w:lang w:eastAsia="en-US" w:bidi="hi-IN"/>
+        </w:rPr>
+        <w:t xml:space="preserve">AÉ ÌuÉþzÉ ÌuÉýzÉÉ ÌuÉþzÉ xÉÑýzÉåuÉÉþ xÉÑýzÉåuÉÉþ ÌuÉýzÉÉ ÌuÉþzÉ xÉÑýzÉåuÉÉÿ | </w:t>
       </w:r>
     </w:p>
     <w:p>
@@ -13255,9 +12666,68 @@
           <w:szCs w:val="28"/>
           <w:lang w:eastAsia="en-US" w:bidi="hi-IN"/>
         </w:rPr>
-        <w:t>7.1.7.3(44)</w:t>
-      </w:r>
-      <w:proofErr w:type="gramStart"/>
+        <w:t>7.1.7.3(46)-</w:t>
+      </w:r>
+      <w:r>
+        <w:rPr>
+          <w:rFonts w:ascii="BRH Devanagari Extra" w:eastAsiaTheme="minorHAnsi" w:hAnsi="BRH Devanagari Extra" w:cs="BRH Devanagari Extra"/>
+          <w:color w:val="FF0000"/>
+          <w:sz w:val="36"/>
+          <w:szCs w:val="36"/>
+          <w:lang w:eastAsia="en-US" w:bidi="hi-IN"/>
+        </w:rPr>
+        <w:t xml:space="preserve">  ÌuÉýzÉý | xÉÑýzÉåuÉÉÿ | qÉÉý | </w:t>
+      </w:r>
+    </w:p>
+    <w:p>
+      <w:pPr>
+        <w:autoSpaceDE w:val="0"/>
+        <w:autoSpaceDN w:val="0"/>
+        <w:adjustRightInd w:val="0"/>
+        <w:rPr>
+          <w:rFonts w:ascii="BRH Devanagari Extra" w:eastAsiaTheme="minorHAnsi" w:hAnsi="BRH Devanagari Extra" w:cs="BRH Devanagari Extra"/>
+          <w:color w:val="FF0000"/>
+          <w:sz w:val="36"/>
+          <w:szCs w:val="36"/>
+          <w:lang w:eastAsia="en-US" w:bidi="hi-IN"/>
+        </w:rPr>
+      </w:pPr>
+      <w:r>
+        <w:rPr>
+          <w:rFonts w:ascii="BRH Devanagari Extra" w:eastAsiaTheme="minorHAnsi" w:hAnsi="BRH Devanagari Extra" w:cs="BRH Devanagari Extra"/>
+          <w:color w:val="FF0000"/>
+          <w:sz w:val="36"/>
+          <w:szCs w:val="36"/>
+          <w:lang w:eastAsia="en-US" w:bidi="hi-IN"/>
+        </w:rPr>
+        <w:t xml:space="preserve">ÌuÉýzÉý xÉÑýzÉåuÉÉþ xÉÑýzÉåuÉÉþ ÌuÉzÉ ÌuÉzÉ xÉÑýzÉåuÉÉþ qÉÉ qÉÉ xÉÑýzÉåuÉÉþ ÌuÉzÉ ÌuÉzÉ xÉÑýzÉåuÉÉþ qÉÉ | </w:t>
+      </w:r>
+    </w:p>
+    <w:p>
+      <w:pPr>
+        <w:pStyle w:val="NoSpacing"/>
+        <w:rPr>
+          <w:rFonts w:eastAsiaTheme="minorHAnsi"/>
+          <w:color w:val="FF0000"/>
+          <w:sz w:val="20"/>
+          <w:szCs w:val="20"/>
+          <w:lang w:eastAsia="en-US" w:bidi="hi-IN"/>
+        </w:rPr>
+      </w:pPr>
+    </w:p>
+    <w:p>
+      <w:pPr>
+        <w:autoSpaceDE w:val="0"/>
+        <w:autoSpaceDN w:val="0"/>
+        <w:adjustRightInd w:val="0"/>
+        <w:rPr>
+          <w:rFonts w:ascii="BRH Devanagari Extra" w:eastAsiaTheme="minorHAnsi" w:hAnsi="BRH Devanagari Extra" w:cs="BRH Devanagari Extra"/>
+          <w:color w:val="FF0000"/>
+          <w:sz w:val="36"/>
+          <w:szCs w:val="36"/>
+          <w:lang w:eastAsia="en-US" w:bidi="hi-IN"/>
+        </w:rPr>
+      </w:pPr>
       <w:r>
         <w:rPr>
           <w:rFonts w:ascii="Arial" w:eastAsiaTheme="minorHAnsi" w:hAnsi="Arial" w:cs="Arial"/>
@@ -13266,7 +12736,7 @@
           <w:szCs w:val="28"/>
           <w:lang w:eastAsia="en-US" w:bidi="hi-IN"/>
         </w:rPr>
-        <w:t>-</w:t>
+        <w:t>7.1.7.3(47)-</w:t>
       </w:r>
       <w:r>
         <w:rPr>
@@ -13276,10 +12746,14 @@
           <w:szCs w:val="36"/>
           <w:lang w:eastAsia="en-US" w:bidi="hi-IN"/>
         </w:rPr>
-        <w:t xml:space="preserve">  qÉÉý</w:t>
-      </w:r>
-      <w:proofErr w:type="gramEnd"/>
-      <w:r>
+        <w:t xml:space="preserve">  xÉÑýzÉåuÉÉÿ | qÉÉý | AÉ | </w:t>
+      </w:r>
+    </w:p>
+    <w:p>
+      <w:pPr>
+        <w:autoSpaceDE w:val="0"/>
+        <w:autoSpaceDN w:val="0"/>
+        <w:adjustRightInd w:val="0"/>
         <w:rPr>
           <w:rFonts w:ascii="BRH Devanagari Extra" w:eastAsiaTheme="minorHAnsi" w:hAnsi="BRH Devanagari Extra" w:cs="BRH Devanagari Extra"/>
           <w:color w:val="FF0000"/>
@@ -13287,8 +12761,29 @@
           <w:szCs w:val="36"/>
           <w:lang w:eastAsia="en-US" w:bidi="hi-IN"/>
         </w:rPr>
-        <w:t xml:space="preserve"> | AÉ | ÌuÉýzÉý |  </w:t>
-      </w:r>
+      </w:pPr>
+      <w:r>
+        <w:rPr>
+          <w:rFonts w:ascii="BRH Devanagari Extra" w:eastAsiaTheme="minorHAnsi" w:hAnsi="BRH Devanagari Extra" w:cs="BRH Devanagari Extra"/>
+          <w:color w:val="FF0000"/>
+          <w:sz w:val="36"/>
+          <w:szCs w:val="36"/>
+          <w:lang w:eastAsia="en-US" w:bidi="hi-IN"/>
+        </w:rPr>
+        <w:t>xÉÑýzÉåuÉÉþ qÉÉ qÉÉ xÉÑýzÉåuÉÉþ xÉÑýzÉåuÉÉý qÉÉÅÅ qÉÉþ xÉÑýzÉåuÉÉþ xÉÑýzÉåuÉÉý qÉÉ |</w:t>
+      </w:r>
+    </w:p>
+    <w:p>
+      <w:pPr>
+        <w:pStyle w:val="NoSpacing"/>
+        <w:rPr>
+          <w:rFonts w:eastAsiaTheme="minorHAnsi"/>
+          <w:color w:val="FF0000"/>
+          <w:sz w:val="20"/>
+          <w:szCs w:val="20"/>
+          <w:lang w:eastAsia="en-US" w:bidi="hi-IN"/>
+        </w:rPr>
+      </w:pPr>
     </w:p>
     <w:p>
       <w:pPr>
@@ -13305,12 +12800,47 @@
       </w:pPr>
       <w:r>
         <w:rPr>
+          <w:rFonts w:ascii="Arial" w:eastAsiaTheme="minorHAnsi" w:hAnsi="Arial" w:cs="Arial"/>
+          <w:color w:val="FF0000"/>
+          <w:sz w:val="28"/>
+          <w:szCs w:val="28"/>
+          <w:lang w:eastAsia="en-US" w:bidi="hi-IN"/>
+        </w:rPr>
+        <w:lastRenderedPageBreak/>
+        <w:t>7.1.7.3(48)-</w:t>
+      </w:r>
+      <w:r>
+        <w:rPr>
           <w:rFonts w:ascii="BRH Devanagari Extra" w:eastAsiaTheme="minorHAnsi" w:hAnsi="BRH Devanagari Extra" w:cs="BRH Devanagari Extra"/>
           <w:color w:val="FF0000"/>
           <w:sz w:val="36"/>
           <w:szCs w:val="36"/>
           <w:lang w:eastAsia="en-US" w:bidi="hi-IN"/>
         </w:rPr>
+        <w:t xml:space="preserve">  qÉÉý | AÉ | ÌuÉýzÉý | </w:t>
+      </w:r>
+    </w:p>
+    <w:p>
+      <w:pPr>
+        <w:autoSpaceDE w:val="0"/>
+        <w:autoSpaceDN w:val="0"/>
+        <w:adjustRightInd w:val="0"/>
+        <w:rPr>
+          <w:rFonts w:ascii="BRH Devanagari Extra" w:eastAsiaTheme="minorHAnsi" w:hAnsi="BRH Devanagari Extra" w:cs="BRH Devanagari Extra"/>
+          <w:color w:val="FF0000"/>
+          <w:sz w:val="36"/>
+          <w:szCs w:val="36"/>
+          <w:lang w:eastAsia="en-US" w:bidi="hi-IN"/>
+        </w:rPr>
+      </w:pPr>
+      <w:r>
+        <w:rPr>
+          <w:rFonts w:ascii="BRH Devanagari Extra" w:eastAsiaTheme="minorHAnsi" w:hAnsi="BRH Devanagari Extra" w:cs="BRH Devanagari Extra"/>
+          <w:color w:val="FF0000"/>
+          <w:sz w:val="36"/>
+          <w:szCs w:val="36"/>
+          <w:lang w:eastAsia="en-US" w:bidi="hi-IN"/>
+        </w:rPr>
         <w:t>qÉÉÅÅ qÉÉý qÉÉÅÅ ÌuÉþzÉ ÌuÉýzÉÉ qÉÉý qÉÉÅÅ ÌuÉþzÉ |</w:t>
       </w:r>
     </w:p>
@@ -13347,9 +12877,68 @@
           <w:szCs w:val="28"/>
           <w:lang w:eastAsia="en-US" w:bidi="hi-IN"/>
         </w:rPr>
-        <w:t>7.1.7.3(45)</w:t>
-      </w:r>
-      <w:proofErr w:type="gramStart"/>
+        <w:t>7.1.7.3(49)-</w:t>
+      </w:r>
+      <w:r>
+        <w:rPr>
+          <w:rFonts w:ascii="BRH Devanagari Extra" w:eastAsiaTheme="minorHAnsi" w:hAnsi="BRH Devanagari Extra" w:cs="BRH Devanagari Extra"/>
+          <w:color w:val="FF0000"/>
+          <w:sz w:val="36"/>
+          <w:szCs w:val="36"/>
+          <w:lang w:eastAsia="en-US" w:bidi="hi-IN"/>
+        </w:rPr>
+        <w:t xml:space="preserve">  AÉ | ÌuÉýzÉý | CÌiÉþ | </w:t>
+      </w:r>
+    </w:p>
+    <w:p>
+      <w:pPr>
+        <w:autoSpaceDE w:val="0"/>
+        <w:autoSpaceDN w:val="0"/>
+        <w:adjustRightInd w:val="0"/>
+        <w:rPr>
+          <w:rFonts w:ascii="BRH Devanagari Extra" w:eastAsiaTheme="minorHAnsi" w:hAnsi="BRH Devanagari Extra" w:cs="BRH Devanagari Extra"/>
+          <w:color w:val="FF0000"/>
+          <w:sz w:val="36"/>
+          <w:szCs w:val="36"/>
+          <w:lang w:eastAsia="en-US" w:bidi="hi-IN"/>
+        </w:rPr>
+      </w:pPr>
+      <w:r>
+        <w:rPr>
+          <w:rFonts w:ascii="BRH Devanagari Extra" w:eastAsiaTheme="minorHAnsi" w:hAnsi="BRH Devanagari Extra" w:cs="BRH Devanagari Extra"/>
+          <w:color w:val="FF0000"/>
+          <w:sz w:val="36"/>
+          <w:szCs w:val="36"/>
+          <w:lang w:eastAsia="en-US" w:bidi="hi-IN"/>
+        </w:rPr>
+        <w:t xml:space="preserve">AÉ ÌuÉþzÉ ÌuÉýzÉÉ ÌuÉýzÉåiÉÏÌiÉþ ÌuÉýzÉÉ ÌuÉýzÉåÌiÉþ | </w:t>
+      </w:r>
+    </w:p>
+    <w:p>
+      <w:pPr>
+        <w:pStyle w:val="NoSpacing"/>
+        <w:rPr>
+          <w:rFonts w:eastAsiaTheme="minorHAnsi"/>
+          <w:color w:val="FF0000"/>
+          <w:sz w:val="20"/>
+          <w:szCs w:val="20"/>
+          <w:lang w:eastAsia="en-US" w:bidi="hi-IN"/>
+        </w:rPr>
+      </w:pPr>
+    </w:p>
+    <w:p>
+      <w:pPr>
+        <w:autoSpaceDE w:val="0"/>
+        <w:autoSpaceDN w:val="0"/>
+        <w:adjustRightInd w:val="0"/>
+        <w:rPr>
+          <w:rFonts w:ascii="BRH Devanagari Extra" w:eastAsiaTheme="minorHAnsi" w:hAnsi="BRH Devanagari Extra" w:cs="BRH Devanagari Extra"/>
+          <w:color w:val="FF0000"/>
+          <w:sz w:val="36"/>
+          <w:szCs w:val="36"/>
+          <w:lang w:eastAsia="en-US" w:bidi="hi-IN"/>
+        </w:rPr>
+      </w:pPr>
       <w:r>
         <w:rPr>
           <w:rFonts w:ascii="Arial" w:eastAsiaTheme="minorHAnsi" w:hAnsi="Arial" w:cs="Arial"/>
@@ -13358,7 +12947,7 @@
           <w:szCs w:val="28"/>
           <w:lang w:eastAsia="en-US" w:bidi="hi-IN"/>
         </w:rPr>
-        <w:t>-</w:t>
+        <w:t>7.1.7.3(50)-</w:t>
       </w:r>
       <w:r>
         <w:rPr>
@@ -13368,10 +12957,14 @@
           <w:szCs w:val="36"/>
           <w:lang w:eastAsia="en-US" w:bidi="hi-IN"/>
         </w:rPr>
-        <w:t xml:space="preserve">  AÉ</w:t>
-      </w:r>
-      <w:proofErr w:type="gramEnd"/>
-      <w:r>
+        <w:t xml:space="preserve">  ÌuÉýzÉý | CÌiÉþ | AÉýWûý | </w:t>
+      </w:r>
+    </w:p>
+    <w:p>
+      <w:pPr>
+        <w:autoSpaceDE w:val="0"/>
+        <w:autoSpaceDN w:val="0"/>
+        <w:adjustRightInd w:val="0"/>
         <w:rPr>
           <w:rFonts w:ascii="BRH Devanagari Extra" w:eastAsiaTheme="minorHAnsi" w:hAnsi="BRH Devanagari Extra" w:cs="BRH Devanagari Extra"/>
           <w:color w:val="FF0000"/>
@@ -13379,8 +12972,29 @@
           <w:szCs w:val="36"/>
           <w:lang w:eastAsia="en-US" w:bidi="hi-IN"/>
         </w:rPr>
-        <w:t xml:space="preserve"> | ÌuÉýzÉý | xÉÑýzÉåuÉÉÿ | </w:t>
-      </w:r>
+      </w:pPr>
+      <w:r>
+        <w:rPr>
+          <w:rFonts w:ascii="BRH Devanagari Extra" w:eastAsiaTheme="minorHAnsi" w:hAnsi="BRH Devanagari Extra" w:cs="BRH Devanagari Extra"/>
+          <w:color w:val="FF0000"/>
+          <w:sz w:val="36"/>
+          <w:szCs w:val="36"/>
+          <w:lang w:eastAsia="en-US" w:bidi="hi-IN"/>
+        </w:rPr>
+        <w:t xml:space="preserve">ÌuÉýzÉåiÉÏÌiÉþ ÌuÉzÉ ÌuÉýzÉå irÉÉþWûÉý WåûÌiÉþ ÌuÉzÉ ÌuÉýzÉå irÉÉþWû | </w:t>
+      </w:r>
+    </w:p>
+    <w:p>
+      <w:pPr>
+        <w:pStyle w:val="NoSpacing"/>
+        <w:rPr>
+          <w:rFonts w:eastAsiaTheme="minorHAnsi"/>
+          <w:color w:val="FF0000"/>
+          <w:sz w:val="20"/>
+          <w:szCs w:val="20"/>
+          <w:lang w:eastAsia="en-US" w:bidi="hi-IN"/>
+        </w:rPr>
+      </w:pPr>
     </w:p>
     <w:p>
       <w:pPr>
@@ -13397,13 +13011,47 @@
       </w:pPr>
       <w:r>
         <w:rPr>
+          <w:rFonts w:ascii="Arial" w:eastAsiaTheme="minorHAnsi" w:hAnsi="Arial" w:cs="Arial"/>
+          <w:color w:val="FF0000"/>
+          <w:sz w:val="28"/>
+          <w:szCs w:val="28"/>
+          <w:lang w:eastAsia="en-US" w:bidi="hi-IN"/>
+        </w:rPr>
+        <w:t>7.4(6)-</w:t>
+      </w:r>
+      <w:r>
+        <w:rPr>
           <w:rFonts w:ascii="BRH Devanagari Extra" w:eastAsiaTheme="minorHAnsi" w:hAnsi="BRH Devanagari Extra" w:cs="BRH Devanagari Extra"/>
           <w:color w:val="FF0000"/>
           <w:sz w:val="36"/>
           <w:szCs w:val="36"/>
           <w:lang w:eastAsia="en-US" w:bidi="hi-IN"/>
         </w:rPr>
-        <w:t xml:space="preserve">AÉ ÌuÉþzÉ ÌuÉýzÉÉ ÌuÉþzÉ xÉÑýzÉåuÉÉþ xÉÑýzÉåuÉÉþ ÌuÉýzÉÉ ÌuÉþzÉ xÉÑýzÉåuÉÉÿ | </w:t>
+        <w:t xml:space="preserve">  xÉÑýwÉSÉÿ | xÉÑýzÉåuÉÉÿ | pÉÔýiÉÉ | </w:t>
+      </w:r>
+    </w:p>
+    <w:p>
+      <w:pPr>
+        <w:autoSpaceDE w:val="0"/>
+        <w:autoSpaceDN w:val="0"/>
+        <w:adjustRightInd w:val="0"/>
+        <w:rPr>
+          <w:rFonts w:ascii="BRH Devanagari Extra" w:eastAsiaTheme="minorHAnsi" w:hAnsi="BRH Devanagari Extra" w:cs="BRH Devanagari Extra"/>
+          <w:color w:val="FF0000"/>
+          <w:sz w:val="36"/>
+          <w:szCs w:val="36"/>
+          <w:lang w:eastAsia="en-US" w:bidi="hi-IN"/>
+        </w:rPr>
+      </w:pPr>
+      <w:r>
+        <w:rPr>
+          <w:rFonts w:ascii="BRH Devanagari Extra" w:eastAsiaTheme="minorHAnsi" w:hAnsi="BRH Devanagari Extra" w:cs="BRH Devanagari Extra"/>
+          <w:color w:val="FF0000"/>
+          <w:sz w:val="36"/>
+          <w:szCs w:val="36"/>
+          <w:lang w:eastAsia="en-US" w:bidi="hi-IN"/>
+        </w:rPr>
+        <w:t xml:space="preserve">xÉÑýwÉSÉþ xÉÑýzÉåuÉÉþ xÉÑýzÉåuÉÉþ xÉÑýwÉSÉþ xÉÑýwÉSÉþ xÉÑýzÉåuÉÉþ pÉÔýiÉÉ pÉÔýiÉÉ xÉÑýzÉåuÉÉþ xÉÑýwÉSÉþ xÉÑýwÉSÉþ xÉÑýzÉåuÉÉþ pÉÔýiÉÉ | </w:t>
       </w:r>
     </w:p>
     <w:p>
@@ -13424,7 +13072,7 @@
         <w:autoSpaceDN w:val="0"/>
         <w:adjustRightInd w:val="0"/>
         <w:rPr>
-          <w:rFonts w:ascii="BRH Devanagari Extra" w:eastAsiaTheme="minorHAnsi" w:hAnsi="BRH Devanagari Extra" w:cs="BRH Devanagari Extra"/>
+          <w:rFonts w:ascii="Arial" w:eastAsiaTheme="minorHAnsi" w:hAnsi="Arial" w:cs="Arial"/>
           <w:color w:val="FF0000"/>
           <w:sz w:val="36"/>
           <w:szCs w:val="36"/>
@@ -13439,18 +13087,7 @@
           <w:szCs w:val="28"/>
           <w:lang w:eastAsia="en-US" w:bidi="hi-IN"/>
         </w:rPr>
-        <w:t>7.1.7.3(46)</w:t>
-      </w:r>
-      <w:proofErr w:type="gramStart"/>
-      <w:r>
-        <w:rPr>
-          <w:rFonts w:ascii="Arial" w:eastAsiaTheme="minorHAnsi" w:hAnsi="Arial" w:cs="Arial"/>
-          <w:color w:val="FF0000"/>
-          <w:sz w:val="28"/>
-          <w:szCs w:val="28"/>
-          <w:lang w:eastAsia="en-US" w:bidi="hi-IN"/>
-        </w:rPr>
-        <w:t>-</w:t>
+        <w:t>7.1.7.4(7)-</w:t>
       </w:r>
       <w:r>
         <w:rPr>
@@ -13460,571 +13097,7 @@
           <w:szCs w:val="36"/>
           <w:lang w:eastAsia="en-US" w:bidi="hi-IN"/>
         </w:rPr>
-        <w:t xml:space="preserve">  ÌuÉýzÉý</w:t>
-      </w:r>
-      <w:proofErr w:type="gramEnd"/>
-      <w:r>
-        <w:rPr>
-          <w:rFonts w:ascii="BRH Devanagari Extra" w:eastAsiaTheme="minorHAnsi" w:hAnsi="BRH Devanagari Extra" w:cs="BRH Devanagari Extra"/>
-          <w:color w:val="FF0000"/>
-          <w:sz w:val="36"/>
-          <w:szCs w:val="36"/>
-          <w:lang w:eastAsia="en-US" w:bidi="hi-IN"/>
-        </w:rPr>
-        <w:t xml:space="preserve"> | xÉÑýzÉåuÉÉÿ | qÉÉý | </w:t>
-      </w:r>
-    </w:p>
-    <w:p>
-      <w:pPr>
-        <w:autoSpaceDE w:val="0"/>
-        <w:autoSpaceDN w:val="0"/>
-        <w:adjustRightInd w:val="0"/>
-        <w:rPr>
-          <w:rFonts w:ascii="BRH Devanagari Extra" w:eastAsiaTheme="minorHAnsi" w:hAnsi="BRH Devanagari Extra" w:cs="BRH Devanagari Extra"/>
-          <w:color w:val="FF0000"/>
-          <w:sz w:val="36"/>
-          <w:szCs w:val="36"/>
-          <w:lang w:eastAsia="en-US" w:bidi="hi-IN"/>
-        </w:rPr>
-      </w:pPr>
-      <w:r>
-        <w:rPr>
-          <w:rFonts w:ascii="BRH Devanagari Extra" w:eastAsiaTheme="minorHAnsi" w:hAnsi="BRH Devanagari Extra" w:cs="BRH Devanagari Extra"/>
-          <w:color w:val="FF0000"/>
-          <w:sz w:val="36"/>
-          <w:szCs w:val="36"/>
-          <w:lang w:eastAsia="en-US" w:bidi="hi-IN"/>
-        </w:rPr>
-        <w:t xml:space="preserve">ÌuÉýzÉý xÉÑýzÉåuÉÉþ xÉÑýzÉåuÉÉþ ÌuÉzÉ ÌuÉzÉ xÉÑýzÉåuÉÉþ qÉÉ qÉÉ xÉÑýzÉåuÉÉþ ÌuÉzÉ ÌuÉzÉ xÉÑýzÉåuÉÉþ qÉÉ | </w:t>
-      </w:r>
-    </w:p>
-    <w:p>
-      <w:pPr>
-        <w:pStyle w:val="NoSpacing"/>
-        <w:rPr>
-          <w:rFonts w:eastAsiaTheme="minorHAnsi"/>
-          <w:color w:val="FF0000"/>
-          <w:sz w:val="20"/>
-          <w:szCs w:val="20"/>
-          <w:lang w:eastAsia="en-US" w:bidi="hi-IN"/>
-        </w:rPr>
-      </w:pPr>
-    </w:p>
-    <w:p>
-      <w:pPr>
-        <w:autoSpaceDE w:val="0"/>
-        <w:autoSpaceDN w:val="0"/>
-        <w:adjustRightInd w:val="0"/>
-        <w:rPr>
-          <w:rFonts w:ascii="BRH Devanagari Extra" w:eastAsiaTheme="minorHAnsi" w:hAnsi="BRH Devanagari Extra" w:cs="BRH Devanagari Extra"/>
-          <w:color w:val="FF0000"/>
-          <w:sz w:val="36"/>
-          <w:szCs w:val="36"/>
-          <w:lang w:eastAsia="en-US" w:bidi="hi-IN"/>
-        </w:rPr>
-      </w:pPr>
-      <w:r>
-        <w:rPr>
-          <w:rFonts w:ascii="Arial" w:eastAsiaTheme="minorHAnsi" w:hAnsi="Arial" w:cs="Arial"/>
-          <w:color w:val="FF0000"/>
-          <w:sz w:val="28"/>
-          <w:szCs w:val="28"/>
-          <w:lang w:eastAsia="en-US" w:bidi="hi-IN"/>
-        </w:rPr>
-        <w:t>7.1.7.3(47)</w:t>
-      </w:r>
-      <w:proofErr w:type="gramStart"/>
-      <w:r>
-        <w:rPr>
-          <w:rFonts w:ascii="Arial" w:eastAsiaTheme="minorHAnsi" w:hAnsi="Arial" w:cs="Arial"/>
-          <w:color w:val="FF0000"/>
-          <w:sz w:val="28"/>
-          <w:szCs w:val="28"/>
-          <w:lang w:eastAsia="en-US" w:bidi="hi-IN"/>
-        </w:rPr>
-        <w:t>-</w:t>
-      </w:r>
-      <w:r>
-        <w:rPr>
-          <w:rFonts w:ascii="BRH Devanagari Extra" w:eastAsiaTheme="minorHAnsi" w:hAnsi="BRH Devanagari Extra" w:cs="BRH Devanagari Extra"/>
-          <w:color w:val="FF0000"/>
-          <w:sz w:val="36"/>
-          <w:szCs w:val="36"/>
-          <w:lang w:eastAsia="en-US" w:bidi="hi-IN"/>
-        </w:rPr>
-        <w:t xml:space="preserve">  xÉÑýzÉåuÉÉÿ</w:t>
-      </w:r>
-      <w:proofErr w:type="gramEnd"/>
-      <w:r>
-        <w:rPr>
-          <w:rFonts w:ascii="BRH Devanagari Extra" w:eastAsiaTheme="minorHAnsi" w:hAnsi="BRH Devanagari Extra" w:cs="BRH Devanagari Extra"/>
-          <w:color w:val="FF0000"/>
-          <w:sz w:val="36"/>
-          <w:szCs w:val="36"/>
-          <w:lang w:eastAsia="en-US" w:bidi="hi-IN"/>
-        </w:rPr>
-        <w:t xml:space="preserve"> | qÉÉý | AÉ | </w:t>
-      </w:r>
-    </w:p>
-    <w:p>
-      <w:pPr>
-        <w:autoSpaceDE w:val="0"/>
-        <w:autoSpaceDN w:val="0"/>
-        <w:adjustRightInd w:val="0"/>
-        <w:rPr>
-          <w:rFonts w:ascii="BRH Devanagari Extra" w:eastAsiaTheme="minorHAnsi" w:hAnsi="BRH Devanagari Extra" w:cs="BRH Devanagari Extra"/>
-          <w:color w:val="FF0000"/>
-          <w:sz w:val="36"/>
-          <w:szCs w:val="36"/>
-          <w:lang w:eastAsia="en-US" w:bidi="hi-IN"/>
-        </w:rPr>
-      </w:pPr>
-      <w:r>
-        <w:rPr>
-          <w:rFonts w:ascii="BRH Devanagari Extra" w:eastAsiaTheme="minorHAnsi" w:hAnsi="BRH Devanagari Extra" w:cs="BRH Devanagari Extra"/>
-          <w:color w:val="FF0000"/>
-          <w:sz w:val="36"/>
-          <w:szCs w:val="36"/>
-          <w:lang w:eastAsia="en-US" w:bidi="hi-IN"/>
-        </w:rPr>
-        <w:t>xÉÑýzÉåuÉÉþ qÉÉ qÉÉ xÉÑýzÉåuÉÉþ xÉÑýzÉåuÉÉý qÉÉÅÅ qÉÉþ xÉÑýzÉåuÉÉþ xÉÑýzÉåuÉÉý qÉÉ |</w:t>
-      </w:r>
-    </w:p>
-    <w:p>
-      <w:pPr>
-        <w:pStyle w:val="NoSpacing"/>
-        <w:rPr>
-          <w:rFonts w:eastAsiaTheme="minorHAnsi"/>
-          <w:color w:val="FF0000"/>
-          <w:sz w:val="20"/>
-          <w:szCs w:val="20"/>
-          <w:lang w:eastAsia="en-US" w:bidi="hi-IN"/>
-        </w:rPr>
-      </w:pPr>
-    </w:p>
-    <w:p>
-      <w:pPr>
-        <w:autoSpaceDE w:val="0"/>
-        <w:autoSpaceDN w:val="0"/>
-        <w:adjustRightInd w:val="0"/>
-        <w:rPr>
-          <w:rFonts w:ascii="BRH Devanagari Extra" w:eastAsiaTheme="minorHAnsi" w:hAnsi="BRH Devanagari Extra" w:cs="BRH Devanagari Extra"/>
-          <w:color w:val="FF0000"/>
-          <w:sz w:val="36"/>
-          <w:szCs w:val="36"/>
-          <w:lang w:eastAsia="en-US" w:bidi="hi-IN"/>
-        </w:rPr>
-      </w:pPr>
-      <w:r>
-        <w:rPr>
-          <w:rFonts w:ascii="Arial" w:eastAsiaTheme="minorHAnsi" w:hAnsi="Arial" w:cs="Arial"/>
-          <w:color w:val="FF0000"/>
-          <w:sz w:val="28"/>
-          <w:szCs w:val="28"/>
-          <w:lang w:eastAsia="en-US" w:bidi="hi-IN"/>
-        </w:rPr>
-        <w:lastRenderedPageBreak/>
-        <w:t>7.1.7.3(48)</w:t>
-      </w:r>
-      <w:proofErr w:type="gramStart"/>
-      <w:r>
-        <w:rPr>
-          <w:rFonts w:ascii="Arial" w:eastAsiaTheme="minorHAnsi" w:hAnsi="Arial" w:cs="Arial"/>
-          <w:color w:val="FF0000"/>
-          <w:sz w:val="28"/>
-          <w:szCs w:val="28"/>
-          <w:lang w:eastAsia="en-US" w:bidi="hi-IN"/>
-        </w:rPr>
-        <w:t>-</w:t>
-      </w:r>
-      <w:r>
-        <w:rPr>
-          <w:rFonts w:ascii="BRH Devanagari Extra" w:eastAsiaTheme="minorHAnsi" w:hAnsi="BRH Devanagari Extra" w:cs="BRH Devanagari Extra"/>
-          <w:color w:val="FF0000"/>
-          <w:sz w:val="36"/>
-          <w:szCs w:val="36"/>
-          <w:lang w:eastAsia="en-US" w:bidi="hi-IN"/>
-        </w:rPr>
-        <w:t xml:space="preserve">  qÉÉý</w:t>
-      </w:r>
-      <w:proofErr w:type="gramEnd"/>
-      <w:r>
-        <w:rPr>
-          <w:rFonts w:ascii="BRH Devanagari Extra" w:eastAsiaTheme="minorHAnsi" w:hAnsi="BRH Devanagari Extra" w:cs="BRH Devanagari Extra"/>
-          <w:color w:val="FF0000"/>
-          <w:sz w:val="36"/>
-          <w:szCs w:val="36"/>
-          <w:lang w:eastAsia="en-US" w:bidi="hi-IN"/>
-        </w:rPr>
-        <w:t xml:space="preserve"> | AÉ | ÌuÉýzÉý | </w:t>
-      </w:r>
-    </w:p>
-    <w:p>
-      <w:pPr>
-        <w:autoSpaceDE w:val="0"/>
-        <w:autoSpaceDN w:val="0"/>
-        <w:adjustRightInd w:val="0"/>
-        <w:rPr>
-          <w:rFonts w:ascii="BRH Devanagari Extra" w:eastAsiaTheme="minorHAnsi" w:hAnsi="BRH Devanagari Extra" w:cs="BRH Devanagari Extra"/>
-          <w:color w:val="FF0000"/>
-          <w:sz w:val="36"/>
-          <w:szCs w:val="36"/>
-          <w:lang w:eastAsia="en-US" w:bidi="hi-IN"/>
-        </w:rPr>
-      </w:pPr>
-      <w:r>
-        <w:rPr>
-          <w:rFonts w:ascii="BRH Devanagari Extra" w:eastAsiaTheme="minorHAnsi" w:hAnsi="BRH Devanagari Extra" w:cs="BRH Devanagari Extra"/>
-          <w:color w:val="FF0000"/>
-          <w:sz w:val="36"/>
-          <w:szCs w:val="36"/>
-          <w:lang w:eastAsia="en-US" w:bidi="hi-IN"/>
-        </w:rPr>
-        <w:t>qÉÉÅÅ qÉÉý qÉÉÅÅ ÌuÉþzÉ ÌuÉýzÉÉ qÉÉý qÉÉÅÅ ÌuÉþzÉ |</w:t>
-      </w:r>
-    </w:p>
-    <w:p>
-      <w:pPr>
-        <w:pStyle w:val="NoSpacing"/>
-        <w:rPr>
-          <w:rFonts w:eastAsiaTheme="minorHAnsi"/>
-          <w:color w:val="FF0000"/>
-          <w:sz w:val="20"/>
-          <w:szCs w:val="20"/>
-          <w:lang w:eastAsia="en-US" w:bidi="hi-IN"/>
-        </w:rPr>
-      </w:pPr>
-    </w:p>
-    <w:p>
-      <w:pPr>
-        <w:autoSpaceDE w:val="0"/>
-        <w:autoSpaceDN w:val="0"/>
-        <w:adjustRightInd w:val="0"/>
-        <w:rPr>
-          <w:rFonts w:ascii="BRH Devanagari Extra" w:eastAsiaTheme="minorHAnsi" w:hAnsi="BRH Devanagari Extra" w:cs="BRH Devanagari Extra"/>
-          <w:color w:val="FF0000"/>
-          <w:sz w:val="36"/>
-          <w:szCs w:val="36"/>
-          <w:lang w:eastAsia="en-US" w:bidi="hi-IN"/>
-        </w:rPr>
-      </w:pPr>
-      <w:r>
-        <w:rPr>
-          <w:rFonts w:ascii="Arial" w:eastAsiaTheme="minorHAnsi" w:hAnsi="Arial" w:cs="Arial"/>
-          <w:color w:val="FF0000"/>
-          <w:sz w:val="28"/>
-          <w:szCs w:val="28"/>
-          <w:lang w:eastAsia="en-US" w:bidi="hi-IN"/>
-        </w:rPr>
-        <w:t>7.1.7.3(49)</w:t>
-      </w:r>
-      <w:proofErr w:type="gramStart"/>
-      <w:r>
-        <w:rPr>
-          <w:rFonts w:ascii="Arial" w:eastAsiaTheme="minorHAnsi" w:hAnsi="Arial" w:cs="Arial"/>
-          <w:color w:val="FF0000"/>
-          <w:sz w:val="28"/>
-          <w:szCs w:val="28"/>
-          <w:lang w:eastAsia="en-US" w:bidi="hi-IN"/>
-        </w:rPr>
-        <w:t>-</w:t>
-      </w:r>
-      <w:r>
-        <w:rPr>
-          <w:rFonts w:ascii="BRH Devanagari Extra" w:eastAsiaTheme="minorHAnsi" w:hAnsi="BRH Devanagari Extra" w:cs="BRH Devanagari Extra"/>
-          <w:color w:val="FF0000"/>
-          <w:sz w:val="36"/>
-          <w:szCs w:val="36"/>
-          <w:lang w:eastAsia="en-US" w:bidi="hi-IN"/>
-        </w:rPr>
-        <w:t xml:space="preserve">  AÉ</w:t>
-      </w:r>
-      <w:proofErr w:type="gramEnd"/>
-      <w:r>
-        <w:rPr>
-          <w:rFonts w:ascii="BRH Devanagari Extra" w:eastAsiaTheme="minorHAnsi" w:hAnsi="BRH Devanagari Extra" w:cs="BRH Devanagari Extra"/>
-          <w:color w:val="FF0000"/>
-          <w:sz w:val="36"/>
-          <w:szCs w:val="36"/>
-          <w:lang w:eastAsia="en-US" w:bidi="hi-IN"/>
-        </w:rPr>
-        <w:t xml:space="preserve"> | ÌuÉýzÉý | CÌiÉþ | </w:t>
-      </w:r>
-    </w:p>
-    <w:p>
-      <w:pPr>
-        <w:autoSpaceDE w:val="0"/>
-        <w:autoSpaceDN w:val="0"/>
-        <w:adjustRightInd w:val="0"/>
-        <w:rPr>
-          <w:rFonts w:ascii="BRH Devanagari Extra" w:eastAsiaTheme="minorHAnsi" w:hAnsi="BRH Devanagari Extra" w:cs="BRH Devanagari Extra"/>
-          <w:color w:val="FF0000"/>
-          <w:sz w:val="36"/>
-          <w:szCs w:val="36"/>
-          <w:lang w:eastAsia="en-US" w:bidi="hi-IN"/>
-        </w:rPr>
-      </w:pPr>
-      <w:r>
-        <w:rPr>
-          <w:rFonts w:ascii="BRH Devanagari Extra" w:eastAsiaTheme="minorHAnsi" w:hAnsi="BRH Devanagari Extra" w:cs="BRH Devanagari Extra"/>
-          <w:color w:val="FF0000"/>
-          <w:sz w:val="36"/>
-          <w:szCs w:val="36"/>
-          <w:lang w:eastAsia="en-US" w:bidi="hi-IN"/>
-        </w:rPr>
-        <w:t xml:space="preserve">AÉ ÌuÉþzÉ ÌuÉýzÉÉ ÌuÉýzÉåiÉÏÌiÉþ ÌuÉýzÉÉ ÌuÉýzÉåÌiÉþ | </w:t>
-      </w:r>
-    </w:p>
-    <w:p>
-      <w:pPr>
-        <w:pStyle w:val="NoSpacing"/>
-        <w:rPr>
-          <w:rFonts w:eastAsiaTheme="minorHAnsi"/>
-          <w:color w:val="FF0000"/>
-          <w:sz w:val="20"/>
-          <w:szCs w:val="20"/>
-          <w:lang w:eastAsia="en-US" w:bidi="hi-IN"/>
-        </w:rPr>
-      </w:pPr>
-    </w:p>
-    <w:p>
-      <w:pPr>
-        <w:autoSpaceDE w:val="0"/>
-        <w:autoSpaceDN w:val="0"/>
-        <w:adjustRightInd w:val="0"/>
-        <w:rPr>
-          <w:rFonts w:ascii="BRH Devanagari Extra" w:eastAsiaTheme="minorHAnsi" w:hAnsi="BRH Devanagari Extra" w:cs="BRH Devanagari Extra"/>
-          <w:color w:val="FF0000"/>
-          <w:sz w:val="36"/>
-          <w:szCs w:val="36"/>
-          <w:lang w:eastAsia="en-US" w:bidi="hi-IN"/>
-        </w:rPr>
-      </w:pPr>
-      <w:r>
-        <w:rPr>
-          <w:rFonts w:ascii="Arial" w:eastAsiaTheme="minorHAnsi" w:hAnsi="Arial" w:cs="Arial"/>
-          <w:color w:val="FF0000"/>
-          <w:sz w:val="28"/>
-          <w:szCs w:val="28"/>
-          <w:lang w:eastAsia="en-US" w:bidi="hi-IN"/>
-        </w:rPr>
-        <w:t>7.1.7.3(50)</w:t>
-      </w:r>
-      <w:proofErr w:type="gramStart"/>
-      <w:r>
-        <w:rPr>
-          <w:rFonts w:ascii="Arial" w:eastAsiaTheme="minorHAnsi" w:hAnsi="Arial" w:cs="Arial"/>
-          <w:color w:val="FF0000"/>
-          <w:sz w:val="28"/>
-          <w:szCs w:val="28"/>
-          <w:lang w:eastAsia="en-US" w:bidi="hi-IN"/>
-        </w:rPr>
-        <w:t>-</w:t>
-      </w:r>
-      <w:r>
-        <w:rPr>
-          <w:rFonts w:ascii="BRH Devanagari Extra" w:eastAsiaTheme="minorHAnsi" w:hAnsi="BRH Devanagari Extra" w:cs="BRH Devanagari Extra"/>
-          <w:color w:val="FF0000"/>
-          <w:sz w:val="36"/>
-          <w:szCs w:val="36"/>
-          <w:lang w:eastAsia="en-US" w:bidi="hi-IN"/>
-        </w:rPr>
-        <w:t xml:space="preserve">  ÌuÉýzÉý</w:t>
-      </w:r>
-      <w:proofErr w:type="gramEnd"/>
-      <w:r>
-        <w:rPr>
-          <w:rFonts w:ascii="BRH Devanagari Extra" w:eastAsiaTheme="minorHAnsi" w:hAnsi="BRH Devanagari Extra" w:cs="BRH Devanagari Extra"/>
-          <w:color w:val="FF0000"/>
-          <w:sz w:val="36"/>
-          <w:szCs w:val="36"/>
-          <w:lang w:eastAsia="en-US" w:bidi="hi-IN"/>
-        </w:rPr>
-        <w:t xml:space="preserve"> | CÌiÉþ | AÉýWûý | </w:t>
-      </w:r>
-    </w:p>
-    <w:p>
-      <w:pPr>
-        <w:autoSpaceDE w:val="0"/>
-        <w:autoSpaceDN w:val="0"/>
-        <w:adjustRightInd w:val="0"/>
-        <w:rPr>
-          <w:rFonts w:ascii="BRH Devanagari Extra" w:eastAsiaTheme="minorHAnsi" w:hAnsi="BRH Devanagari Extra" w:cs="BRH Devanagari Extra"/>
-          <w:color w:val="FF0000"/>
-          <w:sz w:val="36"/>
-          <w:szCs w:val="36"/>
-          <w:lang w:eastAsia="en-US" w:bidi="hi-IN"/>
-        </w:rPr>
-      </w:pPr>
-      <w:r>
-        <w:rPr>
-          <w:rFonts w:ascii="BRH Devanagari Extra" w:eastAsiaTheme="minorHAnsi" w:hAnsi="BRH Devanagari Extra" w:cs="BRH Devanagari Extra"/>
-          <w:color w:val="FF0000"/>
-          <w:sz w:val="36"/>
-          <w:szCs w:val="36"/>
-          <w:lang w:eastAsia="en-US" w:bidi="hi-IN"/>
-        </w:rPr>
-        <w:t xml:space="preserve">ÌuÉýzÉåiÉÏÌiÉþ ÌuÉzÉ ÌuÉýzÉå irÉÉþWûÉý WåûÌiÉþ ÌuÉzÉ ÌuÉýzÉå irÉÉþWû | </w:t>
-      </w:r>
-    </w:p>
-    <w:p>
-      <w:pPr>
-        <w:pStyle w:val="NoSpacing"/>
-        <w:rPr>
-          <w:rFonts w:eastAsiaTheme="minorHAnsi"/>
-          <w:color w:val="FF0000"/>
-          <w:sz w:val="20"/>
-          <w:szCs w:val="20"/>
-          <w:lang w:eastAsia="en-US" w:bidi="hi-IN"/>
-        </w:rPr>
-      </w:pPr>
-    </w:p>
-    <w:p>
-      <w:pPr>
-        <w:autoSpaceDE w:val="0"/>
-        <w:autoSpaceDN w:val="0"/>
-        <w:adjustRightInd w:val="0"/>
-        <w:rPr>
-          <w:rFonts w:ascii="BRH Devanagari Extra" w:eastAsiaTheme="minorHAnsi" w:hAnsi="BRH Devanagari Extra" w:cs="BRH Devanagari Extra"/>
-          <w:color w:val="FF0000"/>
-          <w:sz w:val="36"/>
-          <w:szCs w:val="36"/>
-          <w:lang w:eastAsia="en-US" w:bidi="hi-IN"/>
-        </w:rPr>
-      </w:pPr>
-      <w:r>
-        <w:rPr>
-          <w:rFonts w:ascii="Arial" w:eastAsiaTheme="minorHAnsi" w:hAnsi="Arial" w:cs="Arial"/>
-          <w:color w:val="FF0000"/>
-          <w:sz w:val="28"/>
-          <w:szCs w:val="28"/>
-          <w:lang w:eastAsia="en-US" w:bidi="hi-IN"/>
-        </w:rPr>
-        <w:t>7.4(6)</w:t>
-      </w:r>
-      <w:proofErr w:type="gramStart"/>
-      <w:r>
-        <w:rPr>
-          <w:rFonts w:ascii="Arial" w:eastAsiaTheme="minorHAnsi" w:hAnsi="Arial" w:cs="Arial"/>
-          <w:color w:val="FF0000"/>
-          <w:sz w:val="28"/>
-          <w:szCs w:val="28"/>
-          <w:lang w:eastAsia="en-US" w:bidi="hi-IN"/>
-        </w:rPr>
-        <w:t>-</w:t>
-      </w:r>
-      <w:r>
-        <w:rPr>
-          <w:rFonts w:ascii="BRH Devanagari Extra" w:eastAsiaTheme="minorHAnsi" w:hAnsi="BRH Devanagari Extra" w:cs="BRH Devanagari Extra"/>
-          <w:color w:val="FF0000"/>
-          <w:sz w:val="36"/>
-          <w:szCs w:val="36"/>
-          <w:lang w:eastAsia="en-US" w:bidi="hi-IN"/>
-        </w:rPr>
-        <w:t xml:space="preserve">  xÉÑýwÉSÉÿ</w:t>
-      </w:r>
-      <w:proofErr w:type="gramEnd"/>
-      <w:r>
-        <w:rPr>
-          <w:rFonts w:ascii="BRH Devanagari Extra" w:eastAsiaTheme="minorHAnsi" w:hAnsi="BRH Devanagari Extra" w:cs="BRH Devanagari Extra"/>
-          <w:color w:val="FF0000"/>
-          <w:sz w:val="36"/>
-          <w:szCs w:val="36"/>
-          <w:lang w:eastAsia="en-US" w:bidi="hi-IN"/>
-        </w:rPr>
-        <w:t xml:space="preserve"> | xÉÑýzÉåuÉÉÿ | pÉÔýiÉÉ | </w:t>
-      </w:r>
-    </w:p>
-    <w:p>
-      <w:pPr>
-        <w:autoSpaceDE w:val="0"/>
-        <w:autoSpaceDN w:val="0"/>
-        <w:adjustRightInd w:val="0"/>
-        <w:rPr>
-          <w:rFonts w:ascii="BRH Devanagari Extra" w:eastAsiaTheme="minorHAnsi" w:hAnsi="BRH Devanagari Extra" w:cs="BRH Devanagari Extra"/>
-          <w:color w:val="FF0000"/>
-          <w:sz w:val="36"/>
-          <w:szCs w:val="36"/>
-          <w:lang w:eastAsia="en-US" w:bidi="hi-IN"/>
-        </w:rPr>
-      </w:pPr>
-      <w:r>
-        <w:rPr>
-          <w:rFonts w:ascii="BRH Devanagari Extra" w:eastAsiaTheme="minorHAnsi" w:hAnsi="BRH Devanagari Extra" w:cs="BRH Devanagari Extra"/>
-          <w:color w:val="FF0000"/>
-          <w:sz w:val="36"/>
-          <w:szCs w:val="36"/>
-          <w:lang w:eastAsia="en-US" w:bidi="hi-IN"/>
-        </w:rPr>
-        <w:t xml:space="preserve">xÉÑýwÉSÉþ xÉÑýzÉåuÉÉþ xÉÑýzÉåuÉÉþ xÉÑýwÉSÉþ xÉÑýwÉSÉþ xÉÑýzÉåuÉÉþ pÉÔýiÉÉ pÉÔýiÉÉ xÉÑýzÉåuÉÉþ xÉÑýwÉSÉþ xÉÑýwÉSÉþ xÉÑýzÉåuÉÉþ pÉÔýiÉÉ | </w:t>
-      </w:r>
-    </w:p>
-    <w:p>
-      <w:pPr>
-        <w:pStyle w:val="NoSpacing"/>
-        <w:rPr>
-          <w:rFonts w:eastAsiaTheme="minorHAnsi"/>
-          <w:color w:val="FF0000"/>
-          <w:sz w:val="20"/>
-          <w:szCs w:val="20"/>
-          <w:lang w:eastAsia="en-US" w:bidi="hi-IN"/>
-        </w:rPr>
-      </w:pPr>
-    </w:p>
-    <w:p>
-      <w:pPr>
-        <w:autoSpaceDE w:val="0"/>
-        <w:autoSpaceDN w:val="0"/>
-        <w:adjustRightInd w:val="0"/>
-        <w:rPr>
-          <w:rFonts w:ascii="Arial" w:eastAsiaTheme="minorHAnsi" w:hAnsi="Arial" w:cs="Arial"/>
-          <w:color w:val="FF0000"/>
-          <w:sz w:val="36"/>
-          <w:szCs w:val="36"/>
-          <w:lang w:eastAsia="en-US" w:bidi="hi-IN"/>
-        </w:rPr>
-      </w:pPr>
-      <w:r>
-        <w:rPr>
-          <w:rFonts w:ascii="Arial" w:eastAsiaTheme="minorHAnsi" w:hAnsi="Arial" w:cs="Arial"/>
-          <w:color w:val="FF0000"/>
-          <w:sz w:val="28"/>
-          <w:szCs w:val="28"/>
-          <w:lang w:eastAsia="en-US" w:bidi="hi-IN"/>
-        </w:rPr>
-        <w:t>7.1.7.4(7)</w:t>
-      </w:r>
-      <w:proofErr w:type="gramStart"/>
-      <w:r>
-        <w:rPr>
-          <w:rFonts w:ascii="Arial" w:eastAsiaTheme="minorHAnsi" w:hAnsi="Arial" w:cs="Arial"/>
-          <w:color w:val="FF0000"/>
-          <w:sz w:val="28"/>
-          <w:szCs w:val="28"/>
-          <w:lang w:eastAsia="en-US" w:bidi="hi-IN"/>
-        </w:rPr>
-        <w:t>-</w:t>
-      </w:r>
-      <w:r>
-        <w:rPr>
-          <w:rFonts w:ascii="BRH Devanagari Extra" w:eastAsiaTheme="minorHAnsi" w:hAnsi="BRH Devanagari Extra" w:cs="BRH Devanagari Extra"/>
-          <w:color w:val="FF0000"/>
-          <w:sz w:val="36"/>
-          <w:szCs w:val="36"/>
-          <w:lang w:eastAsia="en-US" w:bidi="hi-IN"/>
-        </w:rPr>
-        <w:t xml:space="preserve">  xÉÑýzÉåuÉÉÿ</w:t>
-      </w:r>
-      <w:proofErr w:type="gramEnd"/>
-      <w:r>
-        <w:rPr>
-          <w:rFonts w:ascii="BRH Devanagari Extra" w:eastAsiaTheme="minorHAnsi" w:hAnsi="BRH Devanagari Extra" w:cs="BRH Devanagari Extra"/>
-          <w:color w:val="FF0000"/>
-          <w:sz w:val="36"/>
-          <w:szCs w:val="36"/>
-          <w:lang w:eastAsia="en-US" w:bidi="hi-IN"/>
-        </w:rPr>
-        <w:t xml:space="preserve"> | pÉÔýiÉÉ | AÉ | ÌuÉýzÉýÌiÉý | </w:t>
+        <w:t xml:space="preserve">  xÉÑýzÉåuÉÉÿ | pÉÔýiÉÉ | AÉ | ÌuÉýzÉýÌiÉý | </w:t>
       </w:r>
       <w:r>
         <w:rPr>
@@ -14095,18 +13168,7 @@
           <w:szCs w:val="28"/>
           <w:lang w:eastAsia="en-US" w:bidi="hi-IN"/>
         </w:rPr>
-        <w:t>7.1.7.4(8)</w:t>
-      </w:r>
-      <w:proofErr w:type="gramStart"/>
-      <w:r>
-        <w:rPr>
-          <w:rFonts w:ascii="Arial" w:eastAsiaTheme="minorHAnsi" w:hAnsi="Arial" w:cs="Arial"/>
-          <w:color w:val="FF0000"/>
-          <w:sz w:val="28"/>
-          <w:szCs w:val="28"/>
-          <w:lang w:eastAsia="en-US" w:bidi="hi-IN"/>
-        </w:rPr>
-        <w:t>-</w:t>
+        <w:t>7.1.7.4(8)-</w:t>
       </w:r>
       <w:r>
         <w:rPr>
@@ -14116,18 +13178,7 @@
           <w:szCs w:val="36"/>
           <w:lang w:eastAsia="en-US" w:bidi="hi-IN"/>
         </w:rPr>
-        <w:t xml:space="preserve">  pÉÔýiÉÉ</w:t>
-      </w:r>
-      <w:proofErr w:type="gramEnd"/>
-      <w:r>
-        <w:rPr>
-          <w:rFonts w:ascii="BRH Devanagari Extra" w:eastAsiaTheme="minorHAnsi" w:hAnsi="BRH Devanagari Extra" w:cs="BRH Devanagari Extra"/>
-          <w:color w:val="FF0000"/>
-          <w:sz w:val="36"/>
-          <w:szCs w:val="36"/>
-          <w:lang w:eastAsia="en-US" w:bidi="hi-IN"/>
-        </w:rPr>
-        <w:t xml:space="preserve"> | AÉ | ÌuÉýzÉýÌiÉý | lÉ | </w:t>
+        <w:t xml:space="preserve">  pÉÔýiÉÉ | AÉ | ÌuÉýzÉýÌiÉý | lÉ | </w:t>
       </w:r>
       <w:r>
         <w:rPr>
@@ -14198,18 +13249,7 @@
           <w:szCs w:val="28"/>
           <w:lang w:eastAsia="en-US" w:bidi="hi-IN"/>
         </w:rPr>
-        <w:t>7.1.7.4(9)</w:t>
-      </w:r>
-      <w:proofErr w:type="gramStart"/>
-      <w:r>
-        <w:rPr>
-          <w:rFonts w:ascii="Arial" w:eastAsiaTheme="minorHAnsi" w:hAnsi="Arial" w:cs="Arial"/>
-          <w:color w:val="FF0000"/>
-          <w:sz w:val="28"/>
-          <w:szCs w:val="28"/>
-          <w:lang w:eastAsia="en-US" w:bidi="hi-IN"/>
-        </w:rPr>
-        <w:t>-</w:t>
+        <w:t>7.1.7.4(9)-</w:t>
       </w:r>
       <w:r>
         <w:rPr>
@@ -14219,18 +13259,7 @@
           <w:szCs w:val="36"/>
           <w:lang w:eastAsia="en-US" w:bidi="hi-IN"/>
         </w:rPr>
-        <w:t xml:space="preserve">  AÉ</w:t>
-      </w:r>
-      <w:proofErr w:type="gramEnd"/>
-      <w:r>
-        <w:rPr>
-          <w:rFonts w:ascii="BRH Devanagari Extra" w:eastAsiaTheme="minorHAnsi" w:hAnsi="BRH Devanagari Extra" w:cs="BRH Devanagari Extra"/>
-          <w:color w:val="FF0000"/>
-          <w:sz w:val="36"/>
-          <w:szCs w:val="36"/>
-          <w:lang w:eastAsia="en-US" w:bidi="hi-IN"/>
-        </w:rPr>
-        <w:t xml:space="preserve"> | ÌuÉýzÉýÌiÉý | lÉ | </w:t>
+        <w:t xml:space="preserve">  AÉ | ÌuÉýzÉýÌiÉý | lÉ | </w:t>
       </w:r>
       <w:r>
         <w:rPr>
@@ -15268,18 +14297,7 @@
           <w:szCs w:val="40"/>
           <w:lang w:bidi="ar-SA"/>
         </w:rPr>
-        <w:t xml:space="preserve"> </w:t>
-      </w:r>
-      <w:proofErr w:type="gramStart"/>
-      <w:r>
-        <w:rPr>
-          <w:rFonts w:ascii="BRH Devanagari Extra" w:hAnsi="BRH Devanagari Extra" w:cs="BRH Devanagari Extra"/>
-          <w:b/>
-          <w:sz w:val="40"/>
-          <w:szCs w:val="40"/>
-          <w:lang w:bidi="ar-SA"/>
-        </w:rPr>
-        <w:t xml:space="preserve">= </w:t>
+        <w:t xml:space="preserve"> = </w:t>
       </w:r>
       <w:r>
         <w:rPr>
@@ -15290,19 +14308,7 @@
           <w:szCs w:val="40"/>
           <w:lang w:eastAsia="en-US" w:bidi="ar-SA"/>
         </w:rPr>
-        <w:t xml:space="preserve"> (</w:t>
-      </w:r>
-      <w:proofErr w:type="gramEnd"/>
-      <w:r>
-        <w:rPr>
-          <w:rFonts w:ascii="BRH Devanagari" w:eastAsiaTheme="minorHAnsi" w:hAnsi="BRH Devanagari" w:cs="BRH Devanagari"/>
-          <w:b/>
-          <w:color w:val="000000"/>
-          <w:sz w:val="40"/>
-          <w:szCs w:val="40"/>
-          <w:lang w:eastAsia="en-US" w:bidi="ar-SA"/>
-        </w:rPr>
-        <w:t>UqÉiÉÏ UqÉÌiÉÈ)</w:t>
+        <w:t xml:space="preserve"> (UqÉiÉÏ UqÉÌiÉÈ)</w:t>
       </w:r>
     </w:p>
     <w:p>
@@ -15575,19 +14581,7 @@
           <w:szCs w:val="32"/>
           <w:lang w:val="en-US"/>
         </w:rPr>
-        <w:t>7.1.18.2(34)</w:t>
-      </w:r>
-      <w:proofErr w:type="gramStart"/>
-      <w:r>
-        <w:rPr>
-          <w:rFonts w:ascii="Arial" w:hAnsi="Arial" w:cs="Arial"/>
-          <w:bCs/>
-          <w:color w:val="FF0000"/>
-          <w:sz w:val="32"/>
-          <w:szCs w:val="32"/>
-          <w:lang w:val="en-US"/>
-        </w:rPr>
-        <w:t>-</w:t>
+        <w:t>7.1.18.2(34)-</w:t>
       </w:r>
       <w:r>
         <w:rPr>
@@ -15597,18 +14591,7 @@
           <w:szCs w:val="40"/>
           <w:lang w:eastAsia="en-US" w:bidi="hi-IN"/>
         </w:rPr>
-        <w:t xml:space="preserve">  qÉýWûÏqÉç</w:t>
-      </w:r>
-      <w:proofErr w:type="gramEnd"/>
-      <w:r>
-        <w:rPr>
-          <w:rFonts w:ascii="BRH Devanagari Extra" w:eastAsiaTheme="minorHAnsi" w:hAnsi="BRH Devanagari Extra" w:cs="BRH Devanagari Extra"/>
-          <w:color w:val="FF0000"/>
-          <w:sz w:val="40"/>
-          <w:szCs w:val="40"/>
-          <w:lang w:eastAsia="en-US" w:bidi="hi-IN"/>
-        </w:rPr>
-        <w:t xml:space="preserve"> | Eý | xÉÑ | </w:t>
+        <w:t xml:space="preserve">  qÉýWûÏqÉç | Eý | xÉÑ | </w:t>
       </w:r>
     </w:p>
     <w:p>
@@ -15686,19 +14669,7 @@
           <w:lang w:val="en-US"/>
         </w:rPr>
         <w:lastRenderedPageBreak/>
-        <w:t>7.1.18.2(35)</w:t>
-      </w:r>
-      <w:proofErr w:type="gramStart"/>
-      <w:r>
-        <w:rPr>
-          <w:rFonts w:ascii="Arial" w:hAnsi="Arial" w:cs="Arial"/>
-          <w:bCs/>
-          <w:color w:val="FF0000"/>
-          <w:sz w:val="32"/>
-          <w:szCs w:val="32"/>
-          <w:lang w:val="en-US"/>
-        </w:rPr>
-        <w:t>-</w:t>
+        <w:t>7.1.18.2(35)-</w:t>
       </w:r>
       <w:r>
         <w:rPr>
@@ -15708,18 +14679,7 @@
           <w:szCs w:val="40"/>
           <w:lang w:eastAsia="en-US" w:bidi="hi-IN"/>
         </w:rPr>
-        <w:t xml:space="preserve">  Eý</w:t>
-      </w:r>
-      <w:proofErr w:type="gramEnd"/>
-      <w:r>
-        <w:rPr>
-          <w:rFonts w:ascii="BRH Devanagari Extra" w:eastAsiaTheme="minorHAnsi" w:hAnsi="BRH Devanagari Extra" w:cs="BRH Devanagari Extra"/>
-          <w:color w:val="FF0000"/>
-          <w:sz w:val="40"/>
-          <w:szCs w:val="40"/>
-          <w:lang w:eastAsia="en-US" w:bidi="hi-IN"/>
-        </w:rPr>
-        <w:t xml:space="preserve"> | xÉÑ | xÉÑý§ÉÉqÉÉþhÉqÉç | </w:t>
+        <w:t xml:space="preserve">  Eý | xÉÑ | xÉÑý§ÉÉqÉÉþhÉqÉç | </w:t>
       </w:r>
     </w:p>
     <w:p>
@@ -17362,19 +16322,7 @@
           <w:szCs w:val="32"/>
           <w:lang w:val="en-US"/>
         </w:rPr>
-        <w:t>7.1.20.1(40)</w:t>
-      </w:r>
-      <w:proofErr w:type="gramStart"/>
-      <w:r>
-        <w:rPr>
-          <w:rFonts w:ascii="Arial" w:hAnsi="Arial" w:cs="Arial"/>
-          <w:bCs/>
-          <w:color w:val="FF0000"/>
-          <w:sz w:val="32"/>
-          <w:szCs w:val="32"/>
-          <w:lang w:val="en-US"/>
-        </w:rPr>
-        <w:t>-</w:t>
+        <w:t>7.1.20.1(40)-</w:t>
       </w:r>
       <w:r>
         <w:rPr>
@@ -17384,18 +16332,7 @@
           <w:szCs w:val="40"/>
           <w:lang w:eastAsia="en-US" w:bidi="hi-IN"/>
         </w:rPr>
-        <w:t xml:space="preserve">  AýmÉÈ</w:t>
-      </w:r>
-      <w:proofErr w:type="gramEnd"/>
-      <w:r>
-        <w:rPr>
-          <w:rFonts w:ascii="BRH Devanagari Extra" w:eastAsiaTheme="minorHAnsi" w:hAnsi="BRH Devanagari Extra" w:cs="BRH Devanagari Extra"/>
-          <w:color w:val="FF0000"/>
-          <w:sz w:val="40"/>
-          <w:szCs w:val="40"/>
-          <w:lang w:eastAsia="en-US" w:bidi="hi-IN"/>
-        </w:rPr>
-        <w:t xml:space="preserve"> | uÉ×ýhÉÉýlÉÈ | mÉýuÉýiÉåý | </w:t>
+        <w:t xml:space="preserve">  AýmÉÈ | uÉ×ýhÉÉýlÉÈ | mÉýuÉýiÉåý | </w:t>
       </w:r>
     </w:p>
     <w:p>
@@ -19102,18 +18039,7 @@
           <w:szCs w:val="40"/>
           <w:lang w:bidi="ar-SA"/>
         </w:rPr>
-        <w:t xml:space="preserve">rÉuÉåÿ </w:t>
-      </w:r>
-      <w:proofErr w:type="gramStart"/>
-      <w:r>
-        <w:rPr>
-          <w:rFonts w:ascii="BRH Devanagari Extra" w:hAnsi="BRH Devanagari Extra" w:cs="BRH Devanagari Extra"/>
-          <w:b/>
-          <w:sz w:val="40"/>
-          <w:szCs w:val="40"/>
-          <w:lang w:bidi="ar-SA"/>
-        </w:rPr>
-        <w:t xml:space="preserve">-  </w:t>
+        <w:t xml:space="preserve">rÉuÉåÿ -  </w:t>
       </w:r>
       <w:r>
         <w:rPr>
@@ -19123,18 +18049,7 @@
           <w:szCs w:val="32"/>
           <w:lang w:val="en-US"/>
         </w:rPr>
-        <w:t>TS</w:t>
-      </w:r>
-      <w:proofErr w:type="gramEnd"/>
-      <w:r>
-        <w:rPr>
-          <w:rFonts w:ascii="Arial" w:hAnsi="Arial" w:cs="Arial"/>
-          <w:bCs/>
-          <w:sz w:val="32"/>
-          <w:szCs w:val="32"/>
-          <w:lang w:val="en-US"/>
-        </w:rPr>
-        <w:t xml:space="preserve"> 7.1.20.1</w:t>
+        <w:t>TS 7.1.20.1</w:t>
       </w:r>
     </w:p>
     <w:p>
@@ -19643,17 +18558,7 @@
           <w:sz w:val="40"/>
           <w:szCs w:val="40"/>
         </w:rPr>
-        <w:t xml:space="preserve">iÉÉlÉç | MüsmÉþqÉÉlÉÉlÉç </w:t>
-      </w:r>
-      <w:proofErr w:type="gramStart"/>
-      <w:r>
-        <w:rPr>
-          <w:rFonts w:ascii="BRH Devanagari Extra" w:hAnsi="BRH Devanagari Extra" w:cs="BRH Devanagari Extra"/>
-          <w:color w:val="FF0000"/>
-          <w:sz w:val="40"/>
-          <w:szCs w:val="40"/>
-        </w:rPr>
-        <w:t>|</w:t>
+        <w:t>iÉÉlÉç | MüsmÉþqÉÉlÉÉlÉç |</w:t>
       </w:r>
       <w:r>
         <w:rPr>
@@ -19672,17 +18577,7 @@
           <w:sz w:val="40"/>
           <w:szCs w:val="40"/>
         </w:rPr>
-        <w:t>=</w:t>
-      </w:r>
-      <w:proofErr w:type="gramEnd"/>
-      <w:r>
-        <w:rPr>
-          <w:rFonts w:ascii="BRH Devanagari Extra" w:hAnsi="BRH Devanagari Extra" w:cs="BRH Devanagari Extra"/>
-          <w:b/>
-          <w:sz w:val="40"/>
-          <w:szCs w:val="40"/>
-        </w:rPr>
-        <w:t xml:space="preserve"> </w:t>
+        <w:t xml:space="preserve">= </w:t>
       </w:r>
       <w:r>
         <w:rPr>
@@ -20399,51 +19294,7 @@
           <w:szCs w:val="40"/>
           <w:lang w:eastAsia="en-US" w:bidi="hi-IN"/>
         </w:rPr>
-        <w:t>LýwuÉåþuÉæ uÉæwuÉåÿ(1</w:t>
-      </w:r>
-      <w:proofErr w:type="gramStart"/>
-      <w:r>
-        <w:rPr>
-          <w:rFonts w:ascii="BRH Devanagari Extra" w:eastAsiaTheme="minorHAnsi" w:hAnsi="BRH Devanagari Extra" w:cs="BRH Devanagari Extra"/>
-          <w:color w:val="FF0000"/>
-          <w:sz w:val="40"/>
-          <w:szCs w:val="40"/>
-          <w:lang w:eastAsia="en-US" w:bidi="hi-IN"/>
-        </w:rPr>
-        <w:t>ý)wuÉåþuÉ</w:t>
-      </w:r>
-      <w:proofErr w:type="gramEnd"/>
-      <w:r>
-        <w:rPr>
-          <w:rFonts w:ascii="BRH Devanagari Extra" w:eastAsiaTheme="minorHAnsi" w:hAnsi="BRH Devanagari Extra" w:cs="BRH Devanagari Extra"/>
-          <w:color w:val="FF0000"/>
-          <w:sz w:val="40"/>
-          <w:szCs w:val="40"/>
-          <w:lang w:eastAsia="en-US" w:bidi="hi-IN"/>
-        </w:rPr>
-        <w:t xml:space="preserve"> sÉÉåýMåüwÉÑþ sÉÉåýMåü wuÉåýuÉæwuÉåÿ(1</w:t>
-      </w:r>
-      <w:proofErr w:type="gramStart"/>
-      <w:r>
-        <w:rPr>
-          <w:rFonts w:ascii="BRH Devanagari Extra" w:eastAsiaTheme="minorHAnsi" w:hAnsi="BRH Devanagari Extra" w:cs="BRH Devanagari Extra"/>
-          <w:color w:val="FF0000"/>
-          <w:sz w:val="40"/>
-          <w:szCs w:val="40"/>
-          <w:lang w:eastAsia="en-US" w:bidi="hi-IN"/>
-        </w:rPr>
-        <w:t>ý)wuÉåþuÉ</w:t>
-      </w:r>
-      <w:proofErr w:type="gramEnd"/>
-      <w:r>
-        <w:rPr>
-          <w:rFonts w:ascii="BRH Devanagari Extra" w:eastAsiaTheme="minorHAnsi" w:hAnsi="BRH Devanagari Extra" w:cs="BRH Devanagari Extra"/>
-          <w:color w:val="FF0000"/>
-          <w:sz w:val="40"/>
-          <w:szCs w:val="40"/>
-          <w:lang w:eastAsia="en-US" w:bidi="hi-IN"/>
-        </w:rPr>
-        <w:t xml:space="preserve"> sÉÉåýMåüwÉÑþ | </w:t>
+        <w:t xml:space="preserve">LýwuÉåþuÉæ uÉæwuÉåÿ(1ý)wuÉåþuÉ sÉÉåýMåüwÉÑþ sÉÉåýMåü wuÉåýuÉæwuÉåÿ(1ý)wuÉåþuÉ sÉÉåýMåüwÉÑþ | </w:t>
       </w:r>
     </w:p>
     <w:p>
@@ -37044,9 +35895,8 @@
           <w:lang w:val="en-US"/>
         </w:rPr>
         <w:br/>
-        <w:t>(JM-</w:t>
-      </w:r>
-      <w:proofErr w:type="gramStart"/>
+        <w:t>(JM-33)(GD-46)(GD-73)</w:t>
+      </w:r>
       <w:r>
         <w:rPr>
           <w:rFonts w:ascii="Arial" w:hAnsi="Arial" w:cs="Arial"/>
@@ -37055,72 +35905,7 @@
           <w:szCs w:val="32"/>
           <w:lang w:val="en-US"/>
         </w:rPr>
-        <w:t>33)(</w:t>
-      </w:r>
-      <w:proofErr w:type="gramEnd"/>
-      <w:r>
-        <w:rPr>
-          <w:rFonts w:ascii="Arial" w:hAnsi="Arial" w:cs="Arial"/>
-          <w:bCs/>
-          <w:sz w:val="32"/>
-          <w:szCs w:val="32"/>
-          <w:lang w:val="en-US"/>
-        </w:rPr>
-        <w:t>GD-</w:t>
-      </w:r>
-      <w:proofErr w:type="gramStart"/>
-      <w:r>
-        <w:rPr>
-          <w:rFonts w:ascii="Arial" w:hAnsi="Arial" w:cs="Arial"/>
-          <w:bCs/>
-          <w:sz w:val="32"/>
-          <w:szCs w:val="32"/>
-          <w:lang w:val="en-US"/>
-        </w:rPr>
-        <w:t>46)(</w:t>
-      </w:r>
-      <w:proofErr w:type="gramEnd"/>
-      <w:r>
-        <w:rPr>
-          <w:rFonts w:ascii="Arial" w:hAnsi="Arial" w:cs="Arial"/>
-          <w:bCs/>
-          <w:sz w:val="32"/>
-          <w:szCs w:val="32"/>
-          <w:lang w:val="en-US"/>
-        </w:rPr>
-        <w:t>GD-</w:t>
-      </w:r>
-      <w:proofErr w:type="gramStart"/>
-      <w:r>
-        <w:rPr>
-          <w:rFonts w:ascii="Arial" w:hAnsi="Arial" w:cs="Arial"/>
-          <w:bCs/>
-          <w:sz w:val="32"/>
-          <w:szCs w:val="32"/>
-          <w:lang w:val="en-US"/>
-        </w:rPr>
-        <w:t>73)</w:t>
-      </w:r>
-      <w:r>
-        <w:rPr>
-          <w:rFonts w:ascii="Arial" w:hAnsi="Arial" w:cs="Arial"/>
-          <w:bCs/>
-          <w:sz w:val="32"/>
-          <w:szCs w:val="32"/>
-          <w:lang w:val="en-US"/>
-        </w:rPr>
-        <w:t>(</w:t>
-      </w:r>
-      <w:proofErr w:type="gramEnd"/>
-      <w:r>
-        <w:rPr>
-          <w:rFonts w:ascii="Arial" w:hAnsi="Arial" w:cs="Arial"/>
-          <w:bCs/>
-          <w:sz w:val="32"/>
-          <w:szCs w:val="32"/>
-          <w:lang w:val="en-US"/>
-        </w:rPr>
-        <w:t>GD-50)</w:t>
+        <w:t>(GD-50)</w:t>
       </w:r>
     </w:p>
     <w:p>
@@ -38132,7 +36917,6 @@
           <w:lang w:eastAsia="en-US" w:bidi="ar-SA"/>
         </w:rPr>
       </w:pPr>
-      <w:proofErr w:type="gramStart"/>
       <w:r>
         <w:rPr>
           <w:rFonts w:ascii="Times New Roman" w:eastAsiaTheme="minorHAnsi" w:hAnsi="Times New Roman" w:cs="Times New Roman"/>
@@ -38157,7 +36941,6 @@
         </w:rPr>
         <w:t xml:space="preserve"> hÉ</w:t>
       </w:r>
-      <w:proofErr w:type="gramEnd"/>
       <w:r>
         <w:rPr>
           <w:rFonts w:ascii="BRH Devanagari" w:eastAsiaTheme="minorHAnsi" w:hAnsi="BRH Devanagari" w:cs="BRH Devanagari"/>
@@ -38217,7 +37000,6 @@
         </w:rPr>
         <w:t xml:space="preserve"> </w:t>
       </w:r>
-      <w:proofErr w:type="gramStart"/>
       <w:r>
         <w:rPr>
           <w:rFonts w:ascii="Times New Roman" w:eastAsiaTheme="minorHAnsi" w:hAnsi="Times New Roman" w:cs="Times New Roman"/>
@@ -38242,7 +37024,6 @@
         </w:rPr>
         <w:t xml:space="preserve"> wÉ</w:t>
       </w:r>
-      <w:proofErr w:type="gramEnd"/>
       <w:r>
         <w:rPr>
           <w:rFonts w:ascii="BRH Devanagari" w:eastAsiaTheme="minorHAnsi" w:hAnsi="BRH Devanagari" w:cs="BRH Devanagari"/>
@@ -38981,27 +37762,7 @@
           <w:szCs w:val="32"/>
         </w:rPr>
         <w:br/>
-        <w:t>(JM-</w:t>
-      </w:r>
-      <w:proofErr w:type="gramStart"/>
-      <w:r>
-        <w:rPr>
-          <w:rFonts w:ascii="Arial" w:hAnsi="Arial" w:cs="Arial"/>
-          <w:bCs/>
-          <w:sz w:val="32"/>
-          <w:szCs w:val="32"/>
-        </w:rPr>
-        <w:t>33)(</w:t>
-      </w:r>
-      <w:proofErr w:type="gramEnd"/>
-      <w:r>
-        <w:rPr>
-          <w:rFonts w:ascii="Arial" w:hAnsi="Arial" w:cs="Arial"/>
-          <w:bCs/>
-          <w:sz w:val="32"/>
-          <w:szCs w:val="32"/>
-        </w:rPr>
-        <w:t>JD-25)</w:t>
+        <w:t>(JM-33)(JD-25)</w:t>
       </w:r>
       <w:r>
         <w:rPr>
@@ -39187,27 +37948,7 @@
           <w:sz w:val="28"/>
           <w:lang w:eastAsia="en-US" w:bidi="ar-SA"/>
         </w:rPr>
-        <w:t>(If “u” and “u” comes in succession after “tat</w:t>
-      </w:r>
-      <w:proofErr w:type="gramStart"/>
-      <w:r>
-        <w:rPr>
-          <w:rFonts w:ascii="Arial" w:eastAsiaTheme="minorHAnsi" w:hAnsi="Arial" w:cs="Arial"/>
-          <w:b/>
-          <w:sz w:val="28"/>
-          <w:lang w:eastAsia="en-US" w:bidi="ar-SA"/>
-        </w:rPr>
-        <w:t>” ,</w:t>
-      </w:r>
-      <w:proofErr w:type="gramEnd"/>
-      <w:r>
-        <w:rPr>
-          <w:rFonts w:ascii="Arial" w:eastAsiaTheme="minorHAnsi" w:hAnsi="Arial" w:cs="Arial"/>
-          <w:b/>
-          <w:sz w:val="28"/>
-          <w:lang w:eastAsia="en-US" w:bidi="ar-SA"/>
-        </w:rPr>
-        <w:t xml:space="preserve"> then “u” + “u” is not “vu”, but “U” in deergham) </w:t>
+        <w:t xml:space="preserve">(If “u” and “u” comes in succession after “tat” , then “u” + “u” is not “vu”, but “U” in deergham) </w:t>
       </w:r>
     </w:p>
     <w:p>
@@ -40418,29 +39159,7 @@
           <w:szCs w:val="40"/>
           <w:lang w:eastAsia="en-US" w:bidi="hi-IN"/>
         </w:rPr>
-        <w:t>LýuÉÉprÉÉÿ(1</w:t>
-      </w:r>
-      <w:proofErr w:type="gramStart"/>
-      <w:r>
-        <w:rPr>
-          <w:rFonts w:ascii="BRH Devanagari Extra" w:eastAsiaTheme="minorHAnsi" w:hAnsi="BRH Devanagari Extra" w:cs="BRH Devanagari Extra"/>
-          <w:color w:val="FF0000"/>
-          <w:sz w:val="40"/>
-          <w:szCs w:val="40"/>
-          <w:lang w:eastAsia="en-US" w:bidi="hi-IN"/>
-        </w:rPr>
-        <w:t>ý)prÉåþ</w:t>
-      </w:r>
-      <w:proofErr w:type="gramEnd"/>
-      <w:r>
-        <w:rPr>
-          <w:rFonts w:ascii="BRH Devanagari Extra" w:eastAsiaTheme="minorHAnsi" w:hAnsi="BRH Devanagari Extra" w:cs="BRH Devanagari Extra"/>
-          <w:color w:val="FF0000"/>
-          <w:sz w:val="40"/>
-          <w:szCs w:val="40"/>
-          <w:lang w:eastAsia="en-US" w:bidi="hi-IN"/>
-        </w:rPr>
-        <w:t xml:space="preserve"> uÉæuÉÉÍpÉ eÉþrÉÎliÉ eÉrÉ lirÉýprÉåþ uÉæuÉÉÍpÉ eÉþrÉÎliÉ | </w:t>
+        <w:t xml:space="preserve">LýuÉÉprÉÉÿ(1ý)prÉåþ uÉæuÉÉÍpÉ eÉþrÉÎliÉ eÉrÉ lirÉýprÉåþ uÉæuÉÉÍpÉ eÉþrÉÎliÉ | </w:t>
       </w:r>
     </w:p>
     <w:p>
@@ -40858,18 +39577,7 @@
           <w:szCs w:val="32"/>
           <w:lang w:val="en-US"/>
         </w:rPr>
-        <w:t>TS 7.5.8.5</w:t>
-      </w:r>
-      <w:proofErr w:type="gramStart"/>
-      <w:r>
-        <w:rPr>
-          <w:rFonts w:ascii="Arial" w:hAnsi="Arial" w:cs="Arial"/>
-          <w:bCs/>
-          <w:sz w:val="32"/>
-          <w:szCs w:val="32"/>
-          <w:lang w:val="en-US"/>
-        </w:rPr>
-        <w:t>–</w:t>
+        <w:t>TS 7.5.8.5–</w:t>
       </w:r>
       <w:r>
         <w:rPr>
@@ -40881,20 +39589,7 @@
           <w:highlight w:val="yellow"/>
           <w:lang w:val="en-US"/>
         </w:rPr>
-        <w:t>(</w:t>
-      </w:r>
-      <w:proofErr w:type="gramEnd"/>
-      <w:r>
-        <w:rPr>
-          <w:rFonts w:ascii="Arial" w:hAnsi="Arial" w:cs="Arial"/>
-          <w:b/>
-          <w:bCs/>
-          <w:sz w:val="32"/>
-          <w:szCs w:val="32"/>
-          <w:highlight w:val="yellow"/>
-          <w:lang w:val="en-US"/>
-        </w:rPr>
-        <w:t>tri kramam)</w:t>
+        <w:t>(tri kramam)</w:t>
       </w:r>
       <w:r>
         <w:rPr>
@@ -41549,29 +40244,7 @@
           <w:szCs w:val="32"/>
           <w:lang w:val="en-US"/>
         </w:rPr>
-        <w:t xml:space="preserve">TS </w:t>
-      </w:r>
-      <w:proofErr w:type="gramStart"/>
-      <w:r>
-        <w:rPr>
-          <w:rFonts w:ascii="Arial" w:hAnsi="Arial" w:cs="Arial"/>
-          <w:bCs/>
-          <w:sz w:val="32"/>
-          <w:szCs w:val="32"/>
-          <w:lang w:val="en-US"/>
-        </w:rPr>
-        <w:t>7.5.11.2  -</w:t>
-      </w:r>
-      <w:proofErr w:type="gramEnd"/>
-      <w:r>
-        <w:rPr>
-          <w:rFonts w:ascii="Arial" w:hAnsi="Arial" w:cs="Arial"/>
-          <w:bCs/>
-          <w:sz w:val="32"/>
-          <w:szCs w:val="32"/>
-          <w:lang w:val="en-US"/>
-        </w:rPr>
-        <w:t xml:space="preserve"> </w:t>
+        <w:t xml:space="preserve">TS 7.5.11.2  - </w:t>
       </w:r>
       <w:r>
         <w:rPr>
@@ -41608,33 +40281,7 @@
           <w:lang w:val="en-US"/>
         </w:rPr>
         <w:br/>
-        <w:t>(JM-</w:t>
-      </w:r>
-      <w:proofErr w:type="gramStart"/>
-      <w:r>
-        <w:rPr>
-          <w:rFonts w:ascii="Arial" w:hAnsi="Arial" w:cs="Arial"/>
-          <w:b/>
-          <w:bCs/>
-          <w:sz w:val="32"/>
-          <w:szCs w:val="32"/>
-          <w:highlight w:val="yellow"/>
-          <w:lang w:val="en-US"/>
-        </w:rPr>
-        <w:t>15)(</w:t>
-      </w:r>
-      <w:proofErr w:type="gramEnd"/>
-      <w:r>
-        <w:rPr>
-          <w:rFonts w:ascii="Arial" w:hAnsi="Arial" w:cs="Arial"/>
-          <w:b/>
-          <w:bCs/>
-          <w:sz w:val="32"/>
-          <w:szCs w:val="32"/>
-          <w:highlight w:val="yellow"/>
-          <w:lang w:val="en-US"/>
-        </w:rPr>
-        <w:t>JM-75)</w:t>
+        <w:t>(JM-15)(JM-75)</w:t>
       </w:r>
     </w:p>
     <w:p>
@@ -41650,7 +40297,6 @@
           <w:lang w:eastAsia="en-US" w:bidi="hi-IN"/>
         </w:rPr>
       </w:pPr>
-      <w:proofErr w:type="gramStart"/>
       <w:r>
         <w:rPr>
           <w:rFonts w:ascii="BRH Devanagari" w:eastAsiaTheme="minorHAnsi" w:hAnsi="BRH Devanagari" w:cs="BRH Devanagari"/>
@@ -41669,31 +40315,8 @@
           <w:szCs w:val="40"/>
           <w:lang w:eastAsia="en-US" w:bidi="hi-IN"/>
         </w:rPr>
-        <w:t>AÌ</w:t>
-      </w:r>
-      <w:proofErr w:type="gramEnd"/>
-      <w:r>
-        <w:rPr>
-          <w:rFonts w:ascii="BRH Devanagari" w:eastAsiaTheme="minorHAnsi" w:hAnsi="BRH Devanagari" w:cs="BRH Devanagari"/>
-          <w:color w:val="FF0000"/>
-          <w:sz w:val="40"/>
-          <w:szCs w:val="40"/>
-          <w:lang w:eastAsia="en-US" w:bidi="hi-IN"/>
-        </w:rPr>
-        <w:t>…¡ûUåprÉÉå AÌ…¡</w:t>
-      </w:r>
-      <w:proofErr w:type="gramStart"/>
-      <w:r>
-        <w:rPr>
-          <w:rFonts w:ascii="BRH Devanagari" w:eastAsiaTheme="minorHAnsi" w:hAnsi="BRH Devanagari" w:cs="BRH Devanagari"/>
-          <w:color w:val="FF0000"/>
-          <w:sz w:val="40"/>
-          <w:szCs w:val="40"/>
-          <w:lang w:eastAsia="en-US" w:bidi="hi-IN"/>
-        </w:rPr>
-        <w:t>ûUåprÉÈ )</w:t>
-      </w:r>
-      <w:proofErr w:type="gramEnd"/>
+        <w:t>AÌ…¡ûUåprÉÉå AÌ…¡ûUåprÉÈ )</w:t>
+      </w:r>
     </w:p>
     <w:p>
       <w:pPr>
@@ -44221,7 +42844,6 @@
         </w:rPr>
         <w:t>jxÉ×erÉÉÇ(</w:t>
       </w:r>
-      <w:proofErr w:type="gramStart"/>
       <w:r>
         <w:rPr>
           <w:rFonts w:ascii="Arial" w:hAnsi="Arial" w:cs="Arial"/>
@@ -44240,29 +42862,7 @@
           <w:szCs w:val="40"/>
           <w:lang w:bidi="ar-SA"/>
         </w:rPr>
-        <w:t>)lÉÉåjxÉ</w:t>
-      </w:r>
-      <w:proofErr w:type="gramEnd"/>
-      <w:r>
-        <w:rPr>
-          <w:rFonts w:ascii="BRH Devanagari Extra" w:hAnsi="BRH Devanagari Extra" w:cs="BRH Devanagari Extra"/>
-          <w:b/>
-          <w:sz w:val="40"/>
-          <w:szCs w:val="40"/>
-          <w:lang w:bidi="ar-SA"/>
-        </w:rPr>
-        <w:t>×</w:t>
-      </w:r>
-      <w:proofErr w:type="gramStart"/>
-      <w:r>
-        <w:rPr>
-          <w:rFonts w:ascii="BRH Devanagari Extra" w:hAnsi="BRH Devanagari Extra" w:cs="BRH Devanagari Extra"/>
-          <w:b/>
-          <w:sz w:val="40"/>
-          <w:szCs w:val="40"/>
-          <w:lang w:bidi="ar-SA"/>
-        </w:rPr>
-        <w:t>erÉÉ(</w:t>
+        <w:t>)lÉÉåjxÉ×erÉÉ(</w:t>
       </w:r>
       <w:r>
         <w:rPr>
@@ -44282,18 +42882,7 @@
           <w:szCs w:val="40"/>
           <w:lang w:bidi="ar-SA"/>
         </w:rPr>
-        <w:t>)ÍqÉÌiÉþ</w:t>
-      </w:r>
-      <w:proofErr w:type="gramEnd"/>
-      <w:r>
-        <w:rPr>
-          <w:rFonts w:ascii="BRH Devanagari Extra" w:hAnsi="BRH Devanagari Extra" w:cs="BRH Devanagari Extra"/>
-          <w:b/>
-          <w:sz w:val="40"/>
-          <w:szCs w:val="40"/>
-          <w:lang w:bidi="ar-SA"/>
-        </w:rPr>
-        <w:t xml:space="preserve"> - </w:t>
+        <w:t xml:space="preserve">)ÍqÉÌiÉþ - </w:t>
       </w:r>
       <w:r>
         <w:rPr>
@@ -45537,37 +44126,16 @@
           <w:szCs w:val="40"/>
           <w:lang w:eastAsia="en-US" w:bidi="hi-IN"/>
         </w:rPr>
-        <w:t xml:space="preserve"> Aµ</w:t>
-      </w:r>
-      <w:proofErr w:type="gramStart"/>
-      <w:r>
-        <w:rPr>
-          <w:rFonts w:ascii="BRH Devanagari" w:eastAsiaTheme="minorHAnsi" w:hAnsi="BRH Devanagari" w:cs="BRH Devanagari"/>
-          <w:color w:val="FF0000"/>
-          <w:sz w:val="40"/>
-          <w:szCs w:val="40"/>
-          <w:lang w:eastAsia="en-US" w:bidi="hi-IN"/>
-        </w:rPr>
-        <w:t xml:space="preserve">ÉxrÉ  </w:t>
-      </w:r>
-      <w:r>
-        <w:rPr>
-          <w:rFonts w:ascii="BRH Devanagari Extra" w:hAnsi="BRH Devanagari Extra" w:cs="BRH Devanagari Extra"/>
-          <w:color w:val="FF0000"/>
-          <w:sz w:val="40"/>
-          <w:szCs w:val="40"/>
-        </w:rPr>
-        <w:t>-</w:t>
-      </w:r>
-      <w:proofErr w:type="gramEnd"/>
-      <w:r>
-        <w:rPr>
-          <w:rFonts w:ascii="BRH Devanagari Extra" w:hAnsi="BRH Devanagari Extra" w:cs="BRH Devanagari Extra"/>
-          <w:color w:val="FF0000"/>
-          <w:sz w:val="40"/>
-          <w:szCs w:val="40"/>
-        </w:rPr>
-        <w:t xml:space="preserve"> </w:t>
+        <w:t xml:space="preserve"> AµÉxrÉ  </w:t>
+      </w:r>
+      <w:r>
+        <w:rPr>
+          <w:rFonts w:ascii="BRH Devanagari Extra" w:hAnsi="BRH Devanagari Extra" w:cs="BRH Devanagari Extra"/>
+          <w:color w:val="FF0000"/>
+          <w:sz w:val="40"/>
+          <w:szCs w:val="40"/>
+        </w:rPr>
+        <w:t xml:space="preserve">- </w:t>
       </w:r>
       <w:r>
         <w:rPr>
@@ -46188,67 +44756,7 @@
           <w:sz w:val="36"/>
           <w:szCs w:val="36"/>
         </w:rPr>
-        <w:t>AÉ¢</w:t>
-      </w:r>
-      <w:proofErr w:type="gramStart"/>
-      <w:r>
-        <w:rPr>
-          <w:rFonts w:ascii="BRH Devanagari" w:hAnsi="BRH Devanagari" w:cs="BRH Devanagari"/>
-          <w:color w:val="000000"/>
-          <w:sz w:val="36"/>
-          <w:szCs w:val="36"/>
-        </w:rPr>
-        <w:t>üqrÉÉSèkuÉlÉÉå,  pÉuÉÌiÉ</w:t>
-      </w:r>
-      <w:proofErr w:type="gramEnd"/>
-      <w:r>
-        <w:rPr>
-          <w:rFonts w:ascii="BRH Devanagari" w:hAnsi="BRH Devanagari" w:cs="BRH Devanagari"/>
-          <w:color w:val="000000"/>
-          <w:sz w:val="36"/>
-          <w:szCs w:val="36"/>
-        </w:rPr>
-        <w:t xml:space="preserve"> </w:t>
-      </w:r>
-      <w:proofErr w:type="gramStart"/>
-      <w:r>
-        <w:rPr>
-          <w:rFonts w:ascii="BRH Devanagari" w:hAnsi="BRH Devanagari" w:cs="BRH Devanagari"/>
-          <w:color w:val="000000"/>
-          <w:sz w:val="36"/>
-          <w:szCs w:val="36"/>
-        </w:rPr>
-        <w:t>AaÉëå,  mÉÉuÉMüÉå</w:t>
-      </w:r>
-      <w:proofErr w:type="gramEnd"/>
-      <w:r>
-        <w:rPr>
-          <w:rFonts w:ascii="BRH Devanagari" w:hAnsi="BRH Devanagari" w:cs="BRH Devanagari"/>
-          <w:color w:val="000000"/>
-          <w:sz w:val="36"/>
-          <w:szCs w:val="36"/>
-        </w:rPr>
-        <w:t xml:space="preserve"> </w:t>
-      </w:r>
-      <w:proofErr w:type="gramStart"/>
-      <w:r>
-        <w:rPr>
-          <w:rFonts w:ascii="BRH Devanagari" w:hAnsi="BRH Devanagari" w:cs="BRH Devanagari"/>
-          <w:color w:val="000000"/>
-          <w:sz w:val="36"/>
-          <w:szCs w:val="36"/>
-        </w:rPr>
-        <w:t>ÅmÉïrÉÌiÉ,  CÌiÉ</w:t>
-      </w:r>
-      <w:proofErr w:type="gramEnd"/>
-      <w:r>
-        <w:rPr>
-          <w:rFonts w:ascii="BRH Devanagari" w:hAnsi="BRH Devanagari" w:cs="BRH Devanagari"/>
-          <w:color w:val="000000"/>
-          <w:sz w:val="36"/>
-          <w:szCs w:val="36"/>
-        </w:rPr>
-        <w:t xml:space="preserve"> cÉ || </w:t>
+        <w:t xml:space="preserve">AÉ¢üqrÉÉSèkuÉlÉÉå,  pÉuÉÌiÉ AaÉëå,  mÉÉuÉMüÉå ÅmÉïrÉÌiÉ,  CÌiÉ cÉ || </w:t>
       </w:r>
     </w:p>
     <w:p>
@@ -48147,7 +46655,7 @@
 </file>
 
 <file path=word/endnotes.xml><?xml version="1.0" encoding="utf-8"?>
-<w:endnotes xmlns:wpc="http://schemas.microsoft.com/office/word/2010/wordprocessingCanvas" xmlns:cx="http://schemas.microsoft.com/office/drawing/2014/chartex" xmlns:cx1="http://schemas.microsoft.com/office/drawing/2015/9/8/chartex" xmlns:cx2="http://schemas.microsoft.com/office/drawing/2015/10/21/chartex" xmlns:cx3="http://schemas.microsoft.com/office/drawing/2016/5/9/chartex" xmlns:cx4="http://schemas.microsoft.com/office/drawing/2016/5/10/chartex" xmlns:cx5="http://schemas.microsoft.com/office/drawing/2016/5/11/chartex" xmlns:cx6="http://schemas.microsoft.com/office/drawing/2016/5/12/chartex" xmlns:cx7="http://schemas.microsoft.com/office/drawing/2016/5/13/chartex" xmlns:cx8="http://schemas.microsoft.com/office/drawing/2016/5/14/chartex" xmlns:mc="http://schemas.openxmlformats.org/markup-compatibility/2006" xmlns:aink="http://schemas.microsoft.com/office/drawing/2016/ink" xmlns:am3d="http://schemas.microsoft.com/office/drawing/2017/model3d" xmlns:o="urn:schemas-microsoft-com:office:office" xmlns:oel="http://schemas.microsoft.com/office/2019/extlst" xmlns:r="http://schemas.openxmlformats.org/officeDocument/2006/relationships" xmlns:m="http://schemas.openxmlformats.org/officeDocument/2006/math" xmlns:v="urn:schemas-microsoft-com:vml" xmlns:wp14="http://schemas.microsoft.com/office/word/2010/wordprocessingDrawing" xmlns:wp="http://schemas.openxmlformats.org/drawingml/2006/wordprocessingDrawing" xmlns:w10="urn:schemas-microsoft-com:office:word" xmlns:w="http://schemas.openxmlformats.org/wordprocessingml/2006/main" xmlns:w14="http://schemas.microsoft.com/office/word/2010/wordml" xmlns:w15="http://schemas.microsoft.com/office/word/2012/wordml" xmlns:w16cei="http://schemas.microsoft.com/office/word/2026/wordml/cei" xmlns:w16cex="http://schemas.microsoft.com/office/word/2018/wordml/cex" xmlns:w16cid="http://schemas.microsoft.com/office/word/2016/wordml/cid" xmlns:w16="http://schemas.microsoft.com/office/word/2018/wordml" xmlns:w16du="http://schemas.microsoft.com/office/word/2023/wordml/word16du" xmlns:w16sdtdh="http://schemas.microsoft.com/office/word/2020/wordml/sdtdatahash" xmlns:w16sdtfl="http://schemas.microsoft.com/office/word/2024/wordml/sdtformatlock" xmlns:w16se="http://schemas.microsoft.com/office/word/2015/wordml/symex" xmlns:wpg="http://schemas.microsoft.com/office/word/2010/wordprocessingGroup" xmlns:wpi="http://schemas.microsoft.com/office/word/2010/wordprocessingInk" xmlns:wne="http://schemas.microsoft.com/office/word/2006/wordml" xmlns:wps="http://schemas.microsoft.com/office/word/2010/wordprocessingShape" mc:Ignorable="w14 w15 w16se w16cid w16 w16cex w16sdtdh w16sdtfl w16du wp14">
+<w:endnotes xmlns:wpc="http://schemas.microsoft.com/office/word/2010/wordprocessingCanvas" xmlns:cx="http://schemas.microsoft.com/office/drawing/2014/chartex" xmlns:cx1="http://schemas.microsoft.com/office/drawing/2015/9/8/chartex" xmlns:cx2="http://schemas.microsoft.com/office/drawing/2015/10/21/chartex" xmlns:cx3="http://schemas.microsoft.com/office/drawing/2016/5/9/chartex" xmlns:cx4="http://schemas.microsoft.com/office/drawing/2016/5/10/chartex" xmlns:cx5="http://schemas.microsoft.com/office/drawing/2016/5/11/chartex" xmlns:cx6="http://schemas.microsoft.com/office/drawing/2016/5/12/chartex" xmlns:cx7="http://schemas.microsoft.com/office/drawing/2016/5/13/chartex" xmlns:cx8="http://schemas.microsoft.com/office/drawing/2016/5/14/chartex" xmlns:mc="http://schemas.openxmlformats.org/markup-compatibility/2006" xmlns:aink="http://schemas.microsoft.com/office/drawing/2016/ink" xmlns:am3d="http://schemas.microsoft.com/office/drawing/2017/model3d" xmlns:o="urn:schemas-microsoft-com:office:office" xmlns:oel="http://schemas.microsoft.com/office/2019/extlst" xmlns:r="http://schemas.openxmlformats.org/officeDocument/2006/relationships" xmlns:m="http://schemas.openxmlformats.org/officeDocument/2006/math" xmlns:v="urn:schemas-microsoft-com:vml" xmlns:wp14="http://schemas.microsoft.com/office/word/2010/wordprocessingDrawing" xmlns:wp="http://schemas.openxmlformats.org/drawingml/2006/wordprocessingDrawing" xmlns:w10="urn:schemas-microsoft-com:office:word" xmlns:w="http://schemas.openxmlformats.org/wordprocessingml/2006/main" xmlns:w14="http://schemas.microsoft.com/office/word/2010/wordml" xmlns:w15="http://schemas.microsoft.com/office/word/2012/wordml" xmlns:w16cex="http://schemas.microsoft.com/office/word/2018/wordml/cex" xmlns:w16cid="http://schemas.microsoft.com/office/word/2016/wordml/cid" xmlns:w16="http://schemas.microsoft.com/office/word/2018/wordml" xmlns:w16du="http://schemas.microsoft.com/office/word/2023/wordml/word16du" xmlns:w16sdtdh="http://schemas.microsoft.com/office/word/2020/wordml/sdtdatahash" xmlns:w16sdtfl="http://schemas.microsoft.com/office/word/2024/wordml/sdtformatlock" xmlns:w16se="http://schemas.microsoft.com/office/word/2015/wordml/symex" xmlns:wpg="http://schemas.microsoft.com/office/word/2010/wordprocessingGroup" xmlns:wpi="http://schemas.microsoft.com/office/word/2010/wordprocessingInk" xmlns:wne="http://schemas.microsoft.com/office/word/2006/wordml" xmlns:wps="http://schemas.microsoft.com/office/word/2010/wordprocessingShape" mc:Ignorable="w14 w15 w16se w16cid w16 w16cex w16sdtdh w16sdtfl w16du wp14">
   <w:endnote w:type="separator" w:id="-1">
     <w:p>
       <w:r>
@@ -48166,7 +46674,7 @@
 </file>
 
 <file path=word/footer1.xml><?xml version="1.0" encoding="utf-8"?>
-<w:ftr xmlns:wpc="http://schemas.microsoft.com/office/word/2010/wordprocessingCanvas" xmlns:cx="http://schemas.microsoft.com/office/drawing/2014/chartex" xmlns:cx1="http://schemas.microsoft.com/office/drawing/2015/9/8/chartex" xmlns:cx2="http://schemas.microsoft.com/office/drawing/2015/10/21/chartex" xmlns:cx3="http://schemas.microsoft.com/office/drawing/2016/5/9/chartex" xmlns:cx4="http://schemas.microsoft.com/office/drawing/2016/5/10/chartex" xmlns:cx5="http://schemas.microsoft.com/office/drawing/2016/5/11/chartex" xmlns:cx6="http://schemas.microsoft.com/office/drawing/2016/5/12/chartex" xmlns:cx7="http://schemas.microsoft.com/office/drawing/2016/5/13/chartex" xmlns:cx8="http://schemas.microsoft.com/office/drawing/2016/5/14/chartex" xmlns:mc="http://schemas.openxmlformats.org/markup-compatibility/2006" xmlns:aink="http://schemas.microsoft.com/office/drawing/2016/ink" xmlns:am3d="http://schemas.microsoft.com/office/drawing/2017/model3d" xmlns:o="urn:schemas-microsoft-com:office:office" xmlns:oel="http://schemas.microsoft.com/office/2019/extlst" xmlns:r="http://schemas.openxmlformats.org/officeDocument/2006/relationships" xmlns:m="http://schemas.openxmlformats.org/officeDocument/2006/math" xmlns:v="urn:schemas-microsoft-com:vml" xmlns:wp14="http://schemas.microsoft.com/office/word/2010/wordprocessingDrawing" xmlns:wp="http://schemas.openxmlformats.org/drawingml/2006/wordprocessingDrawing" xmlns:w10="urn:schemas-microsoft-com:office:word" xmlns:w="http://schemas.openxmlformats.org/wordprocessingml/2006/main" xmlns:w14="http://schemas.microsoft.com/office/word/2010/wordml" xmlns:w15="http://schemas.microsoft.com/office/word/2012/wordml" xmlns:w16cei="http://schemas.microsoft.com/office/word/2026/wordml/cei" xmlns:w16cex="http://schemas.microsoft.com/office/word/2018/wordml/cex" xmlns:w16cid="http://schemas.microsoft.com/office/word/2016/wordml/cid" xmlns:w16="http://schemas.microsoft.com/office/word/2018/wordml" xmlns:w16du="http://schemas.microsoft.com/office/word/2023/wordml/word16du" xmlns:w16sdtdh="http://schemas.microsoft.com/office/word/2020/wordml/sdtdatahash" xmlns:w16sdtfl="http://schemas.microsoft.com/office/word/2024/wordml/sdtformatlock" xmlns:w16se="http://schemas.microsoft.com/office/word/2015/wordml/symex" xmlns:wpg="http://schemas.microsoft.com/office/word/2010/wordprocessingGroup" xmlns:wpi="http://schemas.microsoft.com/office/word/2010/wordprocessingInk" xmlns:wne="http://schemas.microsoft.com/office/word/2006/wordml" xmlns:wps="http://schemas.microsoft.com/office/word/2010/wordprocessingShape" mc:Ignorable="w14 w15 w16se w16cid w16 w16cex w16sdtdh w16sdtfl w16du wp14">
+<w:ftr xmlns:wpc="http://schemas.microsoft.com/office/word/2010/wordprocessingCanvas" xmlns:cx="http://schemas.microsoft.com/office/drawing/2014/chartex" xmlns:cx1="http://schemas.microsoft.com/office/drawing/2015/9/8/chartex" xmlns:cx2="http://schemas.microsoft.com/office/drawing/2015/10/21/chartex" xmlns:cx3="http://schemas.microsoft.com/office/drawing/2016/5/9/chartex" xmlns:cx4="http://schemas.microsoft.com/office/drawing/2016/5/10/chartex" xmlns:cx5="http://schemas.microsoft.com/office/drawing/2016/5/11/chartex" xmlns:cx6="http://schemas.microsoft.com/office/drawing/2016/5/12/chartex" xmlns:cx7="http://schemas.microsoft.com/office/drawing/2016/5/13/chartex" xmlns:cx8="http://schemas.microsoft.com/office/drawing/2016/5/14/chartex" xmlns:mc="http://schemas.openxmlformats.org/markup-compatibility/2006" xmlns:aink="http://schemas.microsoft.com/office/drawing/2016/ink" xmlns:am3d="http://schemas.microsoft.com/office/drawing/2017/model3d" xmlns:o="urn:schemas-microsoft-com:office:office" xmlns:oel="http://schemas.microsoft.com/office/2019/extlst" xmlns:r="http://schemas.openxmlformats.org/officeDocument/2006/relationships" xmlns:m="http://schemas.openxmlformats.org/officeDocument/2006/math" xmlns:v="urn:schemas-microsoft-com:vml" xmlns:wp14="http://schemas.microsoft.com/office/word/2010/wordprocessingDrawing" xmlns:wp="http://schemas.openxmlformats.org/drawingml/2006/wordprocessingDrawing" xmlns:w10="urn:schemas-microsoft-com:office:word" xmlns:w="http://schemas.openxmlformats.org/wordprocessingml/2006/main" xmlns:w14="http://schemas.microsoft.com/office/word/2010/wordml" xmlns:w15="http://schemas.microsoft.com/office/word/2012/wordml" xmlns:w16cex="http://schemas.microsoft.com/office/word/2018/wordml/cex" xmlns:w16cid="http://schemas.microsoft.com/office/word/2016/wordml/cid" xmlns:w16="http://schemas.microsoft.com/office/word/2018/wordml" xmlns:w16du="http://schemas.microsoft.com/office/word/2023/wordml/word16du" xmlns:w16sdtdh="http://schemas.microsoft.com/office/word/2020/wordml/sdtdatahash" xmlns:w16sdtfl="http://schemas.microsoft.com/office/word/2024/wordml/sdtformatlock" xmlns:w16se="http://schemas.microsoft.com/office/word/2015/wordml/symex" xmlns:wpg="http://schemas.microsoft.com/office/word/2010/wordprocessingGroup" xmlns:wpi="http://schemas.microsoft.com/office/word/2010/wordprocessingInk" xmlns:wne="http://schemas.microsoft.com/office/word/2006/wordml" xmlns:wps="http://schemas.microsoft.com/office/word/2010/wordprocessingShape" mc:Ignorable="w14 w15 w16se w16cid w16 w16cex w16sdtdh w16sdtfl w16du wp14">
   <w:p>
     <w:pPr>
       <w:pBdr>
@@ -48342,7 +46850,7 @@
 </file>
 
 <file path=word/footer2.xml><?xml version="1.0" encoding="utf-8"?>
-<w:ftr xmlns:wpc="http://schemas.microsoft.com/office/word/2010/wordprocessingCanvas" xmlns:cx="http://schemas.microsoft.com/office/drawing/2014/chartex" xmlns:cx1="http://schemas.microsoft.com/office/drawing/2015/9/8/chartex" xmlns:cx2="http://schemas.microsoft.com/office/drawing/2015/10/21/chartex" xmlns:cx3="http://schemas.microsoft.com/office/drawing/2016/5/9/chartex" xmlns:cx4="http://schemas.microsoft.com/office/drawing/2016/5/10/chartex" xmlns:cx5="http://schemas.microsoft.com/office/drawing/2016/5/11/chartex" xmlns:cx6="http://schemas.microsoft.com/office/drawing/2016/5/12/chartex" xmlns:cx7="http://schemas.microsoft.com/office/drawing/2016/5/13/chartex" xmlns:cx8="http://schemas.microsoft.com/office/drawing/2016/5/14/chartex" xmlns:mc="http://schemas.openxmlformats.org/markup-compatibility/2006" xmlns:aink="http://schemas.microsoft.com/office/drawing/2016/ink" xmlns:am3d="http://schemas.microsoft.com/office/drawing/2017/model3d" xmlns:o="urn:schemas-microsoft-com:office:office" xmlns:oel="http://schemas.microsoft.com/office/2019/extlst" xmlns:r="http://schemas.openxmlformats.org/officeDocument/2006/relationships" xmlns:m="http://schemas.openxmlformats.org/officeDocument/2006/math" xmlns:v="urn:schemas-microsoft-com:vml" xmlns:wp14="http://schemas.microsoft.com/office/word/2010/wordprocessingDrawing" xmlns:wp="http://schemas.openxmlformats.org/drawingml/2006/wordprocessingDrawing" xmlns:w10="urn:schemas-microsoft-com:office:word" xmlns:w="http://schemas.openxmlformats.org/wordprocessingml/2006/main" xmlns:w14="http://schemas.microsoft.com/office/word/2010/wordml" xmlns:w15="http://schemas.microsoft.com/office/word/2012/wordml" xmlns:w16cei="http://schemas.microsoft.com/office/word/2026/wordml/cei" xmlns:w16cex="http://schemas.microsoft.com/office/word/2018/wordml/cex" xmlns:w16cid="http://schemas.microsoft.com/office/word/2016/wordml/cid" xmlns:w16="http://schemas.microsoft.com/office/word/2018/wordml" xmlns:w16du="http://schemas.microsoft.com/office/word/2023/wordml/word16du" xmlns:w16sdtdh="http://schemas.microsoft.com/office/word/2020/wordml/sdtdatahash" xmlns:w16sdtfl="http://schemas.microsoft.com/office/word/2024/wordml/sdtformatlock" xmlns:w16se="http://schemas.microsoft.com/office/word/2015/wordml/symex" xmlns:wpg="http://schemas.microsoft.com/office/word/2010/wordprocessingGroup" xmlns:wpi="http://schemas.microsoft.com/office/word/2010/wordprocessingInk" xmlns:wne="http://schemas.microsoft.com/office/word/2006/wordml" xmlns:wps="http://schemas.microsoft.com/office/word/2010/wordprocessingShape" mc:Ignorable="w14 w15 w16se w16cid w16 w16cex w16sdtdh w16sdtfl w16du wp14">
+<w:ftr xmlns:wpc="http://schemas.microsoft.com/office/word/2010/wordprocessingCanvas" xmlns:cx="http://schemas.microsoft.com/office/drawing/2014/chartex" xmlns:cx1="http://schemas.microsoft.com/office/drawing/2015/9/8/chartex" xmlns:cx2="http://schemas.microsoft.com/office/drawing/2015/10/21/chartex" xmlns:cx3="http://schemas.microsoft.com/office/drawing/2016/5/9/chartex" xmlns:cx4="http://schemas.microsoft.com/office/drawing/2016/5/10/chartex" xmlns:cx5="http://schemas.microsoft.com/office/drawing/2016/5/11/chartex" xmlns:cx6="http://schemas.microsoft.com/office/drawing/2016/5/12/chartex" xmlns:cx7="http://schemas.microsoft.com/office/drawing/2016/5/13/chartex" xmlns:cx8="http://schemas.microsoft.com/office/drawing/2016/5/14/chartex" xmlns:mc="http://schemas.openxmlformats.org/markup-compatibility/2006" xmlns:aink="http://schemas.microsoft.com/office/drawing/2016/ink" xmlns:am3d="http://schemas.microsoft.com/office/drawing/2017/model3d" xmlns:o="urn:schemas-microsoft-com:office:office" xmlns:oel="http://schemas.microsoft.com/office/2019/extlst" xmlns:r="http://schemas.openxmlformats.org/officeDocument/2006/relationships" xmlns:m="http://schemas.openxmlformats.org/officeDocument/2006/math" xmlns:v="urn:schemas-microsoft-com:vml" xmlns:wp14="http://schemas.microsoft.com/office/word/2010/wordprocessingDrawing" xmlns:wp="http://schemas.openxmlformats.org/drawingml/2006/wordprocessingDrawing" xmlns:w10="urn:schemas-microsoft-com:office:word" xmlns:w="http://schemas.openxmlformats.org/wordprocessingml/2006/main" xmlns:w14="http://schemas.microsoft.com/office/word/2010/wordml" xmlns:w15="http://schemas.microsoft.com/office/word/2012/wordml" xmlns:w16cex="http://schemas.microsoft.com/office/word/2018/wordml/cex" xmlns:w16cid="http://schemas.microsoft.com/office/word/2016/wordml/cid" xmlns:w16="http://schemas.microsoft.com/office/word/2018/wordml" xmlns:w16du="http://schemas.microsoft.com/office/word/2023/wordml/word16du" xmlns:w16sdtdh="http://schemas.microsoft.com/office/word/2020/wordml/sdtdatahash" xmlns:w16sdtfl="http://schemas.microsoft.com/office/word/2024/wordml/sdtformatlock" xmlns:w16se="http://schemas.microsoft.com/office/word/2015/wordml/symex" xmlns:wpg="http://schemas.microsoft.com/office/word/2010/wordprocessingGroup" xmlns:wpi="http://schemas.microsoft.com/office/word/2010/wordprocessingInk" xmlns:wne="http://schemas.microsoft.com/office/word/2006/wordml" xmlns:wps="http://schemas.microsoft.com/office/word/2010/wordprocessingShape" mc:Ignorable="w14 w15 w16se w16cid w16 w16cex w16sdtdh w16sdtfl w16du wp14">
   <w:p>
     <w:pPr>
       <w:pBdr>
@@ -48515,7 +47023,7 @@
 </file>
 
 <file path=word/footer3.xml><?xml version="1.0" encoding="utf-8"?>
-<w:ftr xmlns:wpc="http://schemas.microsoft.com/office/word/2010/wordprocessingCanvas" xmlns:cx="http://schemas.microsoft.com/office/drawing/2014/chartex" xmlns:cx1="http://schemas.microsoft.com/office/drawing/2015/9/8/chartex" xmlns:cx2="http://schemas.microsoft.com/office/drawing/2015/10/21/chartex" xmlns:cx3="http://schemas.microsoft.com/office/drawing/2016/5/9/chartex" xmlns:cx4="http://schemas.microsoft.com/office/drawing/2016/5/10/chartex" xmlns:cx5="http://schemas.microsoft.com/office/drawing/2016/5/11/chartex" xmlns:cx6="http://schemas.microsoft.com/office/drawing/2016/5/12/chartex" xmlns:cx7="http://schemas.microsoft.com/office/drawing/2016/5/13/chartex" xmlns:cx8="http://schemas.microsoft.com/office/drawing/2016/5/14/chartex" xmlns:mc="http://schemas.openxmlformats.org/markup-compatibility/2006" xmlns:aink="http://schemas.microsoft.com/office/drawing/2016/ink" xmlns:am3d="http://schemas.microsoft.com/office/drawing/2017/model3d" xmlns:o="urn:schemas-microsoft-com:office:office" xmlns:oel="http://schemas.microsoft.com/office/2019/extlst" xmlns:r="http://schemas.openxmlformats.org/officeDocument/2006/relationships" xmlns:m="http://schemas.openxmlformats.org/officeDocument/2006/math" xmlns:v="urn:schemas-microsoft-com:vml" xmlns:wp14="http://schemas.microsoft.com/office/word/2010/wordprocessingDrawing" xmlns:wp="http://schemas.openxmlformats.org/drawingml/2006/wordprocessingDrawing" xmlns:w10="urn:schemas-microsoft-com:office:word" xmlns:w="http://schemas.openxmlformats.org/wordprocessingml/2006/main" xmlns:w14="http://schemas.microsoft.com/office/word/2010/wordml" xmlns:w15="http://schemas.microsoft.com/office/word/2012/wordml" xmlns:w16cei="http://schemas.microsoft.com/office/word/2026/wordml/cei" xmlns:w16cex="http://schemas.microsoft.com/office/word/2018/wordml/cex" xmlns:w16cid="http://schemas.microsoft.com/office/word/2016/wordml/cid" xmlns:w16="http://schemas.microsoft.com/office/word/2018/wordml" xmlns:w16du="http://schemas.microsoft.com/office/word/2023/wordml/word16du" xmlns:w16sdtdh="http://schemas.microsoft.com/office/word/2020/wordml/sdtdatahash" xmlns:w16sdtfl="http://schemas.microsoft.com/office/word/2024/wordml/sdtformatlock" xmlns:w16se="http://schemas.microsoft.com/office/word/2015/wordml/symex" xmlns:wpg="http://schemas.microsoft.com/office/word/2010/wordprocessingGroup" xmlns:wpi="http://schemas.microsoft.com/office/word/2010/wordprocessingInk" xmlns:wne="http://schemas.microsoft.com/office/word/2006/wordml" xmlns:wps="http://schemas.microsoft.com/office/word/2010/wordprocessingShape" mc:Ignorable="w14 w15 w16se w16cid w16 w16cex w16sdtdh w16sdtfl w16du wp14">
+<w:ftr xmlns:wpc="http://schemas.microsoft.com/office/word/2010/wordprocessingCanvas" xmlns:cx="http://schemas.microsoft.com/office/drawing/2014/chartex" xmlns:cx1="http://schemas.microsoft.com/office/drawing/2015/9/8/chartex" xmlns:cx2="http://schemas.microsoft.com/office/drawing/2015/10/21/chartex" xmlns:cx3="http://schemas.microsoft.com/office/drawing/2016/5/9/chartex" xmlns:cx4="http://schemas.microsoft.com/office/drawing/2016/5/10/chartex" xmlns:cx5="http://schemas.microsoft.com/office/drawing/2016/5/11/chartex" xmlns:cx6="http://schemas.microsoft.com/office/drawing/2016/5/12/chartex" xmlns:cx7="http://schemas.microsoft.com/office/drawing/2016/5/13/chartex" xmlns:cx8="http://schemas.microsoft.com/office/drawing/2016/5/14/chartex" xmlns:mc="http://schemas.openxmlformats.org/markup-compatibility/2006" xmlns:aink="http://schemas.microsoft.com/office/drawing/2016/ink" xmlns:am3d="http://schemas.microsoft.com/office/drawing/2017/model3d" xmlns:o="urn:schemas-microsoft-com:office:office" xmlns:oel="http://schemas.microsoft.com/office/2019/extlst" xmlns:r="http://schemas.openxmlformats.org/officeDocument/2006/relationships" xmlns:m="http://schemas.openxmlformats.org/officeDocument/2006/math" xmlns:v="urn:schemas-microsoft-com:vml" xmlns:wp14="http://schemas.microsoft.com/office/word/2010/wordprocessingDrawing" xmlns:wp="http://schemas.openxmlformats.org/drawingml/2006/wordprocessingDrawing" xmlns:w10="urn:schemas-microsoft-com:office:word" xmlns:w="http://schemas.openxmlformats.org/wordprocessingml/2006/main" xmlns:w14="http://schemas.microsoft.com/office/word/2010/wordml" xmlns:w15="http://schemas.microsoft.com/office/word/2012/wordml" xmlns:w16cex="http://schemas.microsoft.com/office/word/2018/wordml/cex" xmlns:w16cid="http://schemas.microsoft.com/office/word/2016/wordml/cid" xmlns:w16="http://schemas.microsoft.com/office/word/2018/wordml" xmlns:w16du="http://schemas.microsoft.com/office/word/2023/wordml/word16du" xmlns:w16sdtdh="http://schemas.microsoft.com/office/word/2020/wordml/sdtdatahash" xmlns:w16sdtfl="http://schemas.microsoft.com/office/word/2024/wordml/sdtformatlock" xmlns:w16se="http://schemas.microsoft.com/office/word/2015/wordml/symex" xmlns:wpg="http://schemas.microsoft.com/office/word/2010/wordprocessingGroup" xmlns:wpi="http://schemas.microsoft.com/office/word/2010/wordprocessingInk" xmlns:wne="http://schemas.microsoft.com/office/word/2006/wordml" xmlns:wps="http://schemas.microsoft.com/office/word/2010/wordprocessingShape" mc:Ignorable="w14 w15 w16se w16cid w16 w16cex w16sdtdh w16sdtfl w16du wp14">
   <w:p>
     <w:pPr>
       <w:pBdr>
@@ -48646,7 +47154,7 @@
 </file>
 
 <file path=word/footnotes.xml><?xml version="1.0" encoding="utf-8"?>
-<w:footnotes xmlns:wpc="http://schemas.microsoft.com/office/word/2010/wordprocessingCanvas" xmlns:cx="http://schemas.microsoft.com/office/drawing/2014/chartex" xmlns:cx1="http://schemas.microsoft.com/office/drawing/2015/9/8/chartex" xmlns:cx2="http://schemas.microsoft.com/office/drawing/2015/10/21/chartex" xmlns:cx3="http://schemas.microsoft.com/office/drawing/2016/5/9/chartex" xmlns:cx4="http://schemas.microsoft.com/office/drawing/2016/5/10/chartex" xmlns:cx5="http://schemas.microsoft.com/office/drawing/2016/5/11/chartex" xmlns:cx6="http://schemas.microsoft.com/office/drawing/2016/5/12/chartex" xmlns:cx7="http://schemas.microsoft.com/office/drawing/2016/5/13/chartex" xmlns:cx8="http://schemas.microsoft.com/office/drawing/2016/5/14/chartex" xmlns:mc="http://schemas.openxmlformats.org/markup-compatibility/2006" xmlns:aink="http://schemas.microsoft.com/office/drawing/2016/ink" xmlns:am3d="http://schemas.microsoft.com/office/drawing/2017/model3d" xmlns:o="urn:schemas-microsoft-com:office:office" xmlns:oel="http://schemas.microsoft.com/office/2019/extlst" xmlns:r="http://schemas.openxmlformats.org/officeDocument/2006/relationships" xmlns:m="http://schemas.openxmlformats.org/officeDocument/2006/math" xmlns:v="urn:schemas-microsoft-com:vml" xmlns:wp14="http://schemas.microsoft.com/office/word/2010/wordprocessingDrawing" xmlns:wp="http://schemas.openxmlformats.org/drawingml/2006/wordprocessingDrawing" xmlns:w10="urn:schemas-microsoft-com:office:word" xmlns:w="http://schemas.openxmlformats.org/wordprocessingml/2006/main" xmlns:w14="http://schemas.microsoft.com/office/word/2010/wordml" xmlns:w15="http://schemas.microsoft.com/office/word/2012/wordml" xmlns:w16cei="http://schemas.microsoft.com/office/word/2026/wordml/cei" xmlns:w16cex="http://schemas.microsoft.com/office/word/2018/wordml/cex" xmlns:w16cid="http://schemas.microsoft.com/office/word/2016/wordml/cid" xmlns:w16="http://schemas.microsoft.com/office/word/2018/wordml" xmlns:w16du="http://schemas.microsoft.com/office/word/2023/wordml/word16du" xmlns:w16sdtdh="http://schemas.microsoft.com/office/word/2020/wordml/sdtdatahash" xmlns:w16sdtfl="http://schemas.microsoft.com/office/word/2024/wordml/sdtformatlock" xmlns:w16se="http://schemas.microsoft.com/office/word/2015/wordml/symex" xmlns:wpg="http://schemas.microsoft.com/office/word/2010/wordprocessingGroup" xmlns:wpi="http://schemas.microsoft.com/office/word/2010/wordprocessingInk" xmlns:wne="http://schemas.microsoft.com/office/word/2006/wordml" xmlns:wps="http://schemas.microsoft.com/office/word/2010/wordprocessingShape" mc:Ignorable="w14 w15 w16se w16cid w16 w16cex w16sdtdh w16sdtfl w16du wp14">
+<w:footnotes xmlns:wpc="http://schemas.microsoft.com/office/word/2010/wordprocessingCanvas" xmlns:cx="http://schemas.microsoft.com/office/drawing/2014/chartex" xmlns:cx1="http://schemas.microsoft.com/office/drawing/2015/9/8/chartex" xmlns:cx2="http://schemas.microsoft.com/office/drawing/2015/10/21/chartex" xmlns:cx3="http://schemas.microsoft.com/office/drawing/2016/5/9/chartex" xmlns:cx4="http://schemas.microsoft.com/office/drawing/2016/5/10/chartex" xmlns:cx5="http://schemas.microsoft.com/office/drawing/2016/5/11/chartex" xmlns:cx6="http://schemas.microsoft.com/office/drawing/2016/5/12/chartex" xmlns:cx7="http://schemas.microsoft.com/office/drawing/2016/5/13/chartex" xmlns:cx8="http://schemas.microsoft.com/office/drawing/2016/5/14/chartex" xmlns:mc="http://schemas.openxmlformats.org/markup-compatibility/2006" xmlns:aink="http://schemas.microsoft.com/office/drawing/2016/ink" xmlns:am3d="http://schemas.microsoft.com/office/drawing/2017/model3d" xmlns:o="urn:schemas-microsoft-com:office:office" xmlns:oel="http://schemas.microsoft.com/office/2019/extlst" xmlns:r="http://schemas.openxmlformats.org/officeDocument/2006/relationships" xmlns:m="http://schemas.openxmlformats.org/officeDocument/2006/math" xmlns:v="urn:schemas-microsoft-com:vml" xmlns:wp14="http://schemas.microsoft.com/office/word/2010/wordprocessingDrawing" xmlns:wp="http://schemas.openxmlformats.org/drawingml/2006/wordprocessingDrawing" xmlns:w10="urn:schemas-microsoft-com:office:word" xmlns:w="http://schemas.openxmlformats.org/wordprocessingml/2006/main" xmlns:w14="http://schemas.microsoft.com/office/word/2010/wordml" xmlns:w15="http://schemas.microsoft.com/office/word/2012/wordml" xmlns:w16cex="http://schemas.microsoft.com/office/word/2018/wordml/cex" xmlns:w16cid="http://schemas.microsoft.com/office/word/2016/wordml/cid" xmlns:w16="http://schemas.microsoft.com/office/word/2018/wordml" xmlns:w16du="http://schemas.microsoft.com/office/word/2023/wordml/word16du" xmlns:w16sdtdh="http://schemas.microsoft.com/office/word/2020/wordml/sdtdatahash" xmlns:w16sdtfl="http://schemas.microsoft.com/office/word/2024/wordml/sdtformatlock" xmlns:w16se="http://schemas.microsoft.com/office/word/2015/wordml/symex" xmlns:wpg="http://schemas.microsoft.com/office/word/2010/wordprocessingGroup" xmlns:wpi="http://schemas.microsoft.com/office/word/2010/wordprocessingInk" xmlns:wne="http://schemas.microsoft.com/office/word/2006/wordml" xmlns:wps="http://schemas.microsoft.com/office/word/2010/wordprocessingShape" mc:Ignorable="w14 w15 w16se w16cid w16 w16cex w16sdtdh w16sdtfl w16du wp14">
   <w:footnote w:type="separator" w:id="-1">
     <w:p>
       <w:r>
@@ -48665,7 +47173,7 @@
 </file>
 
 <file path=word/header1.xml><?xml version="1.0" encoding="utf-8"?>
-<w:hdr xmlns:wpc="http://schemas.microsoft.com/office/word/2010/wordprocessingCanvas" xmlns:cx="http://schemas.microsoft.com/office/drawing/2014/chartex" xmlns:cx1="http://schemas.microsoft.com/office/drawing/2015/9/8/chartex" xmlns:cx2="http://schemas.microsoft.com/office/drawing/2015/10/21/chartex" xmlns:cx3="http://schemas.microsoft.com/office/drawing/2016/5/9/chartex" xmlns:cx4="http://schemas.microsoft.com/office/drawing/2016/5/10/chartex" xmlns:cx5="http://schemas.microsoft.com/office/drawing/2016/5/11/chartex" xmlns:cx6="http://schemas.microsoft.com/office/drawing/2016/5/12/chartex" xmlns:cx7="http://schemas.microsoft.com/office/drawing/2016/5/13/chartex" xmlns:cx8="http://schemas.microsoft.com/office/drawing/2016/5/14/chartex" xmlns:mc="http://schemas.openxmlformats.org/markup-compatibility/2006" xmlns:aink="http://schemas.microsoft.com/office/drawing/2016/ink" xmlns:am3d="http://schemas.microsoft.com/office/drawing/2017/model3d" xmlns:o="urn:schemas-microsoft-com:office:office" xmlns:oel="http://schemas.microsoft.com/office/2019/extlst" xmlns:r="http://schemas.openxmlformats.org/officeDocument/2006/relationships" xmlns:m="http://schemas.openxmlformats.org/officeDocument/2006/math" xmlns:v="urn:schemas-microsoft-com:vml" xmlns:wp14="http://schemas.microsoft.com/office/word/2010/wordprocessingDrawing" xmlns:wp="http://schemas.openxmlformats.org/drawingml/2006/wordprocessingDrawing" xmlns:w10="urn:schemas-microsoft-com:office:word" xmlns:w="http://schemas.openxmlformats.org/wordprocessingml/2006/main" xmlns:w14="http://schemas.microsoft.com/office/word/2010/wordml" xmlns:w15="http://schemas.microsoft.com/office/word/2012/wordml" xmlns:w16cei="http://schemas.microsoft.com/office/word/2026/wordml/cei" xmlns:w16cex="http://schemas.microsoft.com/office/word/2018/wordml/cex" xmlns:w16cid="http://schemas.microsoft.com/office/word/2016/wordml/cid" xmlns:w16="http://schemas.microsoft.com/office/word/2018/wordml" xmlns:w16du="http://schemas.microsoft.com/office/word/2023/wordml/word16du" xmlns:w16sdtdh="http://schemas.microsoft.com/office/word/2020/wordml/sdtdatahash" xmlns:w16sdtfl="http://schemas.microsoft.com/office/word/2024/wordml/sdtformatlock" xmlns:w16se="http://schemas.microsoft.com/office/word/2015/wordml/symex" xmlns:wpg="http://schemas.microsoft.com/office/word/2010/wordprocessingGroup" xmlns:wpi="http://schemas.microsoft.com/office/word/2010/wordprocessingInk" xmlns:wne="http://schemas.microsoft.com/office/word/2006/wordml" xmlns:wps="http://schemas.microsoft.com/office/word/2010/wordprocessingShape" mc:Ignorable="w14 w15 w16se w16cid w16 w16cex w16sdtdh w16sdtfl w16du wp14">
+<w:hdr xmlns:wpc="http://schemas.microsoft.com/office/word/2010/wordprocessingCanvas" xmlns:cx="http://schemas.microsoft.com/office/drawing/2014/chartex" xmlns:cx1="http://schemas.microsoft.com/office/drawing/2015/9/8/chartex" xmlns:cx2="http://schemas.microsoft.com/office/drawing/2015/10/21/chartex" xmlns:cx3="http://schemas.microsoft.com/office/drawing/2016/5/9/chartex" xmlns:cx4="http://schemas.microsoft.com/office/drawing/2016/5/10/chartex" xmlns:cx5="http://schemas.microsoft.com/office/drawing/2016/5/11/chartex" xmlns:cx6="http://schemas.microsoft.com/office/drawing/2016/5/12/chartex" xmlns:cx7="http://schemas.microsoft.com/office/drawing/2016/5/13/chartex" xmlns:cx8="http://schemas.microsoft.com/office/drawing/2016/5/14/chartex" xmlns:mc="http://schemas.openxmlformats.org/markup-compatibility/2006" xmlns:aink="http://schemas.microsoft.com/office/drawing/2016/ink" xmlns:am3d="http://schemas.microsoft.com/office/drawing/2017/model3d" xmlns:o="urn:schemas-microsoft-com:office:office" xmlns:oel="http://schemas.microsoft.com/office/2019/extlst" xmlns:r="http://schemas.openxmlformats.org/officeDocument/2006/relationships" xmlns:m="http://schemas.openxmlformats.org/officeDocument/2006/math" xmlns:v="urn:schemas-microsoft-com:vml" xmlns:wp14="http://schemas.microsoft.com/office/word/2010/wordprocessingDrawing" xmlns:wp="http://schemas.openxmlformats.org/drawingml/2006/wordprocessingDrawing" xmlns:w10="urn:schemas-microsoft-com:office:word" xmlns:w="http://schemas.openxmlformats.org/wordprocessingml/2006/main" xmlns:w14="http://schemas.microsoft.com/office/word/2010/wordml" xmlns:w15="http://schemas.microsoft.com/office/word/2012/wordml" xmlns:w16cex="http://schemas.microsoft.com/office/word/2018/wordml/cex" xmlns:w16cid="http://schemas.microsoft.com/office/word/2016/wordml/cid" xmlns:w16="http://schemas.microsoft.com/office/word/2018/wordml" xmlns:w16du="http://schemas.microsoft.com/office/word/2023/wordml/word16du" xmlns:w16sdtdh="http://schemas.microsoft.com/office/word/2020/wordml/sdtdatahash" xmlns:w16sdtfl="http://schemas.microsoft.com/office/word/2024/wordml/sdtformatlock" xmlns:w16se="http://schemas.microsoft.com/office/word/2015/wordml/symex" xmlns:wpg="http://schemas.microsoft.com/office/word/2010/wordprocessingGroup" xmlns:wpi="http://schemas.microsoft.com/office/word/2010/wordprocessingInk" xmlns:wne="http://schemas.microsoft.com/office/word/2006/wordml" xmlns:wps="http://schemas.microsoft.com/office/word/2010/wordprocessingShape" mc:Ignorable="w14 w15 w16se w16cid w16 w16cex w16sdtdh w16sdtfl w16du wp14">
   <w:p>
     <w:pPr>
       <w:pBdr>
@@ -48700,7 +47208,7 @@
 </file>
 
 <file path=word/header10.xml><?xml version="1.0" encoding="utf-8"?>
-<w:hdr xmlns:wpc="http://schemas.microsoft.com/office/word/2010/wordprocessingCanvas" xmlns:cx="http://schemas.microsoft.com/office/drawing/2014/chartex" xmlns:cx1="http://schemas.microsoft.com/office/drawing/2015/9/8/chartex" xmlns:cx2="http://schemas.microsoft.com/office/drawing/2015/10/21/chartex" xmlns:cx3="http://schemas.microsoft.com/office/drawing/2016/5/9/chartex" xmlns:cx4="http://schemas.microsoft.com/office/drawing/2016/5/10/chartex" xmlns:cx5="http://schemas.microsoft.com/office/drawing/2016/5/11/chartex" xmlns:cx6="http://schemas.microsoft.com/office/drawing/2016/5/12/chartex" xmlns:cx7="http://schemas.microsoft.com/office/drawing/2016/5/13/chartex" xmlns:cx8="http://schemas.microsoft.com/office/drawing/2016/5/14/chartex" xmlns:mc="http://schemas.openxmlformats.org/markup-compatibility/2006" xmlns:aink="http://schemas.microsoft.com/office/drawing/2016/ink" xmlns:am3d="http://schemas.microsoft.com/office/drawing/2017/model3d" xmlns:o="urn:schemas-microsoft-com:office:office" xmlns:oel="http://schemas.microsoft.com/office/2019/extlst" xmlns:r="http://schemas.openxmlformats.org/officeDocument/2006/relationships" xmlns:m="http://schemas.openxmlformats.org/officeDocument/2006/math" xmlns:v="urn:schemas-microsoft-com:vml" xmlns:wp14="http://schemas.microsoft.com/office/word/2010/wordprocessingDrawing" xmlns:wp="http://schemas.openxmlformats.org/drawingml/2006/wordprocessingDrawing" xmlns:w10="urn:schemas-microsoft-com:office:word" xmlns:w="http://schemas.openxmlformats.org/wordprocessingml/2006/main" xmlns:w14="http://schemas.microsoft.com/office/word/2010/wordml" xmlns:w15="http://schemas.microsoft.com/office/word/2012/wordml" xmlns:w16cei="http://schemas.microsoft.com/office/word/2026/wordml/cei" xmlns:w16cex="http://schemas.microsoft.com/office/word/2018/wordml/cex" xmlns:w16cid="http://schemas.microsoft.com/office/word/2016/wordml/cid" xmlns:w16="http://schemas.microsoft.com/office/word/2018/wordml" xmlns:w16du="http://schemas.microsoft.com/office/word/2023/wordml/word16du" xmlns:w16sdtdh="http://schemas.microsoft.com/office/word/2020/wordml/sdtdatahash" xmlns:w16sdtfl="http://schemas.microsoft.com/office/word/2024/wordml/sdtformatlock" xmlns:w16se="http://schemas.microsoft.com/office/word/2015/wordml/symex" xmlns:wpg="http://schemas.microsoft.com/office/word/2010/wordprocessingGroup" xmlns:wpi="http://schemas.microsoft.com/office/word/2010/wordprocessingInk" xmlns:wne="http://schemas.microsoft.com/office/word/2006/wordml" xmlns:wps="http://schemas.microsoft.com/office/word/2010/wordprocessingShape" mc:Ignorable="w14 w15 w16se w16cid w16 w16cex w16sdtdh w16sdtfl w16du wp14">
+<w:hdr xmlns:wpc="http://schemas.microsoft.com/office/word/2010/wordprocessingCanvas" xmlns:cx="http://schemas.microsoft.com/office/drawing/2014/chartex" xmlns:cx1="http://schemas.microsoft.com/office/drawing/2015/9/8/chartex" xmlns:cx2="http://schemas.microsoft.com/office/drawing/2015/10/21/chartex" xmlns:cx3="http://schemas.microsoft.com/office/drawing/2016/5/9/chartex" xmlns:cx4="http://schemas.microsoft.com/office/drawing/2016/5/10/chartex" xmlns:cx5="http://schemas.microsoft.com/office/drawing/2016/5/11/chartex" xmlns:cx6="http://schemas.microsoft.com/office/drawing/2016/5/12/chartex" xmlns:cx7="http://schemas.microsoft.com/office/drawing/2016/5/13/chartex" xmlns:cx8="http://schemas.microsoft.com/office/drawing/2016/5/14/chartex" xmlns:mc="http://schemas.openxmlformats.org/markup-compatibility/2006" xmlns:aink="http://schemas.microsoft.com/office/drawing/2016/ink" xmlns:am3d="http://schemas.microsoft.com/office/drawing/2017/model3d" xmlns:o="urn:schemas-microsoft-com:office:office" xmlns:oel="http://schemas.microsoft.com/office/2019/extlst" xmlns:r="http://schemas.openxmlformats.org/officeDocument/2006/relationships" xmlns:m="http://schemas.openxmlformats.org/officeDocument/2006/math" xmlns:v="urn:schemas-microsoft-com:vml" xmlns:wp14="http://schemas.microsoft.com/office/word/2010/wordprocessingDrawing" xmlns:wp="http://schemas.openxmlformats.org/drawingml/2006/wordprocessingDrawing" xmlns:w10="urn:schemas-microsoft-com:office:word" xmlns:w="http://schemas.openxmlformats.org/wordprocessingml/2006/main" xmlns:w14="http://schemas.microsoft.com/office/word/2010/wordml" xmlns:w15="http://schemas.microsoft.com/office/word/2012/wordml" xmlns:w16cex="http://schemas.microsoft.com/office/word/2018/wordml/cex" xmlns:w16cid="http://schemas.microsoft.com/office/word/2016/wordml/cid" xmlns:w16="http://schemas.microsoft.com/office/word/2018/wordml" xmlns:w16du="http://schemas.microsoft.com/office/word/2023/wordml/word16du" xmlns:w16sdtdh="http://schemas.microsoft.com/office/word/2020/wordml/sdtdatahash" xmlns:w16sdtfl="http://schemas.microsoft.com/office/word/2024/wordml/sdtformatlock" xmlns:w16se="http://schemas.microsoft.com/office/word/2015/wordml/symex" xmlns:wpg="http://schemas.microsoft.com/office/word/2010/wordprocessingGroup" xmlns:wpi="http://schemas.microsoft.com/office/word/2010/wordprocessingInk" xmlns:wne="http://schemas.microsoft.com/office/word/2006/wordml" xmlns:wps="http://schemas.microsoft.com/office/word/2010/wordprocessingShape" mc:Ignorable="w14 w15 w16se w16cid w16 w16cex w16sdtdh w16sdtfl w16du wp14">
   <w:p>
     <w:pPr>
       <w:widowControl w:val="0"/>
@@ -48811,7 +47319,7 @@
 </file>
 
 <file path=word/header11.xml><?xml version="1.0" encoding="utf-8"?>
-<w:hdr xmlns:wpc="http://schemas.microsoft.com/office/word/2010/wordprocessingCanvas" xmlns:cx="http://schemas.microsoft.com/office/drawing/2014/chartex" xmlns:cx1="http://schemas.microsoft.com/office/drawing/2015/9/8/chartex" xmlns:cx2="http://schemas.microsoft.com/office/drawing/2015/10/21/chartex" xmlns:cx3="http://schemas.microsoft.com/office/drawing/2016/5/9/chartex" xmlns:cx4="http://schemas.microsoft.com/office/drawing/2016/5/10/chartex" xmlns:cx5="http://schemas.microsoft.com/office/drawing/2016/5/11/chartex" xmlns:cx6="http://schemas.microsoft.com/office/drawing/2016/5/12/chartex" xmlns:cx7="http://schemas.microsoft.com/office/drawing/2016/5/13/chartex" xmlns:cx8="http://schemas.microsoft.com/office/drawing/2016/5/14/chartex" xmlns:mc="http://schemas.openxmlformats.org/markup-compatibility/2006" xmlns:aink="http://schemas.microsoft.com/office/drawing/2016/ink" xmlns:am3d="http://schemas.microsoft.com/office/drawing/2017/model3d" xmlns:o="urn:schemas-microsoft-com:office:office" xmlns:oel="http://schemas.microsoft.com/office/2019/extlst" xmlns:r="http://schemas.openxmlformats.org/officeDocument/2006/relationships" xmlns:m="http://schemas.openxmlformats.org/officeDocument/2006/math" xmlns:v="urn:schemas-microsoft-com:vml" xmlns:wp14="http://schemas.microsoft.com/office/word/2010/wordprocessingDrawing" xmlns:wp="http://schemas.openxmlformats.org/drawingml/2006/wordprocessingDrawing" xmlns:w10="urn:schemas-microsoft-com:office:word" xmlns:w="http://schemas.openxmlformats.org/wordprocessingml/2006/main" xmlns:w14="http://schemas.microsoft.com/office/word/2010/wordml" xmlns:w15="http://schemas.microsoft.com/office/word/2012/wordml" xmlns:w16cei="http://schemas.microsoft.com/office/word/2026/wordml/cei" xmlns:w16cex="http://schemas.microsoft.com/office/word/2018/wordml/cex" xmlns:w16cid="http://schemas.microsoft.com/office/word/2016/wordml/cid" xmlns:w16="http://schemas.microsoft.com/office/word/2018/wordml" xmlns:w16du="http://schemas.microsoft.com/office/word/2023/wordml/word16du" xmlns:w16sdtdh="http://schemas.microsoft.com/office/word/2020/wordml/sdtdatahash" xmlns:w16sdtfl="http://schemas.microsoft.com/office/word/2024/wordml/sdtformatlock" xmlns:w16se="http://schemas.microsoft.com/office/word/2015/wordml/symex" xmlns:wpg="http://schemas.microsoft.com/office/word/2010/wordprocessingGroup" xmlns:wpi="http://schemas.microsoft.com/office/word/2010/wordprocessingInk" xmlns:wne="http://schemas.microsoft.com/office/word/2006/wordml" xmlns:wps="http://schemas.microsoft.com/office/word/2010/wordprocessingShape" mc:Ignorable="w14 w15 w16se w16cid w16 w16cex w16sdtdh w16sdtfl w16du wp14">
+<w:hdr xmlns:wpc="http://schemas.microsoft.com/office/word/2010/wordprocessingCanvas" xmlns:cx="http://schemas.microsoft.com/office/drawing/2014/chartex" xmlns:cx1="http://schemas.microsoft.com/office/drawing/2015/9/8/chartex" xmlns:cx2="http://schemas.microsoft.com/office/drawing/2015/10/21/chartex" xmlns:cx3="http://schemas.microsoft.com/office/drawing/2016/5/9/chartex" xmlns:cx4="http://schemas.microsoft.com/office/drawing/2016/5/10/chartex" xmlns:cx5="http://schemas.microsoft.com/office/drawing/2016/5/11/chartex" xmlns:cx6="http://schemas.microsoft.com/office/drawing/2016/5/12/chartex" xmlns:cx7="http://schemas.microsoft.com/office/drawing/2016/5/13/chartex" xmlns:cx8="http://schemas.microsoft.com/office/drawing/2016/5/14/chartex" xmlns:mc="http://schemas.openxmlformats.org/markup-compatibility/2006" xmlns:aink="http://schemas.microsoft.com/office/drawing/2016/ink" xmlns:am3d="http://schemas.microsoft.com/office/drawing/2017/model3d" xmlns:o="urn:schemas-microsoft-com:office:office" xmlns:oel="http://schemas.microsoft.com/office/2019/extlst" xmlns:r="http://schemas.openxmlformats.org/officeDocument/2006/relationships" xmlns:m="http://schemas.openxmlformats.org/officeDocument/2006/math" xmlns:v="urn:schemas-microsoft-com:vml" xmlns:wp14="http://schemas.microsoft.com/office/word/2010/wordprocessingDrawing" xmlns:wp="http://schemas.openxmlformats.org/drawingml/2006/wordprocessingDrawing" xmlns:w10="urn:schemas-microsoft-com:office:word" xmlns:w="http://schemas.openxmlformats.org/wordprocessingml/2006/main" xmlns:w14="http://schemas.microsoft.com/office/word/2010/wordml" xmlns:w15="http://schemas.microsoft.com/office/word/2012/wordml" xmlns:w16cex="http://schemas.microsoft.com/office/word/2018/wordml/cex" xmlns:w16cid="http://schemas.microsoft.com/office/word/2016/wordml/cid" xmlns:w16="http://schemas.microsoft.com/office/word/2018/wordml" xmlns:w16du="http://schemas.microsoft.com/office/word/2023/wordml/word16du" xmlns:w16sdtdh="http://schemas.microsoft.com/office/word/2020/wordml/sdtdatahash" xmlns:w16sdtfl="http://schemas.microsoft.com/office/word/2024/wordml/sdtformatlock" xmlns:w16se="http://schemas.microsoft.com/office/word/2015/wordml/symex" xmlns:wpg="http://schemas.microsoft.com/office/word/2010/wordprocessingGroup" xmlns:wpi="http://schemas.microsoft.com/office/word/2010/wordprocessingInk" xmlns:wne="http://schemas.microsoft.com/office/word/2006/wordml" xmlns:wps="http://schemas.microsoft.com/office/word/2010/wordprocessingShape" mc:Ignorable="w14 w15 w16se w16cid w16 w16cex w16sdtdh w16sdtfl w16du wp14">
   <w:p>
     <w:pPr>
       <w:widowControl w:val="0"/>
@@ -48923,7 +47431,7 @@
 </file>
 
 <file path=word/header12.xml><?xml version="1.0" encoding="utf-8"?>
-<w:hdr xmlns:wpc="http://schemas.microsoft.com/office/word/2010/wordprocessingCanvas" xmlns:cx="http://schemas.microsoft.com/office/drawing/2014/chartex" xmlns:cx1="http://schemas.microsoft.com/office/drawing/2015/9/8/chartex" xmlns:cx2="http://schemas.microsoft.com/office/drawing/2015/10/21/chartex" xmlns:cx3="http://schemas.microsoft.com/office/drawing/2016/5/9/chartex" xmlns:cx4="http://schemas.microsoft.com/office/drawing/2016/5/10/chartex" xmlns:cx5="http://schemas.microsoft.com/office/drawing/2016/5/11/chartex" xmlns:cx6="http://schemas.microsoft.com/office/drawing/2016/5/12/chartex" xmlns:cx7="http://schemas.microsoft.com/office/drawing/2016/5/13/chartex" xmlns:cx8="http://schemas.microsoft.com/office/drawing/2016/5/14/chartex" xmlns:mc="http://schemas.openxmlformats.org/markup-compatibility/2006" xmlns:aink="http://schemas.microsoft.com/office/drawing/2016/ink" xmlns:am3d="http://schemas.microsoft.com/office/drawing/2017/model3d" xmlns:o="urn:schemas-microsoft-com:office:office" xmlns:oel="http://schemas.microsoft.com/office/2019/extlst" xmlns:r="http://schemas.openxmlformats.org/officeDocument/2006/relationships" xmlns:m="http://schemas.openxmlformats.org/officeDocument/2006/math" xmlns:v="urn:schemas-microsoft-com:vml" xmlns:wp14="http://schemas.microsoft.com/office/word/2010/wordprocessingDrawing" xmlns:wp="http://schemas.openxmlformats.org/drawingml/2006/wordprocessingDrawing" xmlns:w10="urn:schemas-microsoft-com:office:word" xmlns:w="http://schemas.openxmlformats.org/wordprocessingml/2006/main" xmlns:w14="http://schemas.microsoft.com/office/word/2010/wordml" xmlns:w15="http://schemas.microsoft.com/office/word/2012/wordml" xmlns:w16cei="http://schemas.microsoft.com/office/word/2026/wordml/cei" xmlns:w16cex="http://schemas.microsoft.com/office/word/2018/wordml/cex" xmlns:w16cid="http://schemas.microsoft.com/office/word/2016/wordml/cid" xmlns:w16="http://schemas.microsoft.com/office/word/2018/wordml" xmlns:w16du="http://schemas.microsoft.com/office/word/2023/wordml/word16du" xmlns:w16sdtdh="http://schemas.microsoft.com/office/word/2020/wordml/sdtdatahash" xmlns:w16sdtfl="http://schemas.microsoft.com/office/word/2024/wordml/sdtformatlock" xmlns:w16se="http://schemas.microsoft.com/office/word/2015/wordml/symex" xmlns:wpg="http://schemas.microsoft.com/office/word/2010/wordprocessingGroup" xmlns:wpi="http://schemas.microsoft.com/office/word/2010/wordprocessingInk" xmlns:wne="http://schemas.microsoft.com/office/word/2006/wordml" xmlns:wps="http://schemas.microsoft.com/office/word/2010/wordprocessingShape" mc:Ignorable="w14 w15 w16se w16cid w16 w16cex w16sdtdh w16sdtfl w16du wp14">
+<w:hdr xmlns:wpc="http://schemas.microsoft.com/office/word/2010/wordprocessingCanvas" xmlns:cx="http://schemas.microsoft.com/office/drawing/2014/chartex" xmlns:cx1="http://schemas.microsoft.com/office/drawing/2015/9/8/chartex" xmlns:cx2="http://schemas.microsoft.com/office/drawing/2015/10/21/chartex" xmlns:cx3="http://schemas.microsoft.com/office/drawing/2016/5/9/chartex" xmlns:cx4="http://schemas.microsoft.com/office/drawing/2016/5/10/chartex" xmlns:cx5="http://schemas.microsoft.com/office/drawing/2016/5/11/chartex" xmlns:cx6="http://schemas.microsoft.com/office/drawing/2016/5/12/chartex" xmlns:cx7="http://schemas.microsoft.com/office/drawing/2016/5/13/chartex" xmlns:cx8="http://schemas.microsoft.com/office/drawing/2016/5/14/chartex" xmlns:mc="http://schemas.openxmlformats.org/markup-compatibility/2006" xmlns:aink="http://schemas.microsoft.com/office/drawing/2016/ink" xmlns:am3d="http://schemas.microsoft.com/office/drawing/2017/model3d" xmlns:o="urn:schemas-microsoft-com:office:office" xmlns:oel="http://schemas.microsoft.com/office/2019/extlst" xmlns:r="http://schemas.openxmlformats.org/officeDocument/2006/relationships" xmlns:m="http://schemas.openxmlformats.org/officeDocument/2006/math" xmlns:v="urn:schemas-microsoft-com:vml" xmlns:wp14="http://schemas.microsoft.com/office/word/2010/wordprocessingDrawing" xmlns:wp="http://schemas.openxmlformats.org/drawingml/2006/wordprocessingDrawing" xmlns:w10="urn:schemas-microsoft-com:office:word" xmlns:w="http://schemas.openxmlformats.org/wordprocessingml/2006/main" xmlns:w14="http://schemas.microsoft.com/office/word/2010/wordml" xmlns:w15="http://schemas.microsoft.com/office/word/2012/wordml" xmlns:w16cex="http://schemas.microsoft.com/office/word/2018/wordml/cex" xmlns:w16cid="http://schemas.microsoft.com/office/word/2016/wordml/cid" xmlns:w16="http://schemas.microsoft.com/office/word/2018/wordml" xmlns:w16du="http://schemas.microsoft.com/office/word/2023/wordml/word16du" xmlns:w16sdtdh="http://schemas.microsoft.com/office/word/2020/wordml/sdtdatahash" xmlns:w16sdtfl="http://schemas.microsoft.com/office/word/2024/wordml/sdtformatlock" xmlns:w16se="http://schemas.microsoft.com/office/word/2015/wordml/symex" xmlns:wpg="http://schemas.microsoft.com/office/word/2010/wordprocessingGroup" xmlns:wpi="http://schemas.microsoft.com/office/word/2010/wordprocessingInk" xmlns:wne="http://schemas.microsoft.com/office/word/2006/wordml" xmlns:wps="http://schemas.microsoft.com/office/word/2010/wordprocessingShape" mc:Ignorable="w14 w15 w16se w16cid w16 w16cex w16sdtdh w16sdtfl w16du wp14">
   <w:p>
     <w:pPr>
       <w:widowControl w:val="0"/>
@@ -49033,7 +47541,7 @@
 </file>
 
 <file path=word/header13.xml><?xml version="1.0" encoding="utf-8"?>
-<w:hdr xmlns:wpc="http://schemas.microsoft.com/office/word/2010/wordprocessingCanvas" xmlns:cx="http://schemas.microsoft.com/office/drawing/2014/chartex" xmlns:cx1="http://schemas.microsoft.com/office/drawing/2015/9/8/chartex" xmlns:cx2="http://schemas.microsoft.com/office/drawing/2015/10/21/chartex" xmlns:cx3="http://schemas.microsoft.com/office/drawing/2016/5/9/chartex" xmlns:cx4="http://schemas.microsoft.com/office/drawing/2016/5/10/chartex" xmlns:cx5="http://schemas.microsoft.com/office/drawing/2016/5/11/chartex" xmlns:cx6="http://schemas.microsoft.com/office/drawing/2016/5/12/chartex" xmlns:cx7="http://schemas.microsoft.com/office/drawing/2016/5/13/chartex" xmlns:cx8="http://schemas.microsoft.com/office/drawing/2016/5/14/chartex" xmlns:mc="http://schemas.openxmlformats.org/markup-compatibility/2006" xmlns:aink="http://schemas.microsoft.com/office/drawing/2016/ink" xmlns:am3d="http://schemas.microsoft.com/office/drawing/2017/model3d" xmlns:o="urn:schemas-microsoft-com:office:office" xmlns:oel="http://schemas.microsoft.com/office/2019/extlst" xmlns:r="http://schemas.openxmlformats.org/officeDocument/2006/relationships" xmlns:m="http://schemas.openxmlformats.org/officeDocument/2006/math" xmlns:v="urn:schemas-microsoft-com:vml" xmlns:wp14="http://schemas.microsoft.com/office/word/2010/wordprocessingDrawing" xmlns:wp="http://schemas.openxmlformats.org/drawingml/2006/wordprocessingDrawing" xmlns:w10="urn:schemas-microsoft-com:office:word" xmlns:w="http://schemas.openxmlformats.org/wordprocessingml/2006/main" xmlns:w14="http://schemas.microsoft.com/office/word/2010/wordml" xmlns:w15="http://schemas.microsoft.com/office/word/2012/wordml" xmlns:w16cei="http://schemas.microsoft.com/office/word/2026/wordml/cei" xmlns:w16cex="http://schemas.microsoft.com/office/word/2018/wordml/cex" xmlns:w16cid="http://schemas.microsoft.com/office/word/2016/wordml/cid" xmlns:w16="http://schemas.microsoft.com/office/word/2018/wordml" xmlns:w16du="http://schemas.microsoft.com/office/word/2023/wordml/word16du" xmlns:w16sdtdh="http://schemas.microsoft.com/office/word/2020/wordml/sdtdatahash" xmlns:w16sdtfl="http://schemas.microsoft.com/office/word/2024/wordml/sdtformatlock" xmlns:w16se="http://schemas.microsoft.com/office/word/2015/wordml/symex" xmlns:wpg="http://schemas.microsoft.com/office/word/2010/wordprocessingGroup" xmlns:wpi="http://schemas.microsoft.com/office/word/2010/wordprocessingInk" xmlns:wne="http://schemas.microsoft.com/office/word/2006/wordml" xmlns:wps="http://schemas.microsoft.com/office/word/2010/wordprocessingShape" mc:Ignorable="w14 w15 w16se w16cid w16 w16cex w16sdtdh w16sdtfl w16du wp14">
+<w:hdr xmlns:wpc="http://schemas.microsoft.com/office/word/2010/wordprocessingCanvas" xmlns:cx="http://schemas.microsoft.com/office/drawing/2014/chartex" xmlns:cx1="http://schemas.microsoft.com/office/drawing/2015/9/8/chartex" xmlns:cx2="http://schemas.microsoft.com/office/drawing/2015/10/21/chartex" xmlns:cx3="http://schemas.microsoft.com/office/drawing/2016/5/9/chartex" xmlns:cx4="http://schemas.microsoft.com/office/drawing/2016/5/10/chartex" xmlns:cx5="http://schemas.microsoft.com/office/drawing/2016/5/11/chartex" xmlns:cx6="http://schemas.microsoft.com/office/drawing/2016/5/12/chartex" xmlns:cx7="http://schemas.microsoft.com/office/drawing/2016/5/13/chartex" xmlns:cx8="http://schemas.microsoft.com/office/drawing/2016/5/14/chartex" xmlns:mc="http://schemas.openxmlformats.org/markup-compatibility/2006" xmlns:aink="http://schemas.microsoft.com/office/drawing/2016/ink" xmlns:am3d="http://schemas.microsoft.com/office/drawing/2017/model3d" xmlns:o="urn:schemas-microsoft-com:office:office" xmlns:oel="http://schemas.microsoft.com/office/2019/extlst" xmlns:r="http://schemas.openxmlformats.org/officeDocument/2006/relationships" xmlns:m="http://schemas.openxmlformats.org/officeDocument/2006/math" xmlns:v="urn:schemas-microsoft-com:vml" xmlns:wp14="http://schemas.microsoft.com/office/word/2010/wordprocessingDrawing" xmlns:wp="http://schemas.openxmlformats.org/drawingml/2006/wordprocessingDrawing" xmlns:w10="urn:schemas-microsoft-com:office:word" xmlns:w="http://schemas.openxmlformats.org/wordprocessingml/2006/main" xmlns:w14="http://schemas.microsoft.com/office/word/2010/wordml" xmlns:w15="http://schemas.microsoft.com/office/word/2012/wordml" xmlns:w16cex="http://schemas.microsoft.com/office/word/2018/wordml/cex" xmlns:w16cid="http://schemas.microsoft.com/office/word/2016/wordml/cid" xmlns:w16="http://schemas.microsoft.com/office/word/2018/wordml" xmlns:w16du="http://schemas.microsoft.com/office/word/2023/wordml/word16du" xmlns:w16sdtdh="http://schemas.microsoft.com/office/word/2020/wordml/sdtdatahash" xmlns:w16sdtfl="http://schemas.microsoft.com/office/word/2024/wordml/sdtformatlock" xmlns:w16se="http://schemas.microsoft.com/office/word/2015/wordml/symex" xmlns:wpg="http://schemas.microsoft.com/office/word/2010/wordprocessingGroup" xmlns:wpi="http://schemas.microsoft.com/office/word/2010/wordprocessingInk" xmlns:wne="http://schemas.microsoft.com/office/word/2006/wordml" xmlns:wps="http://schemas.microsoft.com/office/word/2010/wordprocessingShape" mc:Ignorable="w14 w15 w16se w16cid w16 w16cex w16sdtdh w16sdtfl w16du wp14">
   <w:p>
     <w:pPr>
       <w:widowControl w:val="0"/>
@@ -49166,7 +47674,7 @@
 </file>
 
 <file path=word/header14.xml><?xml version="1.0" encoding="utf-8"?>
-<w:hdr xmlns:wpc="http://schemas.microsoft.com/office/word/2010/wordprocessingCanvas" xmlns:cx="http://schemas.microsoft.com/office/drawing/2014/chartex" xmlns:cx1="http://schemas.microsoft.com/office/drawing/2015/9/8/chartex" xmlns:cx2="http://schemas.microsoft.com/office/drawing/2015/10/21/chartex" xmlns:cx3="http://schemas.microsoft.com/office/drawing/2016/5/9/chartex" xmlns:cx4="http://schemas.microsoft.com/office/drawing/2016/5/10/chartex" xmlns:cx5="http://schemas.microsoft.com/office/drawing/2016/5/11/chartex" xmlns:cx6="http://schemas.microsoft.com/office/drawing/2016/5/12/chartex" xmlns:cx7="http://schemas.microsoft.com/office/drawing/2016/5/13/chartex" xmlns:cx8="http://schemas.microsoft.com/office/drawing/2016/5/14/chartex" xmlns:mc="http://schemas.openxmlformats.org/markup-compatibility/2006" xmlns:aink="http://schemas.microsoft.com/office/drawing/2016/ink" xmlns:am3d="http://schemas.microsoft.com/office/drawing/2017/model3d" xmlns:o="urn:schemas-microsoft-com:office:office" xmlns:oel="http://schemas.microsoft.com/office/2019/extlst" xmlns:r="http://schemas.openxmlformats.org/officeDocument/2006/relationships" xmlns:m="http://schemas.openxmlformats.org/officeDocument/2006/math" xmlns:v="urn:schemas-microsoft-com:vml" xmlns:wp14="http://schemas.microsoft.com/office/word/2010/wordprocessingDrawing" xmlns:wp="http://schemas.openxmlformats.org/drawingml/2006/wordprocessingDrawing" xmlns:w10="urn:schemas-microsoft-com:office:word" xmlns:w="http://schemas.openxmlformats.org/wordprocessingml/2006/main" xmlns:w14="http://schemas.microsoft.com/office/word/2010/wordml" xmlns:w15="http://schemas.microsoft.com/office/word/2012/wordml" xmlns:w16cei="http://schemas.microsoft.com/office/word/2026/wordml/cei" xmlns:w16cex="http://schemas.microsoft.com/office/word/2018/wordml/cex" xmlns:w16cid="http://schemas.microsoft.com/office/word/2016/wordml/cid" xmlns:w16="http://schemas.microsoft.com/office/word/2018/wordml" xmlns:w16du="http://schemas.microsoft.com/office/word/2023/wordml/word16du" xmlns:w16sdtdh="http://schemas.microsoft.com/office/word/2020/wordml/sdtdatahash" xmlns:w16sdtfl="http://schemas.microsoft.com/office/word/2024/wordml/sdtformatlock" xmlns:w16se="http://schemas.microsoft.com/office/word/2015/wordml/symex" xmlns:wpg="http://schemas.microsoft.com/office/word/2010/wordprocessingGroup" xmlns:wpi="http://schemas.microsoft.com/office/word/2010/wordprocessingInk" xmlns:wne="http://schemas.microsoft.com/office/word/2006/wordml" xmlns:wps="http://schemas.microsoft.com/office/word/2010/wordprocessingShape" mc:Ignorable="w14 w15 w16se w16cid w16 w16cex w16sdtdh w16sdtfl w16du wp14">
+<w:hdr xmlns:wpc="http://schemas.microsoft.com/office/word/2010/wordprocessingCanvas" xmlns:cx="http://schemas.microsoft.com/office/drawing/2014/chartex" xmlns:cx1="http://schemas.microsoft.com/office/drawing/2015/9/8/chartex" xmlns:cx2="http://schemas.microsoft.com/office/drawing/2015/10/21/chartex" xmlns:cx3="http://schemas.microsoft.com/office/drawing/2016/5/9/chartex" xmlns:cx4="http://schemas.microsoft.com/office/drawing/2016/5/10/chartex" xmlns:cx5="http://schemas.microsoft.com/office/drawing/2016/5/11/chartex" xmlns:cx6="http://schemas.microsoft.com/office/drawing/2016/5/12/chartex" xmlns:cx7="http://schemas.microsoft.com/office/drawing/2016/5/13/chartex" xmlns:cx8="http://schemas.microsoft.com/office/drawing/2016/5/14/chartex" xmlns:mc="http://schemas.openxmlformats.org/markup-compatibility/2006" xmlns:aink="http://schemas.microsoft.com/office/drawing/2016/ink" xmlns:am3d="http://schemas.microsoft.com/office/drawing/2017/model3d" xmlns:o="urn:schemas-microsoft-com:office:office" xmlns:oel="http://schemas.microsoft.com/office/2019/extlst" xmlns:r="http://schemas.openxmlformats.org/officeDocument/2006/relationships" xmlns:m="http://schemas.openxmlformats.org/officeDocument/2006/math" xmlns:v="urn:schemas-microsoft-com:vml" xmlns:wp14="http://schemas.microsoft.com/office/word/2010/wordprocessingDrawing" xmlns:wp="http://schemas.openxmlformats.org/drawingml/2006/wordprocessingDrawing" xmlns:w10="urn:schemas-microsoft-com:office:word" xmlns:w="http://schemas.openxmlformats.org/wordprocessingml/2006/main" xmlns:w14="http://schemas.microsoft.com/office/word/2010/wordml" xmlns:w15="http://schemas.microsoft.com/office/word/2012/wordml" xmlns:w16cex="http://schemas.microsoft.com/office/word/2018/wordml/cex" xmlns:w16cid="http://schemas.microsoft.com/office/word/2016/wordml/cid" xmlns:w16="http://schemas.microsoft.com/office/word/2018/wordml" xmlns:w16du="http://schemas.microsoft.com/office/word/2023/wordml/word16du" xmlns:w16sdtdh="http://schemas.microsoft.com/office/word/2020/wordml/sdtdatahash" xmlns:w16sdtfl="http://schemas.microsoft.com/office/word/2024/wordml/sdtformatlock" xmlns:w16se="http://schemas.microsoft.com/office/word/2015/wordml/symex" xmlns:wpg="http://schemas.microsoft.com/office/word/2010/wordprocessingGroup" xmlns:wpi="http://schemas.microsoft.com/office/word/2010/wordprocessingInk" xmlns:wne="http://schemas.microsoft.com/office/word/2006/wordml" xmlns:wps="http://schemas.microsoft.com/office/word/2010/wordprocessingShape" mc:Ignorable="w14 w15 w16se w16cid w16 w16cex w16sdtdh w16sdtfl w16du wp14">
   <w:p>
     <w:pPr>
       <w:widowControl w:val="0"/>
@@ -49276,7 +47784,7 @@
 </file>
 
 <file path=word/header15.xml><?xml version="1.0" encoding="utf-8"?>
-<w:hdr xmlns:wpc="http://schemas.microsoft.com/office/word/2010/wordprocessingCanvas" xmlns:cx="http://schemas.microsoft.com/office/drawing/2014/chartex" xmlns:cx1="http://schemas.microsoft.com/office/drawing/2015/9/8/chartex" xmlns:cx2="http://schemas.microsoft.com/office/drawing/2015/10/21/chartex" xmlns:cx3="http://schemas.microsoft.com/office/drawing/2016/5/9/chartex" xmlns:cx4="http://schemas.microsoft.com/office/drawing/2016/5/10/chartex" xmlns:cx5="http://schemas.microsoft.com/office/drawing/2016/5/11/chartex" xmlns:cx6="http://schemas.microsoft.com/office/drawing/2016/5/12/chartex" xmlns:cx7="http://schemas.microsoft.com/office/drawing/2016/5/13/chartex" xmlns:cx8="http://schemas.microsoft.com/office/drawing/2016/5/14/chartex" xmlns:mc="http://schemas.openxmlformats.org/markup-compatibility/2006" xmlns:aink="http://schemas.microsoft.com/office/drawing/2016/ink" xmlns:am3d="http://schemas.microsoft.com/office/drawing/2017/model3d" xmlns:o="urn:schemas-microsoft-com:office:office" xmlns:oel="http://schemas.microsoft.com/office/2019/extlst" xmlns:r="http://schemas.openxmlformats.org/officeDocument/2006/relationships" xmlns:m="http://schemas.openxmlformats.org/officeDocument/2006/math" xmlns:v="urn:schemas-microsoft-com:vml" xmlns:wp14="http://schemas.microsoft.com/office/word/2010/wordprocessingDrawing" xmlns:wp="http://schemas.openxmlformats.org/drawingml/2006/wordprocessingDrawing" xmlns:w10="urn:schemas-microsoft-com:office:word" xmlns:w="http://schemas.openxmlformats.org/wordprocessingml/2006/main" xmlns:w14="http://schemas.microsoft.com/office/word/2010/wordml" xmlns:w15="http://schemas.microsoft.com/office/word/2012/wordml" xmlns:w16cei="http://schemas.microsoft.com/office/word/2026/wordml/cei" xmlns:w16cex="http://schemas.microsoft.com/office/word/2018/wordml/cex" xmlns:w16cid="http://schemas.microsoft.com/office/word/2016/wordml/cid" xmlns:w16="http://schemas.microsoft.com/office/word/2018/wordml" xmlns:w16du="http://schemas.microsoft.com/office/word/2023/wordml/word16du" xmlns:w16sdtdh="http://schemas.microsoft.com/office/word/2020/wordml/sdtdatahash" xmlns:w16sdtfl="http://schemas.microsoft.com/office/word/2024/wordml/sdtformatlock" xmlns:w16se="http://schemas.microsoft.com/office/word/2015/wordml/symex" xmlns:wpg="http://schemas.microsoft.com/office/word/2010/wordprocessingGroup" xmlns:wpi="http://schemas.microsoft.com/office/word/2010/wordprocessingInk" xmlns:wne="http://schemas.microsoft.com/office/word/2006/wordml" xmlns:wps="http://schemas.microsoft.com/office/word/2010/wordprocessingShape" mc:Ignorable="w14 w15 w16se w16cid w16 w16cex w16sdtdh w16sdtfl w16du wp14">
+<w:hdr xmlns:wpc="http://schemas.microsoft.com/office/word/2010/wordprocessingCanvas" xmlns:cx="http://schemas.microsoft.com/office/drawing/2014/chartex" xmlns:cx1="http://schemas.microsoft.com/office/drawing/2015/9/8/chartex" xmlns:cx2="http://schemas.microsoft.com/office/drawing/2015/10/21/chartex" xmlns:cx3="http://schemas.microsoft.com/office/drawing/2016/5/9/chartex" xmlns:cx4="http://schemas.microsoft.com/office/drawing/2016/5/10/chartex" xmlns:cx5="http://schemas.microsoft.com/office/drawing/2016/5/11/chartex" xmlns:cx6="http://schemas.microsoft.com/office/drawing/2016/5/12/chartex" xmlns:cx7="http://schemas.microsoft.com/office/drawing/2016/5/13/chartex" xmlns:cx8="http://schemas.microsoft.com/office/drawing/2016/5/14/chartex" xmlns:mc="http://schemas.openxmlformats.org/markup-compatibility/2006" xmlns:aink="http://schemas.microsoft.com/office/drawing/2016/ink" xmlns:am3d="http://schemas.microsoft.com/office/drawing/2017/model3d" xmlns:o="urn:schemas-microsoft-com:office:office" xmlns:oel="http://schemas.microsoft.com/office/2019/extlst" xmlns:r="http://schemas.openxmlformats.org/officeDocument/2006/relationships" xmlns:m="http://schemas.openxmlformats.org/officeDocument/2006/math" xmlns:v="urn:schemas-microsoft-com:vml" xmlns:wp14="http://schemas.microsoft.com/office/word/2010/wordprocessingDrawing" xmlns:wp="http://schemas.openxmlformats.org/drawingml/2006/wordprocessingDrawing" xmlns:w10="urn:schemas-microsoft-com:office:word" xmlns:w="http://schemas.openxmlformats.org/wordprocessingml/2006/main" xmlns:w14="http://schemas.microsoft.com/office/word/2010/wordml" xmlns:w15="http://schemas.microsoft.com/office/word/2012/wordml" xmlns:w16cex="http://schemas.microsoft.com/office/word/2018/wordml/cex" xmlns:w16cid="http://schemas.microsoft.com/office/word/2016/wordml/cid" xmlns:w16="http://schemas.microsoft.com/office/word/2018/wordml" xmlns:w16du="http://schemas.microsoft.com/office/word/2023/wordml/word16du" xmlns:w16sdtdh="http://schemas.microsoft.com/office/word/2020/wordml/sdtdatahash" xmlns:w16sdtfl="http://schemas.microsoft.com/office/word/2024/wordml/sdtformatlock" xmlns:w16se="http://schemas.microsoft.com/office/word/2015/wordml/symex" xmlns:wpg="http://schemas.microsoft.com/office/word/2010/wordprocessingGroup" xmlns:wpi="http://schemas.microsoft.com/office/word/2010/wordprocessingInk" xmlns:wne="http://schemas.microsoft.com/office/word/2006/wordml" xmlns:wps="http://schemas.microsoft.com/office/word/2010/wordprocessingShape" mc:Ignorable="w14 w15 w16se w16cid w16 w16cex w16sdtdh w16sdtfl w16du wp14">
   <w:p>
     <w:pPr>
       <w:widowControl w:val="0"/>
@@ -49409,7 +47917,7 @@
 </file>
 
 <file path=word/header16.xml><?xml version="1.0" encoding="utf-8"?>
-<w:hdr xmlns:wpc="http://schemas.microsoft.com/office/word/2010/wordprocessingCanvas" xmlns:cx="http://schemas.microsoft.com/office/drawing/2014/chartex" xmlns:cx1="http://schemas.microsoft.com/office/drawing/2015/9/8/chartex" xmlns:cx2="http://schemas.microsoft.com/office/drawing/2015/10/21/chartex" xmlns:cx3="http://schemas.microsoft.com/office/drawing/2016/5/9/chartex" xmlns:cx4="http://schemas.microsoft.com/office/drawing/2016/5/10/chartex" xmlns:cx5="http://schemas.microsoft.com/office/drawing/2016/5/11/chartex" xmlns:cx6="http://schemas.microsoft.com/office/drawing/2016/5/12/chartex" xmlns:cx7="http://schemas.microsoft.com/office/drawing/2016/5/13/chartex" xmlns:cx8="http://schemas.microsoft.com/office/drawing/2016/5/14/chartex" xmlns:mc="http://schemas.openxmlformats.org/markup-compatibility/2006" xmlns:aink="http://schemas.microsoft.com/office/drawing/2016/ink" xmlns:am3d="http://schemas.microsoft.com/office/drawing/2017/model3d" xmlns:o="urn:schemas-microsoft-com:office:office" xmlns:oel="http://schemas.microsoft.com/office/2019/extlst" xmlns:r="http://schemas.openxmlformats.org/officeDocument/2006/relationships" xmlns:m="http://schemas.openxmlformats.org/officeDocument/2006/math" xmlns:v="urn:schemas-microsoft-com:vml" xmlns:wp14="http://schemas.microsoft.com/office/word/2010/wordprocessingDrawing" xmlns:wp="http://schemas.openxmlformats.org/drawingml/2006/wordprocessingDrawing" xmlns:w10="urn:schemas-microsoft-com:office:word" xmlns:w="http://schemas.openxmlformats.org/wordprocessingml/2006/main" xmlns:w14="http://schemas.microsoft.com/office/word/2010/wordml" xmlns:w15="http://schemas.microsoft.com/office/word/2012/wordml" xmlns:w16cei="http://schemas.microsoft.com/office/word/2026/wordml/cei" xmlns:w16cex="http://schemas.microsoft.com/office/word/2018/wordml/cex" xmlns:w16cid="http://schemas.microsoft.com/office/word/2016/wordml/cid" xmlns:w16="http://schemas.microsoft.com/office/word/2018/wordml" xmlns:w16du="http://schemas.microsoft.com/office/word/2023/wordml/word16du" xmlns:w16sdtdh="http://schemas.microsoft.com/office/word/2020/wordml/sdtdatahash" xmlns:w16sdtfl="http://schemas.microsoft.com/office/word/2024/wordml/sdtformatlock" xmlns:w16se="http://schemas.microsoft.com/office/word/2015/wordml/symex" xmlns:wpg="http://schemas.microsoft.com/office/word/2010/wordprocessingGroup" xmlns:wpi="http://schemas.microsoft.com/office/word/2010/wordprocessingInk" xmlns:wne="http://schemas.microsoft.com/office/word/2006/wordml" xmlns:wps="http://schemas.microsoft.com/office/word/2010/wordprocessingShape" mc:Ignorable="w14 w15 w16se w16cid w16 w16cex w16sdtdh w16sdtfl w16du wp14">
+<w:hdr xmlns:wpc="http://schemas.microsoft.com/office/word/2010/wordprocessingCanvas" xmlns:cx="http://schemas.microsoft.com/office/drawing/2014/chartex" xmlns:cx1="http://schemas.microsoft.com/office/drawing/2015/9/8/chartex" xmlns:cx2="http://schemas.microsoft.com/office/drawing/2015/10/21/chartex" xmlns:cx3="http://schemas.microsoft.com/office/drawing/2016/5/9/chartex" xmlns:cx4="http://schemas.microsoft.com/office/drawing/2016/5/10/chartex" xmlns:cx5="http://schemas.microsoft.com/office/drawing/2016/5/11/chartex" xmlns:cx6="http://schemas.microsoft.com/office/drawing/2016/5/12/chartex" xmlns:cx7="http://schemas.microsoft.com/office/drawing/2016/5/13/chartex" xmlns:cx8="http://schemas.microsoft.com/office/drawing/2016/5/14/chartex" xmlns:mc="http://schemas.openxmlformats.org/markup-compatibility/2006" xmlns:aink="http://schemas.microsoft.com/office/drawing/2016/ink" xmlns:am3d="http://schemas.microsoft.com/office/drawing/2017/model3d" xmlns:o="urn:schemas-microsoft-com:office:office" xmlns:oel="http://schemas.microsoft.com/office/2019/extlst" xmlns:r="http://schemas.openxmlformats.org/officeDocument/2006/relationships" xmlns:m="http://schemas.openxmlformats.org/officeDocument/2006/math" xmlns:v="urn:schemas-microsoft-com:vml" xmlns:wp14="http://schemas.microsoft.com/office/word/2010/wordprocessingDrawing" xmlns:wp="http://schemas.openxmlformats.org/drawingml/2006/wordprocessingDrawing" xmlns:w10="urn:schemas-microsoft-com:office:word" xmlns:w="http://schemas.openxmlformats.org/wordprocessingml/2006/main" xmlns:w14="http://schemas.microsoft.com/office/word/2010/wordml" xmlns:w15="http://schemas.microsoft.com/office/word/2012/wordml" xmlns:w16cex="http://schemas.microsoft.com/office/word/2018/wordml/cex" xmlns:w16cid="http://schemas.microsoft.com/office/word/2016/wordml/cid" xmlns:w16="http://schemas.microsoft.com/office/word/2018/wordml" xmlns:w16du="http://schemas.microsoft.com/office/word/2023/wordml/word16du" xmlns:w16sdtdh="http://schemas.microsoft.com/office/word/2020/wordml/sdtdatahash" xmlns:w16sdtfl="http://schemas.microsoft.com/office/word/2024/wordml/sdtformatlock" xmlns:w16se="http://schemas.microsoft.com/office/word/2015/wordml/symex" xmlns:wpg="http://schemas.microsoft.com/office/word/2010/wordprocessingGroup" xmlns:wpi="http://schemas.microsoft.com/office/word/2010/wordprocessingInk" xmlns:wne="http://schemas.microsoft.com/office/word/2006/wordml" xmlns:wps="http://schemas.microsoft.com/office/word/2010/wordprocessingShape" mc:Ignorable="w14 w15 w16se w16cid w16 w16cex w16sdtdh w16sdtfl w16du wp14">
   <w:p>
     <w:pPr>
       <w:widowControl w:val="0"/>
@@ -49562,7 +48070,7 @@
 </file>
 
 <file path=word/header17.xml><?xml version="1.0" encoding="utf-8"?>
-<w:hdr xmlns:wpc="http://schemas.microsoft.com/office/word/2010/wordprocessingCanvas" xmlns:cx="http://schemas.microsoft.com/office/drawing/2014/chartex" xmlns:cx1="http://schemas.microsoft.com/office/drawing/2015/9/8/chartex" xmlns:cx2="http://schemas.microsoft.com/office/drawing/2015/10/21/chartex" xmlns:cx3="http://schemas.microsoft.com/office/drawing/2016/5/9/chartex" xmlns:cx4="http://schemas.microsoft.com/office/drawing/2016/5/10/chartex" xmlns:cx5="http://schemas.microsoft.com/office/drawing/2016/5/11/chartex" xmlns:cx6="http://schemas.microsoft.com/office/drawing/2016/5/12/chartex" xmlns:cx7="http://schemas.microsoft.com/office/drawing/2016/5/13/chartex" xmlns:cx8="http://schemas.microsoft.com/office/drawing/2016/5/14/chartex" xmlns:mc="http://schemas.openxmlformats.org/markup-compatibility/2006" xmlns:aink="http://schemas.microsoft.com/office/drawing/2016/ink" xmlns:am3d="http://schemas.microsoft.com/office/drawing/2017/model3d" xmlns:o="urn:schemas-microsoft-com:office:office" xmlns:oel="http://schemas.microsoft.com/office/2019/extlst" xmlns:r="http://schemas.openxmlformats.org/officeDocument/2006/relationships" xmlns:m="http://schemas.openxmlformats.org/officeDocument/2006/math" xmlns:v="urn:schemas-microsoft-com:vml" xmlns:wp14="http://schemas.microsoft.com/office/word/2010/wordprocessingDrawing" xmlns:wp="http://schemas.openxmlformats.org/drawingml/2006/wordprocessingDrawing" xmlns:w10="urn:schemas-microsoft-com:office:word" xmlns:w="http://schemas.openxmlformats.org/wordprocessingml/2006/main" xmlns:w14="http://schemas.microsoft.com/office/word/2010/wordml" xmlns:w15="http://schemas.microsoft.com/office/word/2012/wordml" xmlns:w16cei="http://schemas.microsoft.com/office/word/2026/wordml/cei" xmlns:w16cex="http://schemas.microsoft.com/office/word/2018/wordml/cex" xmlns:w16cid="http://schemas.microsoft.com/office/word/2016/wordml/cid" xmlns:w16="http://schemas.microsoft.com/office/word/2018/wordml" xmlns:w16du="http://schemas.microsoft.com/office/word/2023/wordml/word16du" xmlns:w16sdtdh="http://schemas.microsoft.com/office/word/2020/wordml/sdtdatahash" xmlns:w16sdtfl="http://schemas.microsoft.com/office/word/2024/wordml/sdtformatlock" xmlns:w16se="http://schemas.microsoft.com/office/word/2015/wordml/symex" xmlns:wpg="http://schemas.microsoft.com/office/word/2010/wordprocessingGroup" xmlns:wpi="http://schemas.microsoft.com/office/word/2010/wordprocessingInk" xmlns:wne="http://schemas.microsoft.com/office/word/2006/wordml" xmlns:wps="http://schemas.microsoft.com/office/word/2010/wordprocessingShape" mc:Ignorable="w14 w15 w16se w16cid w16 w16cex w16sdtdh w16sdtfl w16du wp14">
+<w:hdr xmlns:wpc="http://schemas.microsoft.com/office/word/2010/wordprocessingCanvas" xmlns:cx="http://schemas.microsoft.com/office/drawing/2014/chartex" xmlns:cx1="http://schemas.microsoft.com/office/drawing/2015/9/8/chartex" xmlns:cx2="http://schemas.microsoft.com/office/drawing/2015/10/21/chartex" xmlns:cx3="http://schemas.microsoft.com/office/drawing/2016/5/9/chartex" xmlns:cx4="http://schemas.microsoft.com/office/drawing/2016/5/10/chartex" xmlns:cx5="http://schemas.microsoft.com/office/drawing/2016/5/11/chartex" xmlns:cx6="http://schemas.microsoft.com/office/drawing/2016/5/12/chartex" xmlns:cx7="http://schemas.microsoft.com/office/drawing/2016/5/13/chartex" xmlns:cx8="http://schemas.microsoft.com/office/drawing/2016/5/14/chartex" xmlns:mc="http://schemas.openxmlformats.org/markup-compatibility/2006" xmlns:aink="http://schemas.microsoft.com/office/drawing/2016/ink" xmlns:am3d="http://schemas.microsoft.com/office/drawing/2017/model3d" xmlns:o="urn:schemas-microsoft-com:office:office" xmlns:oel="http://schemas.microsoft.com/office/2019/extlst" xmlns:r="http://schemas.openxmlformats.org/officeDocument/2006/relationships" xmlns:m="http://schemas.openxmlformats.org/officeDocument/2006/math" xmlns:v="urn:schemas-microsoft-com:vml" xmlns:wp14="http://schemas.microsoft.com/office/word/2010/wordprocessingDrawing" xmlns:wp="http://schemas.openxmlformats.org/drawingml/2006/wordprocessingDrawing" xmlns:w10="urn:schemas-microsoft-com:office:word" xmlns:w="http://schemas.openxmlformats.org/wordprocessingml/2006/main" xmlns:w14="http://schemas.microsoft.com/office/word/2010/wordml" xmlns:w15="http://schemas.microsoft.com/office/word/2012/wordml" xmlns:w16cex="http://schemas.microsoft.com/office/word/2018/wordml/cex" xmlns:w16cid="http://schemas.microsoft.com/office/word/2016/wordml/cid" xmlns:w16="http://schemas.microsoft.com/office/word/2018/wordml" xmlns:w16du="http://schemas.microsoft.com/office/word/2023/wordml/word16du" xmlns:w16sdtdh="http://schemas.microsoft.com/office/word/2020/wordml/sdtdatahash" xmlns:w16sdtfl="http://schemas.microsoft.com/office/word/2024/wordml/sdtformatlock" xmlns:w16se="http://schemas.microsoft.com/office/word/2015/wordml/symex" xmlns:wpg="http://schemas.microsoft.com/office/word/2010/wordprocessingGroup" xmlns:wpi="http://schemas.microsoft.com/office/word/2010/wordprocessingInk" xmlns:wne="http://schemas.microsoft.com/office/word/2006/wordml" xmlns:wps="http://schemas.microsoft.com/office/word/2010/wordprocessingShape" mc:Ignorable="w14 w15 w16se w16cid w16 w16cex w16sdtdh w16sdtfl w16du wp14">
   <w:p>
     <w:pPr>
       <w:widowControl w:val="0"/>
@@ -49716,7 +48224,7 @@
 </file>
 
 <file path=word/header2.xml><?xml version="1.0" encoding="utf-8"?>
-<w:hdr xmlns:wpc="http://schemas.microsoft.com/office/word/2010/wordprocessingCanvas" xmlns:cx="http://schemas.microsoft.com/office/drawing/2014/chartex" xmlns:cx1="http://schemas.microsoft.com/office/drawing/2015/9/8/chartex" xmlns:cx2="http://schemas.microsoft.com/office/drawing/2015/10/21/chartex" xmlns:cx3="http://schemas.microsoft.com/office/drawing/2016/5/9/chartex" xmlns:cx4="http://schemas.microsoft.com/office/drawing/2016/5/10/chartex" xmlns:cx5="http://schemas.microsoft.com/office/drawing/2016/5/11/chartex" xmlns:cx6="http://schemas.microsoft.com/office/drawing/2016/5/12/chartex" xmlns:cx7="http://schemas.microsoft.com/office/drawing/2016/5/13/chartex" xmlns:cx8="http://schemas.microsoft.com/office/drawing/2016/5/14/chartex" xmlns:mc="http://schemas.openxmlformats.org/markup-compatibility/2006" xmlns:aink="http://schemas.microsoft.com/office/drawing/2016/ink" xmlns:am3d="http://schemas.microsoft.com/office/drawing/2017/model3d" xmlns:o="urn:schemas-microsoft-com:office:office" xmlns:oel="http://schemas.microsoft.com/office/2019/extlst" xmlns:r="http://schemas.openxmlformats.org/officeDocument/2006/relationships" xmlns:m="http://schemas.openxmlformats.org/officeDocument/2006/math" xmlns:v="urn:schemas-microsoft-com:vml" xmlns:wp14="http://schemas.microsoft.com/office/word/2010/wordprocessingDrawing" xmlns:wp="http://schemas.openxmlformats.org/drawingml/2006/wordprocessingDrawing" xmlns:w10="urn:schemas-microsoft-com:office:word" xmlns:w="http://schemas.openxmlformats.org/wordprocessingml/2006/main" xmlns:w14="http://schemas.microsoft.com/office/word/2010/wordml" xmlns:w15="http://schemas.microsoft.com/office/word/2012/wordml" xmlns:w16cei="http://schemas.microsoft.com/office/word/2026/wordml/cei" xmlns:w16cex="http://schemas.microsoft.com/office/word/2018/wordml/cex" xmlns:w16cid="http://schemas.microsoft.com/office/word/2016/wordml/cid" xmlns:w16="http://schemas.microsoft.com/office/word/2018/wordml" xmlns:w16du="http://schemas.microsoft.com/office/word/2023/wordml/word16du" xmlns:w16sdtdh="http://schemas.microsoft.com/office/word/2020/wordml/sdtdatahash" xmlns:w16sdtfl="http://schemas.microsoft.com/office/word/2024/wordml/sdtformatlock" xmlns:w16se="http://schemas.microsoft.com/office/word/2015/wordml/symex" xmlns:wpg="http://schemas.microsoft.com/office/word/2010/wordprocessingGroup" xmlns:wpi="http://schemas.microsoft.com/office/word/2010/wordprocessingInk" xmlns:wne="http://schemas.microsoft.com/office/word/2006/wordml" xmlns:wps="http://schemas.microsoft.com/office/word/2010/wordprocessingShape" mc:Ignorable="w14 w15 w16se w16cid w16 w16cex w16sdtdh w16sdtfl w16du wp14">
+<w:hdr xmlns:wpc="http://schemas.microsoft.com/office/word/2010/wordprocessingCanvas" xmlns:cx="http://schemas.microsoft.com/office/drawing/2014/chartex" xmlns:cx1="http://schemas.microsoft.com/office/drawing/2015/9/8/chartex" xmlns:cx2="http://schemas.microsoft.com/office/drawing/2015/10/21/chartex" xmlns:cx3="http://schemas.microsoft.com/office/drawing/2016/5/9/chartex" xmlns:cx4="http://schemas.microsoft.com/office/drawing/2016/5/10/chartex" xmlns:cx5="http://schemas.microsoft.com/office/drawing/2016/5/11/chartex" xmlns:cx6="http://schemas.microsoft.com/office/drawing/2016/5/12/chartex" xmlns:cx7="http://schemas.microsoft.com/office/drawing/2016/5/13/chartex" xmlns:cx8="http://schemas.microsoft.com/office/drawing/2016/5/14/chartex" xmlns:mc="http://schemas.openxmlformats.org/markup-compatibility/2006" xmlns:aink="http://schemas.microsoft.com/office/drawing/2016/ink" xmlns:am3d="http://schemas.microsoft.com/office/drawing/2017/model3d" xmlns:o="urn:schemas-microsoft-com:office:office" xmlns:oel="http://schemas.microsoft.com/office/2019/extlst" xmlns:r="http://schemas.openxmlformats.org/officeDocument/2006/relationships" xmlns:m="http://schemas.openxmlformats.org/officeDocument/2006/math" xmlns:v="urn:schemas-microsoft-com:vml" xmlns:wp14="http://schemas.microsoft.com/office/word/2010/wordprocessingDrawing" xmlns:wp="http://schemas.openxmlformats.org/drawingml/2006/wordprocessingDrawing" xmlns:w10="urn:schemas-microsoft-com:office:word" xmlns:w="http://schemas.openxmlformats.org/wordprocessingml/2006/main" xmlns:w14="http://schemas.microsoft.com/office/word/2010/wordml" xmlns:w15="http://schemas.microsoft.com/office/word/2012/wordml" xmlns:w16cex="http://schemas.microsoft.com/office/word/2018/wordml/cex" xmlns:w16cid="http://schemas.microsoft.com/office/word/2016/wordml/cid" xmlns:w16="http://schemas.microsoft.com/office/word/2018/wordml" xmlns:w16du="http://schemas.microsoft.com/office/word/2023/wordml/word16du" xmlns:w16sdtdh="http://schemas.microsoft.com/office/word/2020/wordml/sdtdatahash" xmlns:w16sdtfl="http://schemas.microsoft.com/office/word/2024/wordml/sdtformatlock" xmlns:w16se="http://schemas.microsoft.com/office/word/2015/wordml/symex" xmlns:wpg="http://schemas.microsoft.com/office/word/2010/wordprocessingGroup" xmlns:wpi="http://schemas.microsoft.com/office/word/2010/wordprocessingInk" xmlns:wne="http://schemas.microsoft.com/office/word/2006/wordml" xmlns:wps="http://schemas.microsoft.com/office/word/2010/wordprocessingShape" mc:Ignorable="w14 w15 w16se w16cid w16 w16cex w16sdtdh w16sdtfl w16du wp14">
   <w:p>
     <w:pPr>
       <w:pStyle w:val="Header"/>
@@ -49743,7 +48251,7 @@
 </file>
 
 <file path=word/header3.xml><?xml version="1.0" encoding="utf-8"?>
-<w:hdr xmlns:wpc="http://schemas.microsoft.com/office/word/2010/wordprocessingCanvas" xmlns:cx="http://schemas.microsoft.com/office/drawing/2014/chartex" xmlns:cx1="http://schemas.microsoft.com/office/drawing/2015/9/8/chartex" xmlns:cx2="http://schemas.microsoft.com/office/drawing/2015/10/21/chartex" xmlns:cx3="http://schemas.microsoft.com/office/drawing/2016/5/9/chartex" xmlns:cx4="http://schemas.microsoft.com/office/drawing/2016/5/10/chartex" xmlns:cx5="http://schemas.microsoft.com/office/drawing/2016/5/11/chartex" xmlns:cx6="http://schemas.microsoft.com/office/drawing/2016/5/12/chartex" xmlns:cx7="http://schemas.microsoft.com/office/drawing/2016/5/13/chartex" xmlns:cx8="http://schemas.microsoft.com/office/drawing/2016/5/14/chartex" xmlns:mc="http://schemas.openxmlformats.org/markup-compatibility/2006" xmlns:aink="http://schemas.microsoft.com/office/drawing/2016/ink" xmlns:am3d="http://schemas.microsoft.com/office/drawing/2017/model3d" xmlns:o="urn:schemas-microsoft-com:office:office" xmlns:oel="http://schemas.microsoft.com/office/2019/extlst" xmlns:r="http://schemas.openxmlformats.org/officeDocument/2006/relationships" xmlns:m="http://schemas.openxmlformats.org/officeDocument/2006/math" xmlns:v="urn:schemas-microsoft-com:vml" xmlns:wp14="http://schemas.microsoft.com/office/word/2010/wordprocessingDrawing" xmlns:wp="http://schemas.openxmlformats.org/drawingml/2006/wordprocessingDrawing" xmlns:w10="urn:schemas-microsoft-com:office:word" xmlns:w="http://schemas.openxmlformats.org/wordprocessingml/2006/main" xmlns:w14="http://schemas.microsoft.com/office/word/2010/wordml" xmlns:w15="http://schemas.microsoft.com/office/word/2012/wordml" xmlns:w16cei="http://schemas.microsoft.com/office/word/2026/wordml/cei" xmlns:w16cex="http://schemas.microsoft.com/office/word/2018/wordml/cex" xmlns:w16cid="http://schemas.microsoft.com/office/word/2016/wordml/cid" xmlns:w16="http://schemas.microsoft.com/office/word/2018/wordml" xmlns:w16du="http://schemas.microsoft.com/office/word/2023/wordml/word16du" xmlns:w16sdtdh="http://schemas.microsoft.com/office/word/2020/wordml/sdtdatahash" xmlns:w16sdtfl="http://schemas.microsoft.com/office/word/2024/wordml/sdtformatlock" xmlns:w16se="http://schemas.microsoft.com/office/word/2015/wordml/symex" xmlns:wpg="http://schemas.microsoft.com/office/word/2010/wordprocessingGroup" xmlns:wpi="http://schemas.microsoft.com/office/word/2010/wordprocessingInk" xmlns:wne="http://schemas.microsoft.com/office/word/2006/wordml" xmlns:wps="http://schemas.microsoft.com/office/word/2010/wordprocessingShape" mc:Ignorable="w14 w15 w16se w16cid w16 w16cex w16sdtdh w16sdtfl w16du wp14">
+<w:hdr xmlns:wpc="http://schemas.microsoft.com/office/word/2010/wordprocessingCanvas" xmlns:cx="http://schemas.microsoft.com/office/drawing/2014/chartex" xmlns:cx1="http://schemas.microsoft.com/office/drawing/2015/9/8/chartex" xmlns:cx2="http://schemas.microsoft.com/office/drawing/2015/10/21/chartex" xmlns:cx3="http://schemas.microsoft.com/office/drawing/2016/5/9/chartex" xmlns:cx4="http://schemas.microsoft.com/office/drawing/2016/5/10/chartex" xmlns:cx5="http://schemas.microsoft.com/office/drawing/2016/5/11/chartex" xmlns:cx6="http://schemas.microsoft.com/office/drawing/2016/5/12/chartex" xmlns:cx7="http://schemas.microsoft.com/office/drawing/2016/5/13/chartex" xmlns:cx8="http://schemas.microsoft.com/office/drawing/2016/5/14/chartex" xmlns:mc="http://schemas.openxmlformats.org/markup-compatibility/2006" xmlns:aink="http://schemas.microsoft.com/office/drawing/2016/ink" xmlns:am3d="http://schemas.microsoft.com/office/drawing/2017/model3d" xmlns:o="urn:schemas-microsoft-com:office:office" xmlns:oel="http://schemas.microsoft.com/office/2019/extlst" xmlns:r="http://schemas.openxmlformats.org/officeDocument/2006/relationships" xmlns:m="http://schemas.openxmlformats.org/officeDocument/2006/math" xmlns:v="urn:schemas-microsoft-com:vml" xmlns:wp14="http://schemas.microsoft.com/office/word/2010/wordprocessingDrawing" xmlns:wp="http://schemas.openxmlformats.org/drawingml/2006/wordprocessingDrawing" xmlns:w10="urn:schemas-microsoft-com:office:word" xmlns:w="http://schemas.openxmlformats.org/wordprocessingml/2006/main" xmlns:w14="http://schemas.microsoft.com/office/word/2010/wordml" xmlns:w15="http://schemas.microsoft.com/office/word/2012/wordml" xmlns:w16cex="http://schemas.microsoft.com/office/word/2018/wordml/cex" xmlns:w16cid="http://schemas.microsoft.com/office/word/2016/wordml/cid" xmlns:w16="http://schemas.microsoft.com/office/word/2018/wordml" xmlns:w16du="http://schemas.microsoft.com/office/word/2023/wordml/word16du" xmlns:w16sdtdh="http://schemas.microsoft.com/office/word/2020/wordml/sdtdatahash" xmlns:w16sdtfl="http://schemas.microsoft.com/office/word/2024/wordml/sdtformatlock" xmlns:w16se="http://schemas.microsoft.com/office/word/2015/wordml/symex" xmlns:wpg="http://schemas.microsoft.com/office/word/2010/wordprocessingGroup" xmlns:wpi="http://schemas.microsoft.com/office/word/2010/wordprocessingInk" xmlns:wne="http://schemas.microsoft.com/office/word/2006/wordml" xmlns:wps="http://schemas.microsoft.com/office/word/2010/wordprocessingShape" mc:Ignorable="w14 w15 w16se w16cid w16 w16cex w16sdtdh w16sdtfl w16du wp14">
   <w:p>
     <w:pPr>
       <w:pStyle w:val="Header"/>
@@ -49783,7 +48291,7 @@
 </file>
 
 <file path=word/header4.xml><?xml version="1.0" encoding="utf-8"?>
-<w:hdr xmlns:wpc="http://schemas.microsoft.com/office/word/2010/wordprocessingCanvas" xmlns:cx="http://schemas.microsoft.com/office/drawing/2014/chartex" xmlns:cx1="http://schemas.microsoft.com/office/drawing/2015/9/8/chartex" xmlns:cx2="http://schemas.microsoft.com/office/drawing/2015/10/21/chartex" xmlns:cx3="http://schemas.microsoft.com/office/drawing/2016/5/9/chartex" xmlns:cx4="http://schemas.microsoft.com/office/drawing/2016/5/10/chartex" xmlns:cx5="http://schemas.microsoft.com/office/drawing/2016/5/11/chartex" xmlns:cx6="http://schemas.microsoft.com/office/drawing/2016/5/12/chartex" xmlns:cx7="http://schemas.microsoft.com/office/drawing/2016/5/13/chartex" xmlns:cx8="http://schemas.microsoft.com/office/drawing/2016/5/14/chartex" xmlns:mc="http://schemas.openxmlformats.org/markup-compatibility/2006" xmlns:aink="http://schemas.microsoft.com/office/drawing/2016/ink" xmlns:am3d="http://schemas.microsoft.com/office/drawing/2017/model3d" xmlns:o="urn:schemas-microsoft-com:office:office" xmlns:oel="http://schemas.microsoft.com/office/2019/extlst" xmlns:r="http://schemas.openxmlformats.org/officeDocument/2006/relationships" xmlns:m="http://schemas.openxmlformats.org/officeDocument/2006/math" xmlns:v="urn:schemas-microsoft-com:vml" xmlns:wp14="http://schemas.microsoft.com/office/word/2010/wordprocessingDrawing" xmlns:wp="http://schemas.openxmlformats.org/drawingml/2006/wordprocessingDrawing" xmlns:w10="urn:schemas-microsoft-com:office:word" xmlns:w="http://schemas.openxmlformats.org/wordprocessingml/2006/main" xmlns:w14="http://schemas.microsoft.com/office/word/2010/wordml" xmlns:w15="http://schemas.microsoft.com/office/word/2012/wordml" xmlns:w16cei="http://schemas.microsoft.com/office/word/2026/wordml/cei" xmlns:w16cex="http://schemas.microsoft.com/office/word/2018/wordml/cex" xmlns:w16cid="http://schemas.microsoft.com/office/word/2016/wordml/cid" xmlns:w16="http://schemas.microsoft.com/office/word/2018/wordml" xmlns:w16du="http://schemas.microsoft.com/office/word/2023/wordml/word16du" xmlns:w16sdtdh="http://schemas.microsoft.com/office/word/2020/wordml/sdtdatahash" xmlns:w16sdtfl="http://schemas.microsoft.com/office/word/2024/wordml/sdtformatlock" xmlns:w16se="http://schemas.microsoft.com/office/word/2015/wordml/symex" xmlns:wpg="http://schemas.microsoft.com/office/word/2010/wordprocessingGroup" xmlns:wpi="http://schemas.microsoft.com/office/word/2010/wordprocessingInk" xmlns:wne="http://schemas.microsoft.com/office/word/2006/wordml" xmlns:wps="http://schemas.microsoft.com/office/word/2010/wordprocessingShape" mc:Ignorable="w14 w15 w16se w16cid w16 w16cex w16sdtdh w16sdtfl w16du wp14">
+<w:hdr xmlns:wpc="http://schemas.microsoft.com/office/word/2010/wordprocessingCanvas" xmlns:cx="http://schemas.microsoft.com/office/drawing/2014/chartex" xmlns:cx1="http://schemas.microsoft.com/office/drawing/2015/9/8/chartex" xmlns:cx2="http://schemas.microsoft.com/office/drawing/2015/10/21/chartex" xmlns:cx3="http://schemas.microsoft.com/office/drawing/2016/5/9/chartex" xmlns:cx4="http://schemas.microsoft.com/office/drawing/2016/5/10/chartex" xmlns:cx5="http://schemas.microsoft.com/office/drawing/2016/5/11/chartex" xmlns:cx6="http://schemas.microsoft.com/office/drawing/2016/5/12/chartex" xmlns:cx7="http://schemas.microsoft.com/office/drawing/2016/5/13/chartex" xmlns:cx8="http://schemas.microsoft.com/office/drawing/2016/5/14/chartex" xmlns:mc="http://schemas.openxmlformats.org/markup-compatibility/2006" xmlns:aink="http://schemas.microsoft.com/office/drawing/2016/ink" xmlns:am3d="http://schemas.microsoft.com/office/drawing/2017/model3d" xmlns:o="urn:schemas-microsoft-com:office:office" xmlns:oel="http://schemas.microsoft.com/office/2019/extlst" xmlns:r="http://schemas.openxmlformats.org/officeDocument/2006/relationships" xmlns:m="http://schemas.openxmlformats.org/officeDocument/2006/math" xmlns:v="urn:schemas-microsoft-com:vml" xmlns:wp14="http://schemas.microsoft.com/office/word/2010/wordprocessingDrawing" xmlns:wp="http://schemas.openxmlformats.org/drawingml/2006/wordprocessingDrawing" xmlns:w10="urn:schemas-microsoft-com:office:word" xmlns:w="http://schemas.openxmlformats.org/wordprocessingml/2006/main" xmlns:w14="http://schemas.microsoft.com/office/word/2010/wordml" xmlns:w15="http://schemas.microsoft.com/office/word/2012/wordml" xmlns:w16cex="http://schemas.microsoft.com/office/word/2018/wordml/cex" xmlns:w16cid="http://schemas.microsoft.com/office/word/2016/wordml/cid" xmlns:w16="http://schemas.microsoft.com/office/word/2018/wordml" xmlns:w16du="http://schemas.microsoft.com/office/word/2023/wordml/word16du" xmlns:w16sdtdh="http://schemas.microsoft.com/office/word/2020/wordml/sdtdatahash" xmlns:w16sdtfl="http://schemas.microsoft.com/office/word/2024/wordml/sdtformatlock" xmlns:w16se="http://schemas.microsoft.com/office/word/2015/wordml/symex" xmlns:wpg="http://schemas.microsoft.com/office/word/2010/wordprocessingGroup" xmlns:wpi="http://schemas.microsoft.com/office/word/2010/wordprocessingInk" xmlns:wne="http://schemas.microsoft.com/office/word/2006/wordml" xmlns:wps="http://schemas.microsoft.com/office/word/2010/wordprocessingShape" mc:Ignorable="w14 w15 w16se w16cid w16 w16cex w16sdtdh w16sdtfl w16du wp14">
   <w:p>
     <w:pPr>
       <w:pStyle w:val="Header"/>
@@ -49810,7 +48318,7 @@
 </file>
 
 <file path=word/header5.xml><?xml version="1.0" encoding="utf-8"?>
-<w:hdr xmlns:wpc="http://schemas.microsoft.com/office/word/2010/wordprocessingCanvas" xmlns:cx="http://schemas.microsoft.com/office/drawing/2014/chartex" xmlns:cx1="http://schemas.microsoft.com/office/drawing/2015/9/8/chartex" xmlns:cx2="http://schemas.microsoft.com/office/drawing/2015/10/21/chartex" xmlns:cx3="http://schemas.microsoft.com/office/drawing/2016/5/9/chartex" xmlns:cx4="http://schemas.microsoft.com/office/drawing/2016/5/10/chartex" xmlns:cx5="http://schemas.microsoft.com/office/drawing/2016/5/11/chartex" xmlns:cx6="http://schemas.microsoft.com/office/drawing/2016/5/12/chartex" xmlns:cx7="http://schemas.microsoft.com/office/drawing/2016/5/13/chartex" xmlns:cx8="http://schemas.microsoft.com/office/drawing/2016/5/14/chartex" xmlns:mc="http://schemas.openxmlformats.org/markup-compatibility/2006" xmlns:aink="http://schemas.microsoft.com/office/drawing/2016/ink" xmlns:am3d="http://schemas.microsoft.com/office/drawing/2017/model3d" xmlns:o="urn:schemas-microsoft-com:office:office" xmlns:oel="http://schemas.microsoft.com/office/2019/extlst" xmlns:r="http://schemas.openxmlformats.org/officeDocument/2006/relationships" xmlns:m="http://schemas.openxmlformats.org/officeDocument/2006/math" xmlns:v="urn:schemas-microsoft-com:vml" xmlns:wp14="http://schemas.microsoft.com/office/word/2010/wordprocessingDrawing" xmlns:wp="http://schemas.openxmlformats.org/drawingml/2006/wordprocessingDrawing" xmlns:w10="urn:schemas-microsoft-com:office:word" xmlns:w="http://schemas.openxmlformats.org/wordprocessingml/2006/main" xmlns:w14="http://schemas.microsoft.com/office/word/2010/wordml" xmlns:w15="http://schemas.microsoft.com/office/word/2012/wordml" xmlns:w16cei="http://schemas.microsoft.com/office/word/2026/wordml/cei" xmlns:w16cex="http://schemas.microsoft.com/office/word/2018/wordml/cex" xmlns:w16cid="http://schemas.microsoft.com/office/word/2016/wordml/cid" xmlns:w16="http://schemas.microsoft.com/office/word/2018/wordml" xmlns:w16du="http://schemas.microsoft.com/office/word/2023/wordml/word16du" xmlns:w16sdtdh="http://schemas.microsoft.com/office/word/2020/wordml/sdtdatahash" xmlns:w16sdtfl="http://schemas.microsoft.com/office/word/2024/wordml/sdtformatlock" xmlns:w16se="http://schemas.microsoft.com/office/word/2015/wordml/symex" xmlns:wpg="http://schemas.microsoft.com/office/word/2010/wordprocessingGroup" xmlns:wpi="http://schemas.microsoft.com/office/word/2010/wordprocessingInk" xmlns:wne="http://schemas.microsoft.com/office/word/2006/wordml" xmlns:wps="http://schemas.microsoft.com/office/word/2010/wordprocessingShape" mc:Ignorable="w14 w15 w16se w16cid w16 w16cex w16sdtdh w16sdtfl w16du wp14">
+<w:hdr xmlns:wpc="http://schemas.microsoft.com/office/word/2010/wordprocessingCanvas" xmlns:cx="http://schemas.microsoft.com/office/drawing/2014/chartex" xmlns:cx1="http://schemas.microsoft.com/office/drawing/2015/9/8/chartex" xmlns:cx2="http://schemas.microsoft.com/office/drawing/2015/10/21/chartex" xmlns:cx3="http://schemas.microsoft.com/office/drawing/2016/5/9/chartex" xmlns:cx4="http://schemas.microsoft.com/office/drawing/2016/5/10/chartex" xmlns:cx5="http://schemas.microsoft.com/office/drawing/2016/5/11/chartex" xmlns:cx6="http://schemas.microsoft.com/office/drawing/2016/5/12/chartex" xmlns:cx7="http://schemas.microsoft.com/office/drawing/2016/5/13/chartex" xmlns:cx8="http://schemas.microsoft.com/office/drawing/2016/5/14/chartex" xmlns:mc="http://schemas.openxmlformats.org/markup-compatibility/2006" xmlns:aink="http://schemas.microsoft.com/office/drawing/2016/ink" xmlns:am3d="http://schemas.microsoft.com/office/drawing/2017/model3d" xmlns:o="urn:schemas-microsoft-com:office:office" xmlns:oel="http://schemas.microsoft.com/office/2019/extlst" xmlns:r="http://schemas.openxmlformats.org/officeDocument/2006/relationships" xmlns:m="http://schemas.openxmlformats.org/officeDocument/2006/math" xmlns:v="urn:schemas-microsoft-com:vml" xmlns:wp14="http://schemas.microsoft.com/office/word/2010/wordprocessingDrawing" xmlns:wp="http://schemas.openxmlformats.org/drawingml/2006/wordprocessingDrawing" xmlns:w10="urn:schemas-microsoft-com:office:word" xmlns:w="http://schemas.openxmlformats.org/wordprocessingml/2006/main" xmlns:w14="http://schemas.microsoft.com/office/word/2010/wordml" xmlns:w15="http://schemas.microsoft.com/office/word/2012/wordml" xmlns:w16cex="http://schemas.microsoft.com/office/word/2018/wordml/cex" xmlns:w16cid="http://schemas.microsoft.com/office/word/2016/wordml/cid" xmlns:w16="http://schemas.microsoft.com/office/word/2018/wordml" xmlns:w16du="http://schemas.microsoft.com/office/word/2023/wordml/word16du" xmlns:w16sdtdh="http://schemas.microsoft.com/office/word/2020/wordml/sdtdatahash" xmlns:w16sdtfl="http://schemas.microsoft.com/office/word/2024/wordml/sdtformatlock" xmlns:w16se="http://schemas.microsoft.com/office/word/2015/wordml/symex" xmlns:wpg="http://schemas.microsoft.com/office/word/2010/wordprocessingGroup" xmlns:wpi="http://schemas.microsoft.com/office/word/2010/wordprocessingInk" xmlns:wne="http://schemas.microsoft.com/office/word/2006/wordml" xmlns:wps="http://schemas.microsoft.com/office/word/2010/wordprocessingShape" mc:Ignorable="w14 w15 w16se w16cid w16 w16cex w16sdtdh w16sdtfl w16du wp14">
   <w:p>
     <w:pPr>
       <w:pStyle w:val="Header"/>
@@ -49837,7 +48345,7 @@
 </file>
 
 <file path=word/header6.xml><?xml version="1.0" encoding="utf-8"?>
-<w:hdr xmlns:wpc="http://schemas.microsoft.com/office/word/2010/wordprocessingCanvas" xmlns:cx="http://schemas.microsoft.com/office/drawing/2014/chartex" xmlns:cx1="http://schemas.microsoft.com/office/drawing/2015/9/8/chartex" xmlns:cx2="http://schemas.microsoft.com/office/drawing/2015/10/21/chartex" xmlns:cx3="http://schemas.microsoft.com/office/drawing/2016/5/9/chartex" xmlns:cx4="http://schemas.microsoft.com/office/drawing/2016/5/10/chartex" xmlns:cx5="http://schemas.microsoft.com/office/drawing/2016/5/11/chartex" xmlns:cx6="http://schemas.microsoft.com/office/drawing/2016/5/12/chartex" xmlns:cx7="http://schemas.microsoft.com/office/drawing/2016/5/13/chartex" xmlns:cx8="http://schemas.microsoft.com/office/drawing/2016/5/14/chartex" xmlns:mc="http://schemas.openxmlformats.org/markup-compatibility/2006" xmlns:aink="http://schemas.microsoft.com/office/drawing/2016/ink" xmlns:am3d="http://schemas.microsoft.com/office/drawing/2017/model3d" xmlns:o="urn:schemas-microsoft-com:office:office" xmlns:oel="http://schemas.microsoft.com/office/2019/extlst" xmlns:r="http://schemas.openxmlformats.org/officeDocument/2006/relationships" xmlns:m="http://schemas.openxmlformats.org/officeDocument/2006/math" xmlns:v="urn:schemas-microsoft-com:vml" xmlns:wp14="http://schemas.microsoft.com/office/word/2010/wordprocessingDrawing" xmlns:wp="http://schemas.openxmlformats.org/drawingml/2006/wordprocessingDrawing" xmlns:w10="urn:schemas-microsoft-com:office:word" xmlns:w="http://schemas.openxmlformats.org/wordprocessingml/2006/main" xmlns:w14="http://schemas.microsoft.com/office/word/2010/wordml" xmlns:w15="http://schemas.microsoft.com/office/word/2012/wordml" xmlns:w16cei="http://schemas.microsoft.com/office/word/2026/wordml/cei" xmlns:w16cex="http://schemas.microsoft.com/office/word/2018/wordml/cex" xmlns:w16cid="http://schemas.microsoft.com/office/word/2016/wordml/cid" xmlns:w16="http://schemas.microsoft.com/office/word/2018/wordml" xmlns:w16du="http://schemas.microsoft.com/office/word/2023/wordml/word16du" xmlns:w16sdtdh="http://schemas.microsoft.com/office/word/2020/wordml/sdtdatahash" xmlns:w16sdtfl="http://schemas.microsoft.com/office/word/2024/wordml/sdtformatlock" xmlns:w16se="http://schemas.microsoft.com/office/word/2015/wordml/symex" xmlns:wpg="http://schemas.microsoft.com/office/word/2010/wordprocessingGroup" xmlns:wpi="http://schemas.microsoft.com/office/word/2010/wordprocessingInk" xmlns:wne="http://schemas.microsoft.com/office/word/2006/wordml" xmlns:wps="http://schemas.microsoft.com/office/word/2010/wordprocessingShape" mc:Ignorable="w14 w15 w16se w16cid w16 w16cex w16sdtdh w16sdtfl w16du wp14">
+<w:hdr xmlns:wpc="http://schemas.microsoft.com/office/word/2010/wordprocessingCanvas" xmlns:cx="http://schemas.microsoft.com/office/drawing/2014/chartex" xmlns:cx1="http://schemas.microsoft.com/office/drawing/2015/9/8/chartex" xmlns:cx2="http://schemas.microsoft.com/office/drawing/2015/10/21/chartex" xmlns:cx3="http://schemas.microsoft.com/office/drawing/2016/5/9/chartex" xmlns:cx4="http://schemas.microsoft.com/office/drawing/2016/5/10/chartex" xmlns:cx5="http://schemas.microsoft.com/office/drawing/2016/5/11/chartex" xmlns:cx6="http://schemas.microsoft.com/office/drawing/2016/5/12/chartex" xmlns:cx7="http://schemas.microsoft.com/office/drawing/2016/5/13/chartex" xmlns:cx8="http://schemas.microsoft.com/office/drawing/2016/5/14/chartex" xmlns:mc="http://schemas.openxmlformats.org/markup-compatibility/2006" xmlns:aink="http://schemas.microsoft.com/office/drawing/2016/ink" xmlns:am3d="http://schemas.microsoft.com/office/drawing/2017/model3d" xmlns:o="urn:schemas-microsoft-com:office:office" xmlns:oel="http://schemas.microsoft.com/office/2019/extlst" xmlns:r="http://schemas.openxmlformats.org/officeDocument/2006/relationships" xmlns:m="http://schemas.openxmlformats.org/officeDocument/2006/math" xmlns:v="urn:schemas-microsoft-com:vml" xmlns:wp14="http://schemas.microsoft.com/office/word/2010/wordprocessingDrawing" xmlns:wp="http://schemas.openxmlformats.org/drawingml/2006/wordprocessingDrawing" xmlns:w10="urn:schemas-microsoft-com:office:word" xmlns:w="http://schemas.openxmlformats.org/wordprocessingml/2006/main" xmlns:w14="http://schemas.microsoft.com/office/word/2010/wordml" xmlns:w15="http://schemas.microsoft.com/office/word/2012/wordml" xmlns:w16cex="http://schemas.microsoft.com/office/word/2018/wordml/cex" xmlns:w16cid="http://schemas.microsoft.com/office/word/2016/wordml/cid" xmlns:w16="http://schemas.microsoft.com/office/word/2018/wordml" xmlns:w16du="http://schemas.microsoft.com/office/word/2023/wordml/word16du" xmlns:w16sdtdh="http://schemas.microsoft.com/office/word/2020/wordml/sdtdatahash" xmlns:w16sdtfl="http://schemas.microsoft.com/office/word/2024/wordml/sdtformatlock" xmlns:w16se="http://schemas.microsoft.com/office/word/2015/wordml/symex" xmlns:wpg="http://schemas.microsoft.com/office/word/2010/wordprocessingGroup" xmlns:wpi="http://schemas.microsoft.com/office/word/2010/wordprocessingInk" xmlns:wne="http://schemas.microsoft.com/office/word/2006/wordml" xmlns:wps="http://schemas.microsoft.com/office/word/2010/wordprocessingShape" mc:Ignorable="w14 w15 w16se w16cid w16 w16cex w16sdtdh w16sdtfl w16du wp14">
   <w:p>
     <w:pPr>
       <w:widowControl w:val="0"/>
@@ -49906,7 +48414,7 @@
 </file>
 
 <file path=word/header7.xml><?xml version="1.0" encoding="utf-8"?>
-<w:hdr xmlns:wpc="http://schemas.microsoft.com/office/word/2010/wordprocessingCanvas" xmlns:cx="http://schemas.microsoft.com/office/drawing/2014/chartex" xmlns:cx1="http://schemas.microsoft.com/office/drawing/2015/9/8/chartex" xmlns:cx2="http://schemas.microsoft.com/office/drawing/2015/10/21/chartex" xmlns:cx3="http://schemas.microsoft.com/office/drawing/2016/5/9/chartex" xmlns:cx4="http://schemas.microsoft.com/office/drawing/2016/5/10/chartex" xmlns:cx5="http://schemas.microsoft.com/office/drawing/2016/5/11/chartex" xmlns:cx6="http://schemas.microsoft.com/office/drawing/2016/5/12/chartex" xmlns:cx7="http://schemas.microsoft.com/office/drawing/2016/5/13/chartex" xmlns:cx8="http://schemas.microsoft.com/office/drawing/2016/5/14/chartex" xmlns:mc="http://schemas.openxmlformats.org/markup-compatibility/2006" xmlns:aink="http://schemas.microsoft.com/office/drawing/2016/ink" xmlns:am3d="http://schemas.microsoft.com/office/drawing/2017/model3d" xmlns:o="urn:schemas-microsoft-com:office:office" xmlns:oel="http://schemas.microsoft.com/office/2019/extlst" xmlns:r="http://schemas.openxmlformats.org/officeDocument/2006/relationships" xmlns:m="http://schemas.openxmlformats.org/officeDocument/2006/math" xmlns:v="urn:schemas-microsoft-com:vml" xmlns:wp14="http://schemas.microsoft.com/office/word/2010/wordprocessingDrawing" xmlns:wp="http://schemas.openxmlformats.org/drawingml/2006/wordprocessingDrawing" xmlns:w10="urn:schemas-microsoft-com:office:word" xmlns:w="http://schemas.openxmlformats.org/wordprocessingml/2006/main" xmlns:w14="http://schemas.microsoft.com/office/word/2010/wordml" xmlns:w15="http://schemas.microsoft.com/office/word/2012/wordml" xmlns:w16cei="http://schemas.microsoft.com/office/word/2026/wordml/cei" xmlns:w16cex="http://schemas.microsoft.com/office/word/2018/wordml/cex" xmlns:w16cid="http://schemas.microsoft.com/office/word/2016/wordml/cid" xmlns:w16="http://schemas.microsoft.com/office/word/2018/wordml" xmlns:w16du="http://schemas.microsoft.com/office/word/2023/wordml/word16du" xmlns:w16sdtdh="http://schemas.microsoft.com/office/word/2020/wordml/sdtdatahash" xmlns:w16sdtfl="http://schemas.microsoft.com/office/word/2024/wordml/sdtformatlock" xmlns:w16se="http://schemas.microsoft.com/office/word/2015/wordml/symex" xmlns:wpg="http://schemas.microsoft.com/office/word/2010/wordprocessingGroup" xmlns:wpi="http://schemas.microsoft.com/office/word/2010/wordprocessingInk" xmlns:wne="http://schemas.microsoft.com/office/word/2006/wordml" xmlns:wps="http://schemas.microsoft.com/office/word/2010/wordprocessingShape" mc:Ignorable="w14 w15 w16se w16cid w16 w16cex w16sdtdh w16sdtfl w16du wp14">
+<w:hdr xmlns:wpc="http://schemas.microsoft.com/office/word/2010/wordprocessingCanvas" xmlns:cx="http://schemas.microsoft.com/office/drawing/2014/chartex" xmlns:cx1="http://schemas.microsoft.com/office/drawing/2015/9/8/chartex" xmlns:cx2="http://schemas.microsoft.com/office/drawing/2015/10/21/chartex" xmlns:cx3="http://schemas.microsoft.com/office/drawing/2016/5/9/chartex" xmlns:cx4="http://schemas.microsoft.com/office/drawing/2016/5/10/chartex" xmlns:cx5="http://schemas.microsoft.com/office/drawing/2016/5/11/chartex" xmlns:cx6="http://schemas.microsoft.com/office/drawing/2016/5/12/chartex" xmlns:cx7="http://schemas.microsoft.com/office/drawing/2016/5/13/chartex" xmlns:cx8="http://schemas.microsoft.com/office/drawing/2016/5/14/chartex" xmlns:mc="http://schemas.openxmlformats.org/markup-compatibility/2006" xmlns:aink="http://schemas.microsoft.com/office/drawing/2016/ink" xmlns:am3d="http://schemas.microsoft.com/office/drawing/2017/model3d" xmlns:o="urn:schemas-microsoft-com:office:office" xmlns:oel="http://schemas.microsoft.com/office/2019/extlst" xmlns:r="http://schemas.openxmlformats.org/officeDocument/2006/relationships" xmlns:m="http://schemas.openxmlformats.org/officeDocument/2006/math" xmlns:v="urn:schemas-microsoft-com:vml" xmlns:wp14="http://schemas.microsoft.com/office/word/2010/wordprocessingDrawing" xmlns:wp="http://schemas.openxmlformats.org/drawingml/2006/wordprocessingDrawing" xmlns:w10="urn:schemas-microsoft-com:office:word" xmlns:w="http://schemas.openxmlformats.org/wordprocessingml/2006/main" xmlns:w14="http://schemas.microsoft.com/office/word/2010/wordml" xmlns:w15="http://schemas.microsoft.com/office/word/2012/wordml" xmlns:w16cex="http://schemas.microsoft.com/office/word/2018/wordml/cex" xmlns:w16cid="http://schemas.microsoft.com/office/word/2016/wordml/cid" xmlns:w16="http://schemas.microsoft.com/office/word/2018/wordml" xmlns:w16du="http://schemas.microsoft.com/office/word/2023/wordml/word16du" xmlns:w16sdtdh="http://schemas.microsoft.com/office/word/2020/wordml/sdtdatahash" xmlns:w16sdtfl="http://schemas.microsoft.com/office/word/2024/wordml/sdtformatlock" xmlns:w16se="http://schemas.microsoft.com/office/word/2015/wordml/symex" xmlns:wpg="http://schemas.microsoft.com/office/word/2010/wordprocessingGroup" xmlns:wpi="http://schemas.microsoft.com/office/word/2010/wordprocessingInk" xmlns:wne="http://schemas.microsoft.com/office/word/2006/wordml" xmlns:wps="http://schemas.microsoft.com/office/word/2010/wordprocessingShape" mc:Ignorable="w14 w15 w16se w16cid w16 w16cex w16sdtdh w16sdtfl w16du wp14">
   <w:p>
     <w:pPr>
       <w:widowControl w:val="0"/>
@@ -49984,7 +48492,7 @@
 </file>
 
 <file path=word/header8.xml><?xml version="1.0" encoding="utf-8"?>
-<w:hdr xmlns:wpc="http://schemas.microsoft.com/office/word/2010/wordprocessingCanvas" xmlns:cx="http://schemas.microsoft.com/office/drawing/2014/chartex" xmlns:cx1="http://schemas.microsoft.com/office/drawing/2015/9/8/chartex" xmlns:cx2="http://schemas.microsoft.com/office/drawing/2015/10/21/chartex" xmlns:cx3="http://schemas.microsoft.com/office/drawing/2016/5/9/chartex" xmlns:cx4="http://schemas.microsoft.com/office/drawing/2016/5/10/chartex" xmlns:cx5="http://schemas.microsoft.com/office/drawing/2016/5/11/chartex" xmlns:cx6="http://schemas.microsoft.com/office/drawing/2016/5/12/chartex" xmlns:cx7="http://schemas.microsoft.com/office/drawing/2016/5/13/chartex" xmlns:cx8="http://schemas.microsoft.com/office/drawing/2016/5/14/chartex" xmlns:mc="http://schemas.openxmlformats.org/markup-compatibility/2006" xmlns:aink="http://schemas.microsoft.com/office/drawing/2016/ink" xmlns:am3d="http://schemas.microsoft.com/office/drawing/2017/model3d" xmlns:o="urn:schemas-microsoft-com:office:office" xmlns:oel="http://schemas.microsoft.com/office/2019/extlst" xmlns:r="http://schemas.openxmlformats.org/officeDocument/2006/relationships" xmlns:m="http://schemas.openxmlformats.org/officeDocument/2006/math" xmlns:v="urn:schemas-microsoft-com:vml" xmlns:wp14="http://schemas.microsoft.com/office/word/2010/wordprocessingDrawing" xmlns:wp="http://schemas.openxmlformats.org/drawingml/2006/wordprocessingDrawing" xmlns:w10="urn:schemas-microsoft-com:office:word" xmlns:w="http://schemas.openxmlformats.org/wordprocessingml/2006/main" xmlns:w14="http://schemas.microsoft.com/office/word/2010/wordml" xmlns:w15="http://schemas.microsoft.com/office/word/2012/wordml" xmlns:w16cei="http://schemas.microsoft.com/office/word/2026/wordml/cei" xmlns:w16cex="http://schemas.microsoft.com/office/word/2018/wordml/cex" xmlns:w16cid="http://schemas.microsoft.com/office/word/2016/wordml/cid" xmlns:w16="http://schemas.microsoft.com/office/word/2018/wordml" xmlns:w16du="http://schemas.microsoft.com/office/word/2023/wordml/word16du" xmlns:w16sdtdh="http://schemas.microsoft.com/office/word/2020/wordml/sdtdatahash" xmlns:w16sdtfl="http://schemas.microsoft.com/office/word/2024/wordml/sdtformatlock" xmlns:w16se="http://schemas.microsoft.com/office/word/2015/wordml/symex" xmlns:wpg="http://schemas.microsoft.com/office/word/2010/wordprocessingGroup" xmlns:wpi="http://schemas.microsoft.com/office/word/2010/wordprocessingInk" xmlns:wne="http://schemas.microsoft.com/office/word/2006/wordml" xmlns:wps="http://schemas.microsoft.com/office/word/2010/wordprocessingShape" mc:Ignorable="w14 w15 w16se w16cid w16 w16cex w16sdtdh w16sdtfl w16du wp14">
+<w:hdr xmlns:wpc="http://schemas.microsoft.com/office/word/2010/wordprocessingCanvas" xmlns:cx="http://schemas.microsoft.com/office/drawing/2014/chartex" xmlns:cx1="http://schemas.microsoft.com/office/drawing/2015/9/8/chartex" xmlns:cx2="http://schemas.microsoft.com/office/drawing/2015/10/21/chartex" xmlns:cx3="http://schemas.microsoft.com/office/drawing/2016/5/9/chartex" xmlns:cx4="http://schemas.microsoft.com/office/drawing/2016/5/10/chartex" xmlns:cx5="http://schemas.microsoft.com/office/drawing/2016/5/11/chartex" xmlns:cx6="http://schemas.microsoft.com/office/drawing/2016/5/12/chartex" xmlns:cx7="http://schemas.microsoft.com/office/drawing/2016/5/13/chartex" xmlns:cx8="http://schemas.microsoft.com/office/drawing/2016/5/14/chartex" xmlns:mc="http://schemas.openxmlformats.org/markup-compatibility/2006" xmlns:aink="http://schemas.microsoft.com/office/drawing/2016/ink" xmlns:am3d="http://schemas.microsoft.com/office/drawing/2017/model3d" xmlns:o="urn:schemas-microsoft-com:office:office" xmlns:oel="http://schemas.microsoft.com/office/2019/extlst" xmlns:r="http://schemas.openxmlformats.org/officeDocument/2006/relationships" xmlns:m="http://schemas.openxmlformats.org/officeDocument/2006/math" xmlns:v="urn:schemas-microsoft-com:vml" xmlns:wp14="http://schemas.microsoft.com/office/word/2010/wordprocessingDrawing" xmlns:wp="http://schemas.openxmlformats.org/drawingml/2006/wordprocessingDrawing" xmlns:w10="urn:schemas-microsoft-com:office:word" xmlns:w="http://schemas.openxmlformats.org/wordprocessingml/2006/main" xmlns:w14="http://schemas.microsoft.com/office/word/2010/wordml" xmlns:w15="http://schemas.microsoft.com/office/word/2012/wordml" xmlns:w16cex="http://schemas.microsoft.com/office/word/2018/wordml/cex" xmlns:w16cid="http://schemas.microsoft.com/office/word/2016/wordml/cid" xmlns:w16="http://schemas.microsoft.com/office/word/2018/wordml" xmlns:w16du="http://schemas.microsoft.com/office/word/2023/wordml/word16du" xmlns:w16sdtdh="http://schemas.microsoft.com/office/word/2020/wordml/sdtdatahash" xmlns:w16sdtfl="http://schemas.microsoft.com/office/word/2024/wordml/sdtformatlock" xmlns:w16se="http://schemas.microsoft.com/office/word/2015/wordml/symex" xmlns:wpg="http://schemas.microsoft.com/office/word/2010/wordprocessingGroup" xmlns:wpi="http://schemas.microsoft.com/office/word/2010/wordprocessingInk" xmlns:wne="http://schemas.microsoft.com/office/word/2006/wordml" xmlns:wps="http://schemas.microsoft.com/office/word/2010/wordprocessingShape" mc:Ignorable="w14 w15 w16se w16cid w16 w16cex w16sdtdh w16sdtfl w16du wp14">
   <w:p>
     <w:pPr>
       <w:widowControl w:val="0"/>
@@ -50075,7 +48583,7 @@
 </file>
 
 <file path=word/header9.xml><?xml version="1.0" encoding="utf-8"?>
-<w:hdr xmlns:wpc="http://schemas.microsoft.com/office/word/2010/wordprocessingCanvas" xmlns:cx="http://schemas.microsoft.com/office/drawing/2014/chartex" xmlns:cx1="http://schemas.microsoft.com/office/drawing/2015/9/8/chartex" xmlns:cx2="http://schemas.microsoft.com/office/drawing/2015/10/21/chartex" xmlns:cx3="http://schemas.microsoft.com/office/drawing/2016/5/9/chartex" xmlns:cx4="http://schemas.microsoft.com/office/drawing/2016/5/10/chartex" xmlns:cx5="http://schemas.microsoft.com/office/drawing/2016/5/11/chartex" xmlns:cx6="http://schemas.microsoft.com/office/drawing/2016/5/12/chartex" xmlns:cx7="http://schemas.microsoft.com/office/drawing/2016/5/13/chartex" xmlns:cx8="http://schemas.microsoft.com/office/drawing/2016/5/14/chartex" xmlns:mc="http://schemas.openxmlformats.org/markup-compatibility/2006" xmlns:aink="http://schemas.microsoft.com/office/drawing/2016/ink" xmlns:am3d="http://schemas.microsoft.com/office/drawing/2017/model3d" xmlns:o="urn:schemas-microsoft-com:office:office" xmlns:oel="http://schemas.microsoft.com/office/2019/extlst" xmlns:r="http://schemas.openxmlformats.org/officeDocument/2006/relationships" xmlns:m="http://schemas.openxmlformats.org/officeDocument/2006/math" xmlns:v="urn:schemas-microsoft-com:vml" xmlns:wp14="http://schemas.microsoft.com/office/word/2010/wordprocessingDrawing" xmlns:wp="http://schemas.openxmlformats.org/drawingml/2006/wordprocessingDrawing" xmlns:w10="urn:schemas-microsoft-com:office:word" xmlns:w="http://schemas.openxmlformats.org/wordprocessingml/2006/main" xmlns:w14="http://schemas.microsoft.com/office/word/2010/wordml" xmlns:w15="http://schemas.microsoft.com/office/word/2012/wordml" xmlns:w16cei="http://schemas.microsoft.com/office/word/2026/wordml/cei" xmlns:w16cex="http://schemas.microsoft.com/office/word/2018/wordml/cex" xmlns:w16cid="http://schemas.microsoft.com/office/word/2016/wordml/cid" xmlns:w16="http://schemas.microsoft.com/office/word/2018/wordml" xmlns:w16du="http://schemas.microsoft.com/office/word/2023/wordml/word16du" xmlns:w16sdtdh="http://schemas.microsoft.com/office/word/2020/wordml/sdtdatahash" xmlns:w16sdtfl="http://schemas.microsoft.com/office/word/2024/wordml/sdtformatlock" xmlns:w16se="http://schemas.microsoft.com/office/word/2015/wordml/symex" xmlns:wpg="http://schemas.microsoft.com/office/word/2010/wordprocessingGroup" xmlns:wpi="http://schemas.microsoft.com/office/word/2010/wordprocessingInk" xmlns:wne="http://schemas.microsoft.com/office/word/2006/wordml" xmlns:wps="http://schemas.microsoft.com/office/word/2010/wordprocessingShape" mc:Ignorable="w14 w15 w16se w16cid w16 w16cex w16sdtdh w16sdtfl w16du wp14">
+<w:hdr xmlns:wpc="http://schemas.microsoft.com/office/word/2010/wordprocessingCanvas" xmlns:cx="http://schemas.microsoft.com/office/drawing/2014/chartex" xmlns:cx1="http://schemas.microsoft.com/office/drawing/2015/9/8/chartex" xmlns:cx2="http://schemas.microsoft.com/office/drawing/2015/10/21/chartex" xmlns:cx3="http://schemas.microsoft.com/office/drawing/2016/5/9/chartex" xmlns:cx4="http://schemas.microsoft.com/office/drawing/2016/5/10/chartex" xmlns:cx5="http://schemas.microsoft.com/office/drawing/2016/5/11/chartex" xmlns:cx6="http://schemas.microsoft.com/office/drawing/2016/5/12/chartex" xmlns:cx7="http://schemas.microsoft.com/office/drawing/2016/5/13/chartex" xmlns:cx8="http://schemas.microsoft.com/office/drawing/2016/5/14/chartex" xmlns:mc="http://schemas.openxmlformats.org/markup-compatibility/2006" xmlns:aink="http://schemas.microsoft.com/office/drawing/2016/ink" xmlns:am3d="http://schemas.microsoft.com/office/drawing/2017/model3d" xmlns:o="urn:schemas-microsoft-com:office:office" xmlns:oel="http://schemas.microsoft.com/office/2019/extlst" xmlns:r="http://schemas.openxmlformats.org/officeDocument/2006/relationships" xmlns:m="http://schemas.openxmlformats.org/officeDocument/2006/math" xmlns:v="urn:schemas-microsoft-com:vml" xmlns:wp14="http://schemas.microsoft.com/office/word/2010/wordprocessingDrawing" xmlns:wp="http://schemas.openxmlformats.org/drawingml/2006/wordprocessingDrawing" xmlns:w10="urn:schemas-microsoft-com:office:word" xmlns:w="http://schemas.openxmlformats.org/wordprocessingml/2006/main" xmlns:w14="http://schemas.microsoft.com/office/word/2010/wordml" xmlns:w15="http://schemas.microsoft.com/office/word/2012/wordml" xmlns:w16cex="http://schemas.microsoft.com/office/word/2018/wordml/cex" xmlns:w16cid="http://schemas.microsoft.com/office/word/2016/wordml/cid" xmlns:w16="http://schemas.microsoft.com/office/word/2018/wordml" xmlns:w16du="http://schemas.microsoft.com/office/word/2023/wordml/word16du" xmlns:w16sdtdh="http://schemas.microsoft.com/office/word/2020/wordml/sdtdatahash" xmlns:w16sdtfl="http://schemas.microsoft.com/office/word/2024/wordml/sdtformatlock" xmlns:w16se="http://schemas.microsoft.com/office/word/2015/wordml/symex" xmlns:wpg="http://schemas.microsoft.com/office/word/2010/wordprocessingGroup" xmlns:wpi="http://schemas.microsoft.com/office/word/2010/wordprocessingInk" xmlns:wne="http://schemas.microsoft.com/office/word/2006/wordml" xmlns:wps="http://schemas.microsoft.com/office/word/2010/wordprocessingShape" mc:Ignorable="w14 w15 w16se w16cid w16 w16cex w16sdtdh w16sdtfl w16du wp14">
   <w:p>
     <w:pPr>
       <w:widowControl w:val="0"/>
@@ -50175,7 +48683,7 @@
 </file>
 
 <file path=word/numbering.xml><?xml version="1.0" encoding="utf-8"?>
-<w:numbering xmlns:wpc="http://schemas.microsoft.com/office/word/2010/wordprocessingCanvas" xmlns:cx="http://schemas.microsoft.com/office/drawing/2014/chartex" xmlns:cx1="http://schemas.microsoft.com/office/drawing/2015/9/8/chartex" xmlns:cx2="http://schemas.microsoft.com/office/drawing/2015/10/21/chartex" xmlns:cx3="http://schemas.microsoft.com/office/drawing/2016/5/9/chartex" xmlns:cx4="http://schemas.microsoft.com/office/drawing/2016/5/10/chartex" xmlns:cx5="http://schemas.microsoft.com/office/drawing/2016/5/11/chartex" xmlns:cx6="http://schemas.microsoft.com/office/drawing/2016/5/12/chartex" xmlns:cx7="http://schemas.microsoft.com/office/drawing/2016/5/13/chartex" xmlns:cx8="http://schemas.microsoft.com/office/drawing/2016/5/14/chartex" xmlns:mc="http://schemas.openxmlformats.org/markup-compatibility/2006" xmlns:aink="http://schemas.microsoft.com/office/drawing/2016/ink" xmlns:am3d="http://schemas.microsoft.com/office/drawing/2017/model3d" xmlns:o="urn:schemas-microsoft-com:office:office" xmlns:oel="http://schemas.microsoft.com/office/2019/extlst" xmlns:r="http://schemas.openxmlformats.org/officeDocument/2006/relationships" xmlns:m="http://schemas.openxmlformats.org/officeDocument/2006/math" xmlns:v="urn:schemas-microsoft-com:vml" xmlns:wp14="http://schemas.microsoft.com/office/word/2010/wordprocessingDrawing" xmlns:wp="http://schemas.openxmlformats.org/drawingml/2006/wordprocessingDrawing" xmlns:w10="urn:schemas-microsoft-com:office:word" xmlns:w="http://schemas.openxmlformats.org/wordprocessingml/2006/main" xmlns:w14="http://schemas.microsoft.com/office/word/2010/wordml" xmlns:w15="http://schemas.microsoft.com/office/word/2012/wordml" xmlns:w16cei="http://schemas.microsoft.com/office/word/2026/wordml/cei" xmlns:w16cex="http://schemas.microsoft.com/office/word/2018/wordml/cex" xmlns:w16cid="http://schemas.microsoft.com/office/word/2016/wordml/cid" xmlns:w16="http://schemas.microsoft.com/office/word/2018/wordml" xmlns:w16du="http://schemas.microsoft.com/office/word/2023/wordml/word16du" xmlns:w16sdtdh="http://schemas.microsoft.com/office/word/2020/wordml/sdtdatahash" xmlns:w16sdtfl="http://schemas.microsoft.com/office/word/2024/wordml/sdtformatlock" xmlns:w16se="http://schemas.microsoft.com/office/word/2015/wordml/symex" xmlns:wpg="http://schemas.microsoft.com/office/word/2010/wordprocessingGroup" xmlns:wpi="http://schemas.microsoft.com/office/word/2010/wordprocessingInk" xmlns:wne="http://schemas.microsoft.com/office/word/2006/wordml" xmlns:wps="http://schemas.microsoft.com/office/word/2010/wordprocessingShape" mc:Ignorable="w14 w15 w16se w16cid w16 w16cex w16sdtdh w16sdtfl w16du wp14">
+<w:numbering xmlns:wpc="http://schemas.microsoft.com/office/word/2010/wordprocessingCanvas" xmlns:cx="http://schemas.microsoft.com/office/drawing/2014/chartex" xmlns:cx1="http://schemas.microsoft.com/office/drawing/2015/9/8/chartex" xmlns:cx2="http://schemas.microsoft.com/office/drawing/2015/10/21/chartex" xmlns:cx3="http://schemas.microsoft.com/office/drawing/2016/5/9/chartex" xmlns:cx4="http://schemas.microsoft.com/office/drawing/2016/5/10/chartex" xmlns:cx5="http://schemas.microsoft.com/office/drawing/2016/5/11/chartex" xmlns:cx6="http://schemas.microsoft.com/office/drawing/2016/5/12/chartex" xmlns:cx7="http://schemas.microsoft.com/office/drawing/2016/5/13/chartex" xmlns:cx8="http://schemas.microsoft.com/office/drawing/2016/5/14/chartex" xmlns:mc="http://schemas.openxmlformats.org/markup-compatibility/2006" xmlns:aink="http://schemas.microsoft.com/office/drawing/2016/ink" xmlns:am3d="http://schemas.microsoft.com/office/drawing/2017/model3d" xmlns:o="urn:schemas-microsoft-com:office:office" xmlns:oel="http://schemas.microsoft.com/office/2019/extlst" xmlns:r="http://schemas.openxmlformats.org/officeDocument/2006/relationships" xmlns:m="http://schemas.openxmlformats.org/officeDocument/2006/math" xmlns:v="urn:schemas-microsoft-com:vml" xmlns:wp14="http://schemas.microsoft.com/office/word/2010/wordprocessingDrawing" xmlns:wp="http://schemas.openxmlformats.org/drawingml/2006/wordprocessingDrawing" xmlns:w10="urn:schemas-microsoft-com:office:word" xmlns:w="http://schemas.openxmlformats.org/wordprocessingml/2006/main" xmlns:w14="http://schemas.microsoft.com/office/word/2010/wordml" xmlns:w15="http://schemas.microsoft.com/office/word/2012/wordml" xmlns:w16cex="http://schemas.microsoft.com/office/word/2018/wordml/cex" xmlns:w16cid="http://schemas.microsoft.com/office/word/2016/wordml/cid" xmlns:w16="http://schemas.microsoft.com/office/word/2018/wordml" xmlns:w16du="http://schemas.microsoft.com/office/word/2023/wordml/word16du" xmlns:w16sdtdh="http://schemas.microsoft.com/office/word/2020/wordml/sdtdatahash" xmlns:w16sdtfl="http://schemas.microsoft.com/office/word/2024/wordml/sdtformatlock" xmlns:w16se="http://schemas.microsoft.com/office/word/2015/wordml/symex" xmlns:wpg="http://schemas.microsoft.com/office/word/2010/wordprocessingGroup" xmlns:wpi="http://schemas.microsoft.com/office/word/2010/wordprocessingInk" xmlns:wne="http://schemas.microsoft.com/office/word/2006/wordml" xmlns:wps="http://schemas.microsoft.com/office/word/2010/wordprocessingShape" mc:Ignorable="w14 w15 w16se w16cid w16 w16cex w16sdtdh w16sdtfl w16du wp14">
   <w:abstractNum w:abstractNumId="0" w15:restartNumberingAfterBreak="0">
     <w:nsid w:val="05D56582"/>
     <w:multiLevelType w:val="hybridMultilevel"/>

</xml_diff>